<commit_message>
chore: sync 2026-06-12 09:40:43 UTC
</commit_message>
<xml_diff>
--- a/resumes/IT_Networking_resume.docx
+++ b/resumes/IT_Networking_resume.docx
@@ -24,7 +24,7 @@
           <w:sz w:val="28"/>
           <w:szCs w:val="28"/>
         </w:rPr>
-        <w:t>David Omer</w:t>
+        <w:t>David Park Omer</w:t>
       </w:r>
     </w:p>
     <w:p>
@@ -59,13 +59,10 @@
             <w:sz w:val="20"/>
             <w:szCs w:val="20"/>
           </w:rPr>
-          <w:t>compute456@outlook.com</w:t>
+          <w:t>david_1428@outlook.com</w:t>
         </w:r>
       </w:hyperlink>
       <w:r>
-        <w:t xml:space="preserve"> </w:t>
-      </w:r>
-      <w:r>
         <w:rPr>
           <w:rFonts w:ascii="Aptos Display" w:hAnsi="Aptos Display"/>
           <w:bCs/>
@@ -73,50 +70,7 @@
           <w:sz w:val="20"/>
           <w:szCs w:val="20"/>
         </w:rPr>
-        <w:t>•</w:t>
-      </w:r>
-      <w:r>
-        <w:rPr>
-          <w:rFonts w:ascii="Aptos Display" w:hAnsi="Aptos Display"/>
-          <w:bCs/>
-          <w:w w:val="105"/>
-          <w:sz w:val="20"/>
-          <w:szCs w:val="20"/>
-        </w:rPr>
-        <w:t xml:space="preserve"> </w:t>
-      </w:r>
-      <w:hyperlink r:id="rId9" w:history="1">
-        <w:r>
-          <w:rPr>
-            <w:rStyle w:val="Hyperlink"/>
-            <w:rFonts w:ascii="Aptos Display" w:hAnsi="Aptos Display"/>
-            <w:bCs/>
-            <w:w w:val="105"/>
-            <w:sz w:val="20"/>
-            <w:szCs w:val="20"/>
-          </w:rPr>
-          <w:t>https://david.simplifai.team</w:t>
-        </w:r>
-      </w:hyperlink>
-      <w:r>
-        <w:rPr>
-          <w:rFonts w:ascii="Aptos Display" w:hAnsi="Aptos Display"/>
-          <w:bCs/>
-          <w:w w:val="105"/>
-          <w:sz w:val="20"/>
-          <w:szCs w:val="20"/>
-        </w:rPr>
-        <w:t xml:space="preserve"> </w:t>
-      </w:r>
-      <w:r>
-        <w:rPr>
-          <w:rFonts w:ascii="Aptos Display" w:hAnsi="Aptos Display"/>
-          <w:bCs/>
-          <w:w w:val="105"/>
-          <w:sz w:val="20"/>
-          <w:szCs w:val="20"/>
-        </w:rPr>
-        <w:t>• +1 562-833-4552</w:t>
+        <w:t xml:space="preserve"> • +1 562-833-4552</w:t>
       </w:r>
     </w:p>
     <w:p>
@@ -199,47 +153,7 @@
           <w:sz w:val="24"/>
           <w:szCs w:val="24"/>
         </w:rPr>
-        <w:t xml:space="preserve"> with 2</w:t>
-      </w:r>
-      <w:r>
-        <w:rPr>
-          <w:rFonts w:ascii="Aptos Display" w:hAnsi="Aptos Display" w:cs="Times New Roman"/>
-          <w:bCs/>
-          <w:w w:val="105"/>
-          <w:sz w:val="24"/>
-          <w:szCs w:val="24"/>
-        </w:rPr>
-        <w:t>5</w:t>
-      </w:r>
-      <w:r>
-        <w:rPr>
-          <w:rFonts w:ascii="Aptos Display" w:hAnsi="Aptos Display" w:cs="Times New Roman"/>
-          <w:bCs/>
-          <w:w w:val="105"/>
-          <w:sz w:val="24"/>
-          <w:szCs w:val="24"/>
-        </w:rPr>
-        <w:t xml:space="preserve">+ years of experience supporting enterprise applications, </w:t>
-      </w:r>
-      <w:r>
-        <w:rPr>
-          <w:rFonts w:ascii="Aptos Display" w:hAnsi="Aptos Display" w:cs="Times New Roman"/>
-          <w:bCs/>
-          <w:w w:val="105"/>
-          <w:sz w:val="24"/>
-          <w:szCs w:val="24"/>
-        </w:rPr>
-        <w:t>IT infrastructure</w:t>
-      </w:r>
-      <w:r>
-        <w:rPr>
-          <w:rFonts w:ascii="Aptos Display" w:hAnsi="Aptos Display" w:cs="Times New Roman"/>
-          <w:bCs/>
-          <w:w w:val="105"/>
-          <w:sz w:val="24"/>
-          <w:szCs w:val="24"/>
-        </w:rPr>
-        <w:t>, and data platforms across distributed environments.</w:t>
+        <w:t xml:space="preserve"> with 20+ years of experience supporting enterprise applications, network infrastructure, and data platforms across distributed environments.</w:t>
       </w:r>
     </w:p>
     <w:p>
@@ -262,27 +176,7 @@
           <w:sz w:val="24"/>
           <w:szCs w:val="24"/>
         </w:rPr>
-        <w:t xml:space="preserve">Skilled in troubleshooting system and network issues, configuring and maintaining servers, and supporting </w:t>
-      </w:r>
-      <w:r>
-        <w:rPr>
-          <w:rFonts w:ascii="Aptos Display" w:hAnsi="Aptos Display" w:cs="Times New Roman"/>
-          <w:bCs/>
-          <w:w w:val="105"/>
-          <w:sz w:val="24"/>
-          <w:szCs w:val="24"/>
-        </w:rPr>
-        <w:t>hardware and software environments</w:t>
-      </w:r>
-      <w:r>
-        <w:rPr>
-          <w:rFonts w:ascii="Aptos Display" w:hAnsi="Aptos Display" w:cs="Times New Roman"/>
-          <w:bCs/>
-          <w:w w:val="105"/>
-          <w:sz w:val="24"/>
-          <w:szCs w:val="24"/>
-        </w:rPr>
-        <w:t xml:space="preserve"> to ensure reliable performance.</w:t>
+        <w:t>Skilled in troubleshooting system and network issues, configuring and maintaining servers, and supporting hardware/software environments to ensure reliable performance.</w:t>
       </w:r>
     </w:p>
     <w:p>
@@ -656,28 +550,6 @@
           <w:szCs w:val="26"/>
         </w:rPr>
         <w:t>Consultant</w:t>
-      </w:r>
-    </w:p>
-    <w:p>
-      <w:pPr>
-        <w:ind w:left="331"/>
-        <w:rPr>
-          <w:rFonts w:ascii="Aptos Display" w:hAnsi="Aptos Display"/>
-          <w:spacing w:val="-4"/>
-          <w:w w:val="105"/>
-          <w:sz w:val="26"/>
-          <w:szCs w:val="26"/>
-        </w:rPr>
-      </w:pPr>
-      <w:r>
-        <w:rPr>
-          <w:rFonts w:ascii="Aptos Display" w:hAnsi="Aptos Display"/>
-          <w:spacing w:val="-4"/>
-          <w:w w:val="105"/>
-          <w:sz w:val="26"/>
-          <w:szCs w:val="26"/>
-        </w:rPr>
-        <w:t>Industry / Client Focus: Small business platforms, automation, database-backed applications</w:t>
       </w:r>
     </w:p>
     <w:p>
@@ -826,9 +698,6 @@
     </w:p>
     <w:p>
       <w:pPr>
-        <w:keepNext/>
-        <w:keepLines/>
-        <w:widowControl/>
         <w:spacing w:before="106"/>
         <w:ind w:left="360"/>
         <w:rPr>
@@ -849,63 +718,7 @@
           <w:sz w:val="26"/>
           <w:szCs w:val="26"/>
         </w:rPr>
-        <w:lastRenderedPageBreak/>
         <w:t>Project Consulting Services, Inc. (via TEKsystems) — Senior Consultant</w:t>
-      </w:r>
-    </w:p>
-    <w:p>
-      <w:pPr>
-        <w:keepNext/>
-        <w:keepLines/>
-        <w:widowControl/>
-        <w:ind w:left="331"/>
-        <w:rPr>
-          <w:rFonts w:ascii="Aptos Display" w:hAnsi="Aptos Display"/>
-          <w:spacing w:val="-4"/>
-          <w:w w:val="105"/>
-          <w:sz w:val="26"/>
-          <w:szCs w:val="26"/>
-        </w:rPr>
-      </w:pPr>
-      <w:r>
-        <w:rPr>
-          <w:rFonts w:ascii="Aptos Display" w:hAnsi="Aptos Display"/>
-          <w:spacing w:val="-4"/>
-          <w:w w:val="105"/>
-          <w:sz w:val="26"/>
-          <w:szCs w:val="26"/>
-        </w:rPr>
-        <w:t xml:space="preserve">Industry / Client Focus: </w:t>
-      </w:r>
-      <w:r>
-        <w:rPr>
-          <w:rFonts w:ascii="Aptos Display" w:hAnsi="Aptos Display"/>
-          <w:spacing w:val="-4"/>
-          <w:w w:val="105"/>
-          <w:sz w:val="26"/>
-          <w:szCs w:val="26"/>
-        </w:rPr>
-        <w:t>Oil &amp; Gas, p</w:t>
-      </w:r>
-      <w:r>
-        <w:rPr>
-          <w:rFonts w:ascii="Aptos Display" w:hAnsi="Aptos Display" w:cs="Times New Roman"/>
-          <w:spacing w:val="-4"/>
-          <w:w w:val="105"/>
-          <w:sz w:val="26"/>
-          <w:szCs w:val="26"/>
-        </w:rPr>
-        <w:t>rovides professional services for energy infrastruct</w:t>
-      </w:r>
-      <w:r>
-        <w:rPr>
-          <w:rFonts w:ascii="Aptos Display" w:hAnsi="Aptos Display"/>
-          <w:spacing w:val="-4"/>
-          <w:w w:val="105"/>
-          <w:sz w:val="26"/>
-          <w:szCs w:val="26"/>
-        </w:rPr>
-        <w:t>ure</w:t>
       </w:r>
     </w:p>
     <w:p>
@@ -954,6 +767,1003 @@
           <w:szCs w:val="24"/>
         </w:rPr>
         <w:t>2024</w:t>
+      </w:r>
+    </w:p>
+    <w:p>
+      <w:pPr>
+        <w:pStyle w:val="ListParagraph"/>
+        <w:widowControl/>
+        <w:numPr>
+          <w:ilvl w:val="0"/>
+          <w:numId w:val="27"/>
+        </w:numPr>
+        <w:autoSpaceDE/>
+        <w:autoSpaceDN/>
+        <w:ind w:right="680"/>
+        <w:rPr>
+          <w:rFonts w:ascii="Aptos Display" w:eastAsia="Times New Roman" w:hAnsi="Aptos Display" w:cs="Times New Roman"/>
+          <w:sz w:val="24"/>
+          <w:szCs w:val="24"/>
+        </w:rPr>
+      </w:pPr>
+      <w:r>
+        <w:rPr>
+          <w:rFonts w:ascii="Aptos Display" w:eastAsia="Times New Roman" w:hAnsi="Aptos Display" w:cs="Times New Roman"/>
+          <w:sz w:val="24"/>
+          <w:szCs w:val="24"/>
+        </w:rPr>
+        <w:t>Troubleshot and resolved production issues across distributed systems, including database, middleware, and network-related failures</w:t>
+      </w:r>
+    </w:p>
+    <w:p>
+      <w:pPr>
+        <w:pStyle w:val="ListParagraph"/>
+        <w:widowControl/>
+        <w:numPr>
+          <w:ilvl w:val="0"/>
+          <w:numId w:val="27"/>
+        </w:numPr>
+        <w:autoSpaceDE/>
+        <w:autoSpaceDN/>
+        <w:ind w:right="680"/>
+        <w:rPr>
+          <w:rFonts w:ascii="Aptos Display" w:eastAsia="Times New Roman" w:hAnsi="Aptos Display" w:cs="Times New Roman"/>
+          <w:sz w:val="24"/>
+          <w:szCs w:val="24"/>
+        </w:rPr>
+      </w:pPr>
+      <w:r>
+        <w:rPr>
+          <w:rFonts w:ascii="Aptos Display" w:eastAsia="Times New Roman" w:hAnsi="Aptos Display" w:cs="Times New Roman"/>
+          <w:sz w:val="24"/>
+          <w:szCs w:val="24"/>
+        </w:rPr>
+        <w:t>Supported enterprise data platforms and integration systems, ensuring reliable system performance and uptime</w:t>
+      </w:r>
+    </w:p>
+    <w:p>
+      <w:pPr>
+        <w:pStyle w:val="ListParagraph"/>
+        <w:widowControl/>
+        <w:numPr>
+          <w:ilvl w:val="0"/>
+          <w:numId w:val="27"/>
+        </w:numPr>
+        <w:autoSpaceDE/>
+        <w:autoSpaceDN/>
+        <w:ind w:right="680"/>
+        <w:rPr>
+          <w:rFonts w:ascii="Aptos Display" w:eastAsia="Times New Roman" w:hAnsi="Aptos Display" w:cs="Times New Roman"/>
+          <w:sz w:val="24"/>
+          <w:szCs w:val="24"/>
+        </w:rPr>
+      </w:pPr>
+      <w:r>
+        <w:rPr>
+          <w:rFonts w:ascii="Aptos Display" w:eastAsia="Times New Roman" w:hAnsi="Aptos Display" w:cs="Times New Roman"/>
+          <w:sz w:val="24"/>
+          <w:szCs w:val="24"/>
+        </w:rPr>
+        <w:lastRenderedPageBreak/>
+        <w:t>Diagnosed performance bottlenecks and system slowdowns, improving responsiveness and stability</w:t>
+      </w:r>
+    </w:p>
+    <w:p>
+      <w:pPr>
+        <w:pStyle w:val="ListParagraph"/>
+        <w:widowControl/>
+        <w:numPr>
+          <w:ilvl w:val="0"/>
+          <w:numId w:val="27"/>
+        </w:numPr>
+        <w:autoSpaceDE/>
+        <w:autoSpaceDN/>
+        <w:ind w:right="680"/>
+        <w:rPr>
+          <w:rFonts w:ascii="Aptos Display" w:eastAsia="Times New Roman" w:hAnsi="Aptos Display" w:cs="Times New Roman"/>
+          <w:sz w:val="24"/>
+          <w:szCs w:val="24"/>
+        </w:rPr>
+      </w:pPr>
+      <w:r>
+        <w:rPr>
+          <w:rFonts w:ascii="Aptos Display" w:eastAsia="Times New Roman" w:hAnsi="Aptos Display" w:cs="Times New Roman"/>
+          <w:sz w:val="24"/>
+          <w:szCs w:val="24"/>
+        </w:rPr>
+        <w:t>Collaborated with infrastructure and development teams to resolve system-level issues impacting application performance</w:t>
+      </w:r>
+    </w:p>
+    <w:p>
+      <w:pPr>
+        <w:numPr>
+          <w:ilvl w:val="0"/>
+          <w:numId w:val="26"/>
+        </w:numPr>
+        <w:spacing w:after="160"/>
+        <w:rPr>
+          <w:rFonts w:ascii="Aptos Display" w:hAnsi="Aptos Display" w:cs="Times New Roman"/>
+          <w:bCs/>
+          <w:w w:val="105"/>
+          <w:sz w:val="24"/>
+          <w:szCs w:val="24"/>
+        </w:rPr>
+      </w:pPr>
+      <w:r>
+        <w:rPr>
+          <w:rFonts w:ascii="Aptos Display" w:hAnsi="Aptos Display" w:cs="Times New Roman"/>
+          <w:bCs/>
+          <w:w w:val="105"/>
+          <w:sz w:val="24"/>
+          <w:szCs w:val="24"/>
+        </w:rPr>
+        <w:t>Worked with cloud-hosted environments (Azure SQL and related services) to maintain system reliability</w:t>
+      </w:r>
+    </w:p>
+    <w:p>
+      <w:pPr>
+        <w:spacing w:before="106"/>
+        <w:ind w:left="360"/>
+        <w:rPr>
+          <w:rFonts w:ascii="Aptos Display" w:hAnsi="Aptos Display"/>
+          <w:b/>
+          <w:bCs/>
+          <w:w w:val="105"/>
+          <w:sz w:val="26"/>
+          <w:szCs w:val="26"/>
+        </w:rPr>
+      </w:pPr>
+      <w:r>
+        <w:rPr>
+          <w:rFonts w:ascii="Aptos Display" w:hAnsi="Aptos Display"/>
+          <w:b/>
+          <w:bCs/>
+          <w:w w:val="105"/>
+          <w:sz w:val="26"/>
+          <w:szCs w:val="26"/>
+        </w:rPr>
+        <w:t>Planned Career Sabbatical &amp; Independent Technical Projects</w:t>
+      </w:r>
+    </w:p>
+    <w:p>
+      <w:pPr>
+        <w:keepNext/>
+        <w:keepLines/>
+        <w:widowControl/>
+        <w:autoSpaceDE/>
+        <w:autoSpaceDN/>
+        <w:spacing w:after="160"/>
+        <w:ind w:left="330" w:right="680"/>
+        <w:rPr>
+          <w:rFonts w:ascii="Aptos Display" w:eastAsia="Times New Roman" w:hAnsi="Aptos Display" w:cs="Times New Roman"/>
+          <w:sz w:val="24"/>
+          <w:szCs w:val="24"/>
+        </w:rPr>
+      </w:pPr>
+      <w:r>
+        <w:rPr>
+          <w:rFonts w:ascii="Aptos Display" w:eastAsia="Times New Roman" w:hAnsi="Aptos Display" w:cs="Times New Roman"/>
+          <w:sz w:val="24"/>
+          <w:szCs w:val="24"/>
+        </w:rPr>
+        <w:t>03/2014 – 08/2015</w:t>
+      </w:r>
+    </w:p>
+    <w:p>
+      <w:pPr>
+        <w:pStyle w:val="ListParagraph"/>
+        <w:widowControl/>
+        <w:numPr>
+          <w:ilvl w:val="0"/>
+          <w:numId w:val="27"/>
+        </w:numPr>
+        <w:autoSpaceDE/>
+        <w:autoSpaceDN/>
+        <w:ind w:right="680"/>
+        <w:rPr>
+          <w:rFonts w:ascii="Aptos Display" w:eastAsia="Times New Roman" w:hAnsi="Aptos Display" w:cs="Times New Roman"/>
+          <w:sz w:val="24"/>
+          <w:szCs w:val="24"/>
+        </w:rPr>
+      </w:pPr>
+      <w:r>
+        <w:rPr>
+          <w:rFonts w:ascii="Aptos Display" w:eastAsia="Times New Roman" w:hAnsi="Aptos Display" w:cs="Times New Roman"/>
+          <w:sz w:val="24"/>
+          <w:szCs w:val="24"/>
+        </w:rPr>
+        <w:t xml:space="preserve">Took an intentional career break while continuing hands-on technical work and professional development. </w:t>
+      </w:r>
+    </w:p>
+    <w:p>
+      <w:pPr>
+        <w:pStyle w:val="ListParagraph"/>
+        <w:widowControl/>
+        <w:numPr>
+          <w:ilvl w:val="0"/>
+          <w:numId w:val="27"/>
+        </w:numPr>
+        <w:autoSpaceDE/>
+        <w:autoSpaceDN/>
+        <w:ind w:right="680"/>
+        <w:rPr>
+          <w:rFonts w:ascii="Aptos Display" w:eastAsia="Times New Roman" w:hAnsi="Aptos Display" w:cs="Times New Roman"/>
+          <w:sz w:val="24"/>
+          <w:szCs w:val="24"/>
+        </w:rPr>
+      </w:pPr>
+      <w:r>
+        <w:rPr>
+          <w:rFonts w:ascii="Aptos Display" w:eastAsia="Times New Roman" w:hAnsi="Aptos Display" w:cs="Times New Roman"/>
+          <w:sz w:val="24"/>
+          <w:szCs w:val="24"/>
+        </w:rPr>
+        <w:t>Built .NET/MVC and browser-based applications using HTML5, CSS3, JavaScript, and SQL-backed application architecture.</w:t>
+      </w:r>
+    </w:p>
+    <w:p>
+      <w:pPr>
+        <w:pStyle w:val="ListParagraph"/>
+        <w:widowControl/>
+        <w:numPr>
+          <w:ilvl w:val="0"/>
+          <w:numId w:val="27"/>
+        </w:numPr>
+        <w:autoSpaceDE/>
+        <w:autoSpaceDN/>
+        <w:ind w:right="680"/>
+        <w:rPr>
+          <w:rFonts w:ascii="Aptos Display" w:eastAsia="Times New Roman" w:hAnsi="Aptos Display" w:cs="Times New Roman"/>
+          <w:sz w:val="24"/>
+          <w:szCs w:val="24"/>
+        </w:rPr>
+      </w:pPr>
+      <w:r>
+        <w:rPr>
+          <w:rFonts w:ascii="Aptos Display" w:eastAsia="Times New Roman" w:hAnsi="Aptos Display" w:cs="Times New Roman"/>
+          <w:sz w:val="24"/>
+          <w:szCs w:val="24"/>
+        </w:rPr>
+        <w:t xml:space="preserve">Developed responsive user interfaces, database-driven workflows, reporting views, and analytics outputs. </w:t>
+      </w:r>
+    </w:p>
+    <w:p>
+      <w:pPr>
+        <w:pStyle w:val="ListParagraph"/>
+        <w:widowControl/>
+        <w:numPr>
+          <w:ilvl w:val="0"/>
+          <w:numId w:val="27"/>
+        </w:numPr>
+        <w:autoSpaceDE/>
+        <w:autoSpaceDN/>
+        <w:ind w:right="680"/>
+        <w:rPr>
+          <w:rFonts w:ascii="Aptos Display" w:eastAsia="Times New Roman" w:hAnsi="Aptos Display" w:cs="Times New Roman"/>
+          <w:sz w:val="24"/>
+          <w:szCs w:val="24"/>
+        </w:rPr>
+      </w:pPr>
+      <w:r>
+        <w:rPr>
+          <w:rFonts w:ascii="Aptos Display" w:eastAsia="Times New Roman" w:hAnsi="Aptos Display" w:cs="Times New Roman"/>
+          <w:sz w:val="24"/>
+          <w:szCs w:val="24"/>
+        </w:rPr>
+        <w:t>Explored legacy-modernization approaches using web applications, relational databases, APIs, and integration patterns.</w:t>
+      </w:r>
+    </w:p>
+    <w:p>
+      <w:pPr>
+        <w:spacing w:before="106"/>
+        <w:ind w:left="360"/>
+        <w:rPr>
+          <w:rFonts w:ascii="Aptos Display" w:hAnsi="Aptos Display"/>
+          <w:b/>
+          <w:bCs/>
+          <w:w w:val="105"/>
+          <w:sz w:val="26"/>
+          <w:szCs w:val="26"/>
+        </w:rPr>
+      </w:pPr>
+      <w:r>
+        <w:rPr>
+          <w:rFonts w:ascii="Aptos Display" w:hAnsi="Aptos Display"/>
+          <w:b/>
+          <w:bCs/>
+          <w:w w:val="105"/>
+          <w:sz w:val="26"/>
+          <w:szCs w:val="26"/>
+        </w:rPr>
+        <w:t>Steton Technology Group — Lead Architect</w:t>
+      </w:r>
+    </w:p>
+    <w:p>
+      <w:pPr>
+        <w:keepNext/>
+        <w:keepLines/>
+        <w:widowControl/>
+        <w:autoSpaceDE/>
+        <w:autoSpaceDN/>
+        <w:spacing w:after="160"/>
+        <w:ind w:left="330" w:right="680"/>
+        <w:rPr>
+          <w:rFonts w:ascii="Aptos Display" w:eastAsia="Times New Roman" w:hAnsi="Aptos Display" w:cs="Times New Roman"/>
+          <w:sz w:val="24"/>
+          <w:szCs w:val="24"/>
+        </w:rPr>
+      </w:pPr>
+      <w:r>
+        <w:rPr>
+          <w:rFonts w:ascii="Aptos Display" w:eastAsia="Times New Roman" w:hAnsi="Aptos Display" w:cs="Times New Roman"/>
+          <w:sz w:val="24"/>
+          <w:szCs w:val="24"/>
+        </w:rPr>
+        <w:t>01/</w:t>
+      </w:r>
+      <w:r>
+        <w:rPr>
+          <w:rFonts w:ascii="Aptos Display" w:eastAsia="Times New Roman" w:hAnsi="Aptos Display" w:cs="Times New Roman"/>
+          <w:sz w:val="24"/>
+          <w:szCs w:val="24"/>
+        </w:rPr>
+        <w:t>200</w:t>
+      </w:r>
+      <w:r>
+        <w:rPr>
+          <w:rFonts w:ascii="Aptos Display" w:eastAsia="Times New Roman" w:hAnsi="Aptos Display" w:cs="Times New Roman"/>
+          <w:sz w:val="24"/>
+          <w:szCs w:val="24"/>
+        </w:rPr>
+        <w:t>4</w:t>
+      </w:r>
+      <w:r>
+        <w:rPr>
+          <w:rFonts w:ascii="Aptos Display" w:eastAsia="Times New Roman" w:hAnsi="Aptos Display" w:cs="Times New Roman"/>
+          <w:sz w:val="24"/>
+          <w:szCs w:val="24"/>
+        </w:rPr>
+        <w:t xml:space="preserve"> – </w:t>
+      </w:r>
+      <w:r>
+        <w:rPr>
+          <w:rFonts w:ascii="Aptos Display" w:eastAsia="Times New Roman" w:hAnsi="Aptos Display" w:cs="Times New Roman"/>
+          <w:sz w:val="24"/>
+          <w:szCs w:val="24"/>
+        </w:rPr>
+        <w:t>03/</w:t>
+      </w:r>
+      <w:r>
+        <w:rPr>
+          <w:rFonts w:ascii="Aptos Display" w:eastAsia="Times New Roman" w:hAnsi="Aptos Display" w:cs="Times New Roman"/>
+          <w:sz w:val="24"/>
+          <w:szCs w:val="24"/>
+        </w:rPr>
+        <w:t>201</w:t>
+      </w:r>
+      <w:r>
+        <w:rPr>
+          <w:rFonts w:ascii="Aptos Display" w:eastAsia="Times New Roman" w:hAnsi="Aptos Display" w:cs="Times New Roman"/>
+          <w:sz w:val="24"/>
+          <w:szCs w:val="24"/>
+        </w:rPr>
+        <w:t>4</w:t>
+      </w:r>
+    </w:p>
+    <w:p>
+      <w:pPr>
+        <w:pStyle w:val="ListParagraph"/>
+        <w:widowControl/>
+        <w:numPr>
+          <w:ilvl w:val="0"/>
+          <w:numId w:val="27"/>
+        </w:numPr>
+        <w:autoSpaceDE/>
+        <w:autoSpaceDN/>
+        <w:ind w:right="680"/>
+        <w:rPr>
+          <w:rFonts w:ascii="Aptos Display" w:eastAsia="Times New Roman" w:hAnsi="Aptos Display" w:cs="Times New Roman"/>
+          <w:sz w:val="24"/>
+          <w:szCs w:val="24"/>
+        </w:rPr>
+      </w:pPr>
+      <w:r>
+        <w:rPr>
+          <w:rFonts w:ascii="Aptos Display" w:eastAsia="Times New Roman" w:hAnsi="Aptos Display" w:cs="Times New Roman"/>
+          <w:sz w:val="24"/>
+          <w:szCs w:val="24"/>
+        </w:rPr>
+        <w:t>Led operation and support of a multi-tenant SaaS platform, including system monitoring, issue resolution, and performance tuning</w:t>
+      </w:r>
+    </w:p>
+    <w:p>
+      <w:pPr>
+        <w:pStyle w:val="ListParagraph"/>
+        <w:widowControl/>
+        <w:numPr>
+          <w:ilvl w:val="0"/>
+          <w:numId w:val="27"/>
+        </w:numPr>
+        <w:autoSpaceDE/>
+        <w:autoSpaceDN/>
+        <w:ind w:right="680"/>
+        <w:rPr>
+          <w:rFonts w:ascii="Aptos Display" w:eastAsia="Times New Roman" w:hAnsi="Aptos Display" w:cs="Times New Roman"/>
+          <w:sz w:val="24"/>
+          <w:szCs w:val="24"/>
+        </w:rPr>
+      </w:pPr>
+      <w:r>
+        <w:rPr>
+          <w:rFonts w:ascii="Aptos Display" w:eastAsia="Times New Roman" w:hAnsi="Aptos Display" w:cs="Times New Roman"/>
+          <w:sz w:val="24"/>
+          <w:szCs w:val="24"/>
+        </w:rPr>
+        <w:t>Maintained application and database infrastructure supporting thousands of users</w:t>
+      </w:r>
+    </w:p>
+    <w:p>
+      <w:pPr>
+        <w:pStyle w:val="ListParagraph"/>
+        <w:widowControl/>
+        <w:numPr>
+          <w:ilvl w:val="0"/>
+          <w:numId w:val="27"/>
+        </w:numPr>
+        <w:autoSpaceDE/>
+        <w:autoSpaceDN/>
+        <w:ind w:right="680"/>
+        <w:rPr>
+          <w:rFonts w:ascii="Aptos Display" w:eastAsia="Times New Roman" w:hAnsi="Aptos Display" w:cs="Times New Roman"/>
+          <w:sz w:val="24"/>
+          <w:szCs w:val="24"/>
+        </w:rPr>
+      </w:pPr>
+      <w:r>
+        <w:rPr>
+          <w:rFonts w:ascii="Aptos Display" w:eastAsia="Times New Roman" w:hAnsi="Aptos Display" w:cs="Times New Roman"/>
+          <w:sz w:val="24"/>
+          <w:szCs w:val="24"/>
+        </w:rPr>
+        <w:t>Implemented cloud-based infrastructure improvements to enhance system availability and reliability</w:t>
+      </w:r>
+    </w:p>
+    <w:p>
+      <w:pPr>
+        <w:numPr>
+          <w:ilvl w:val="0"/>
+          <w:numId w:val="26"/>
+        </w:numPr>
+        <w:spacing w:after="160"/>
+        <w:rPr>
+          <w:rFonts w:ascii="Aptos Display" w:hAnsi="Aptos Display" w:cs="Times New Roman"/>
+          <w:bCs/>
+          <w:w w:val="105"/>
+          <w:sz w:val="24"/>
+          <w:szCs w:val="24"/>
+        </w:rPr>
+      </w:pPr>
+      <w:r>
+        <w:rPr>
+          <w:rFonts w:ascii="Aptos Display" w:hAnsi="Aptos Display" w:cs="Times New Roman"/>
+          <w:bCs/>
+          <w:w w:val="105"/>
+          <w:sz w:val="24"/>
+          <w:szCs w:val="24"/>
+        </w:rPr>
+        <w:t>Diagnosed and resolved production issues across application, database, and infrastructure layers</w:t>
+      </w:r>
+    </w:p>
+    <w:p>
+      <w:pPr>
+        <w:spacing w:before="106"/>
+        <w:ind w:left="360"/>
+        <w:rPr>
+          <w:rFonts w:ascii="Aptos Display" w:hAnsi="Aptos Display"/>
+          <w:b/>
+          <w:bCs/>
+          <w:w w:val="105"/>
+          <w:sz w:val="26"/>
+          <w:szCs w:val="26"/>
+        </w:rPr>
+      </w:pPr>
+      <w:r>
+        <w:rPr>
+          <w:rFonts w:ascii="Aptos Display" w:hAnsi="Aptos Display"/>
+          <w:b/>
+          <w:bCs/>
+          <w:w w:val="105"/>
+          <w:sz w:val="26"/>
+          <w:szCs w:val="26"/>
+        </w:rPr>
+        <w:t>SeeBeyond — Senior Consultant</w:t>
+      </w:r>
+    </w:p>
+    <w:p>
+      <w:pPr>
+        <w:keepNext/>
+        <w:keepLines/>
+        <w:widowControl/>
+        <w:autoSpaceDE/>
+        <w:autoSpaceDN/>
+        <w:spacing w:after="160"/>
+        <w:ind w:left="330" w:right="680"/>
+        <w:rPr>
+          <w:rFonts w:ascii="Aptos Display" w:eastAsia="Times New Roman" w:hAnsi="Aptos Display" w:cs="Times New Roman"/>
+          <w:sz w:val="24"/>
+          <w:szCs w:val="24"/>
+        </w:rPr>
+      </w:pPr>
+      <w:r>
+        <w:rPr>
+          <w:rFonts w:ascii="Aptos Display" w:eastAsia="Times New Roman" w:hAnsi="Aptos Display" w:cs="Times New Roman"/>
+          <w:sz w:val="24"/>
+          <w:szCs w:val="24"/>
+        </w:rPr>
+        <w:t>10/</w:t>
+      </w:r>
+      <w:r>
+        <w:rPr>
+          <w:rFonts w:ascii="Aptos Display" w:eastAsia="Times New Roman" w:hAnsi="Aptos Display" w:cs="Times New Roman"/>
+          <w:sz w:val="24"/>
+          <w:szCs w:val="24"/>
+        </w:rPr>
+        <w:t xml:space="preserve">2002 – </w:t>
+      </w:r>
+      <w:r>
+        <w:rPr>
+          <w:rFonts w:ascii="Aptos Display" w:eastAsia="Times New Roman" w:hAnsi="Aptos Display" w:cs="Times New Roman"/>
+          <w:sz w:val="24"/>
+          <w:szCs w:val="24"/>
+        </w:rPr>
+        <w:t>12/</w:t>
+      </w:r>
+      <w:r>
+        <w:rPr>
+          <w:rFonts w:ascii="Aptos Display" w:eastAsia="Times New Roman" w:hAnsi="Aptos Display" w:cs="Times New Roman"/>
+          <w:sz w:val="24"/>
+          <w:szCs w:val="24"/>
+        </w:rPr>
+        <w:t>200</w:t>
+      </w:r>
+      <w:r>
+        <w:rPr>
+          <w:rFonts w:ascii="Aptos Display" w:eastAsia="Times New Roman" w:hAnsi="Aptos Display" w:cs="Times New Roman"/>
+          <w:sz w:val="24"/>
+          <w:szCs w:val="24"/>
+        </w:rPr>
+        <w:t>3</w:t>
+      </w:r>
+    </w:p>
+    <w:p>
+      <w:pPr>
+        <w:pStyle w:val="ListParagraph"/>
+        <w:widowControl/>
+        <w:numPr>
+          <w:ilvl w:val="0"/>
+          <w:numId w:val="27"/>
+        </w:numPr>
+        <w:autoSpaceDE/>
+        <w:autoSpaceDN/>
+        <w:ind w:right="680"/>
+        <w:rPr>
+          <w:rFonts w:ascii="Aptos Display" w:eastAsia="Times New Roman" w:hAnsi="Aptos Display" w:cs="Times New Roman"/>
+          <w:sz w:val="24"/>
+          <w:szCs w:val="24"/>
+        </w:rPr>
+      </w:pPr>
+      <w:r>
+        <w:rPr>
+          <w:rFonts w:ascii="Aptos Display" w:eastAsia="Times New Roman" w:hAnsi="Aptos Display" w:cs="Times New Roman"/>
+          <w:sz w:val="24"/>
+          <w:szCs w:val="24"/>
+        </w:rPr>
+        <w:t>Supported enterprise integration environments, troubleshooting data flow and system communication issues</w:t>
+      </w:r>
+    </w:p>
+    <w:p>
+      <w:pPr>
+        <w:pStyle w:val="ListParagraph"/>
+        <w:widowControl/>
+        <w:numPr>
+          <w:ilvl w:val="0"/>
+          <w:numId w:val="27"/>
+        </w:numPr>
+        <w:autoSpaceDE/>
+        <w:autoSpaceDN/>
+        <w:ind w:right="680"/>
+        <w:rPr>
+          <w:rFonts w:ascii="Aptos Display" w:eastAsia="Times New Roman" w:hAnsi="Aptos Display" w:cs="Times New Roman"/>
+          <w:sz w:val="24"/>
+          <w:szCs w:val="24"/>
+        </w:rPr>
+      </w:pPr>
+      <w:r>
+        <w:rPr>
+          <w:rFonts w:ascii="Aptos Display" w:eastAsia="Times New Roman" w:hAnsi="Aptos Display" w:cs="Times New Roman"/>
+          <w:sz w:val="24"/>
+          <w:szCs w:val="24"/>
+        </w:rPr>
+        <w:t>Maintained and monitored interfaces across distributed systems to ensure reliable data exchange</w:t>
+      </w:r>
+    </w:p>
+    <w:p>
+      <w:pPr>
+        <w:numPr>
+          <w:ilvl w:val="0"/>
+          <w:numId w:val="26"/>
+        </w:numPr>
+        <w:spacing w:after="160"/>
+        <w:rPr>
+          <w:rFonts w:ascii="Aptos Display" w:hAnsi="Aptos Display" w:cs="Times New Roman"/>
+          <w:bCs/>
+          <w:w w:val="105"/>
+          <w:sz w:val="24"/>
+          <w:szCs w:val="24"/>
+        </w:rPr>
+      </w:pPr>
+      <w:r>
+        <w:rPr>
+          <w:rFonts w:ascii="Aptos Display" w:hAnsi="Aptos Display" w:cs="Times New Roman"/>
+          <w:bCs/>
+          <w:w w:val="105"/>
+          <w:sz w:val="24"/>
+          <w:szCs w:val="24"/>
+        </w:rPr>
+        <w:t>Worked within regulated environments requiring stable and secure system operation</w:t>
+      </w:r>
+    </w:p>
+    <w:p>
+      <w:pPr>
+        <w:spacing w:before="106"/>
+        <w:ind w:left="360"/>
+        <w:rPr>
+          <w:rFonts w:ascii="Aptos Display" w:hAnsi="Aptos Display"/>
+          <w:b/>
+          <w:bCs/>
+          <w:w w:val="105"/>
+          <w:sz w:val="26"/>
+          <w:szCs w:val="26"/>
+        </w:rPr>
+      </w:pPr>
+      <w:r>
+        <w:rPr>
+          <w:rFonts w:ascii="Aptos Display" w:hAnsi="Aptos Display"/>
+          <w:b/>
+          <w:bCs/>
+          <w:w w:val="105"/>
+          <w:sz w:val="26"/>
+          <w:szCs w:val="26"/>
+        </w:rPr>
+        <w:t>Computer Sciences Corporation — Senior Consultant</w:t>
+      </w:r>
+    </w:p>
+    <w:p>
+      <w:pPr>
+        <w:keepNext/>
+        <w:keepLines/>
+        <w:widowControl/>
+        <w:autoSpaceDE/>
+        <w:autoSpaceDN/>
+        <w:spacing w:after="160"/>
+        <w:ind w:left="330" w:right="680"/>
+        <w:rPr>
+          <w:rFonts w:ascii="Aptos Display" w:eastAsia="Times New Roman" w:hAnsi="Aptos Display" w:cs="Times New Roman"/>
+          <w:sz w:val="24"/>
+          <w:szCs w:val="24"/>
+        </w:rPr>
+      </w:pPr>
+      <w:r>
+        <w:rPr>
+          <w:rFonts w:ascii="Aptos Display" w:eastAsia="Times New Roman" w:hAnsi="Aptos Display" w:cs="Times New Roman"/>
+          <w:sz w:val="24"/>
+          <w:szCs w:val="24"/>
+        </w:rPr>
+        <w:t>10/</w:t>
+      </w:r>
+      <w:r>
+        <w:rPr>
+          <w:rFonts w:ascii="Aptos Display" w:eastAsia="Times New Roman" w:hAnsi="Aptos Display" w:cs="Times New Roman"/>
+          <w:sz w:val="24"/>
+          <w:szCs w:val="24"/>
+        </w:rPr>
+        <w:t xml:space="preserve">2001 – </w:t>
+      </w:r>
+      <w:r>
+        <w:rPr>
+          <w:rFonts w:ascii="Aptos Display" w:eastAsia="Times New Roman" w:hAnsi="Aptos Display" w:cs="Times New Roman"/>
+          <w:sz w:val="24"/>
+          <w:szCs w:val="24"/>
+        </w:rPr>
+        <w:t>10/</w:t>
+      </w:r>
+      <w:r>
+        <w:rPr>
+          <w:rFonts w:ascii="Aptos Display" w:eastAsia="Times New Roman" w:hAnsi="Aptos Display" w:cs="Times New Roman"/>
+          <w:sz w:val="24"/>
+          <w:szCs w:val="24"/>
+        </w:rPr>
+        <w:t>2002</w:t>
+      </w:r>
+    </w:p>
+    <w:p>
+      <w:pPr>
+        <w:pStyle w:val="ListParagraph"/>
+        <w:widowControl/>
+        <w:numPr>
+          <w:ilvl w:val="0"/>
+          <w:numId w:val="27"/>
+        </w:numPr>
+        <w:autoSpaceDE/>
+        <w:autoSpaceDN/>
+        <w:ind w:right="680"/>
+        <w:rPr>
+          <w:rFonts w:ascii="Aptos Display" w:eastAsia="Times New Roman" w:hAnsi="Aptos Display" w:cs="Times New Roman"/>
+          <w:sz w:val="24"/>
+          <w:szCs w:val="24"/>
+        </w:rPr>
+      </w:pPr>
+      <w:r>
+        <w:rPr>
+          <w:rFonts w:ascii="Aptos Display" w:eastAsia="Times New Roman" w:hAnsi="Aptos Display" w:cs="Times New Roman"/>
+          <w:sz w:val="24"/>
+          <w:szCs w:val="24"/>
+        </w:rPr>
+        <w:t>Supported enterprise integration systems and assisted in resolving system connectivity and data exchange issues</w:t>
+      </w:r>
+    </w:p>
+    <w:p>
+      <w:pPr>
+        <w:numPr>
+          <w:ilvl w:val="0"/>
+          <w:numId w:val="26"/>
+        </w:numPr>
+        <w:spacing w:after="160"/>
+        <w:rPr>
+          <w:rFonts w:ascii="Aptos Display" w:hAnsi="Aptos Display" w:cs="Times New Roman"/>
+          <w:bCs/>
+          <w:w w:val="105"/>
+          <w:sz w:val="24"/>
+          <w:szCs w:val="24"/>
+        </w:rPr>
+      </w:pPr>
+      <w:r>
+        <w:rPr>
+          <w:rFonts w:ascii="Aptos Display" w:hAnsi="Aptos Display" w:cs="Times New Roman"/>
+          <w:bCs/>
+          <w:w w:val="105"/>
+          <w:sz w:val="24"/>
+          <w:szCs w:val="24"/>
+        </w:rPr>
+        <w:t>Developed and maintained middleware components supporting large-scale environments</w:t>
+      </w:r>
+    </w:p>
+    <w:p>
+      <w:pPr>
+        <w:spacing w:before="106"/>
+        <w:ind w:left="360"/>
+        <w:rPr>
+          <w:rFonts w:ascii="Aptos Display" w:hAnsi="Aptos Display"/>
+          <w:b/>
+          <w:bCs/>
+          <w:w w:val="105"/>
+          <w:sz w:val="26"/>
+          <w:szCs w:val="26"/>
+        </w:rPr>
+      </w:pPr>
+      <w:r>
+        <w:rPr>
+          <w:rFonts w:ascii="Aptos Display" w:hAnsi="Aptos Display"/>
+          <w:b/>
+          <w:bCs/>
+          <w:w w:val="105"/>
+          <w:sz w:val="26"/>
+          <w:szCs w:val="26"/>
+        </w:rPr>
+        <w:t>Fluor Corporation — EAI Team Lead</w:t>
+      </w:r>
+    </w:p>
+    <w:p>
+      <w:pPr>
+        <w:keepNext/>
+        <w:keepLines/>
+        <w:widowControl/>
+        <w:autoSpaceDE/>
+        <w:autoSpaceDN/>
+        <w:spacing w:after="160"/>
+        <w:ind w:left="330" w:right="680"/>
+        <w:rPr>
+          <w:rFonts w:ascii="Aptos Display" w:eastAsia="Times New Roman" w:hAnsi="Aptos Display" w:cs="Times New Roman"/>
+          <w:sz w:val="24"/>
+          <w:szCs w:val="24"/>
+        </w:rPr>
+      </w:pPr>
+      <w:r>
+        <w:rPr>
+          <w:rFonts w:ascii="Aptos Display" w:eastAsia="Times New Roman" w:hAnsi="Aptos Display" w:cs="Times New Roman"/>
+          <w:sz w:val="24"/>
+          <w:szCs w:val="24"/>
+        </w:rPr>
+        <w:t>01/</w:t>
+      </w:r>
+      <w:r>
+        <w:rPr>
+          <w:rFonts w:ascii="Aptos Display" w:eastAsia="Times New Roman" w:hAnsi="Aptos Display" w:cs="Times New Roman"/>
+          <w:sz w:val="24"/>
+          <w:szCs w:val="24"/>
+        </w:rPr>
+        <w:t xml:space="preserve">1999 – </w:t>
+      </w:r>
+      <w:r>
+        <w:rPr>
+          <w:rFonts w:ascii="Aptos Display" w:eastAsia="Times New Roman" w:hAnsi="Aptos Display" w:cs="Times New Roman"/>
+          <w:sz w:val="24"/>
+          <w:szCs w:val="24"/>
+        </w:rPr>
+        <w:t>10/</w:t>
+      </w:r>
+      <w:r>
+        <w:rPr>
+          <w:rFonts w:ascii="Aptos Display" w:eastAsia="Times New Roman" w:hAnsi="Aptos Display" w:cs="Times New Roman"/>
+          <w:sz w:val="24"/>
+          <w:szCs w:val="24"/>
+        </w:rPr>
+        <w:t>2001</w:t>
+      </w:r>
+    </w:p>
+    <w:p>
+      <w:pPr>
+        <w:pStyle w:val="ListParagraph"/>
+        <w:widowControl/>
+        <w:numPr>
+          <w:ilvl w:val="0"/>
+          <w:numId w:val="27"/>
+        </w:numPr>
+        <w:autoSpaceDE/>
+        <w:autoSpaceDN/>
+        <w:ind w:right="680"/>
+        <w:rPr>
+          <w:rFonts w:ascii="Aptos Display" w:eastAsia="Times New Roman" w:hAnsi="Aptos Display" w:cs="Times New Roman"/>
+          <w:sz w:val="24"/>
+          <w:szCs w:val="24"/>
+        </w:rPr>
+      </w:pPr>
+      <w:r>
+        <w:rPr>
+          <w:rFonts w:ascii="Aptos Display" w:eastAsia="Times New Roman" w:hAnsi="Aptos Display" w:cs="Times New Roman"/>
+          <w:sz w:val="24"/>
+          <w:szCs w:val="24"/>
+        </w:rPr>
+        <w:t>Supported enterprise messaging and integration infrastructure</w:t>
+      </w:r>
+    </w:p>
+    <w:p>
+      <w:pPr>
+        <w:pStyle w:val="ListParagraph"/>
+        <w:widowControl/>
+        <w:numPr>
+          <w:ilvl w:val="0"/>
+          <w:numId w:val="27"/>
+        </w:numPr>
+        <w:autoSpaceDE/>
+        <w:autoSpaceDN/>
+        <w:ind w:right="680"/>
+        <w:rPr>
+          <w:rFonts w:ascii="Aptos Display" w:eastAsia="Times New Roman" w:hAnsi="Aptos Display" w:cs="Times New Roman"/>
+          <w:sz w:val="24"/>
+          <w:szCs w:val="24"/>
+        </w:rPr>
+      </w:pPr>
+      <w:r>
+        <w:rPr>
+          <w:rFonts w:ascii="Aptos Display" w:eastAsia="Times New Roman" w:hAnsi="Aptos Display" w:cs="Times New Roman"/>
+          <w:sz w:val="24"/>
+          <w:szCs w:val="24"/>
+        </w:rPr>
+        <w:t>Conducted troubleshooting and validation of system communication across platforms</w:t>
+      </w:r>
+    </w:p>
+    <w:p>
+      <w:pPr>
+        <w:numPr>
+          <w:ilvl w:val="0"/>
+          <w:numId w:val="26"/>
+        </w:numPr>
+        <w:spacing w:after="160"/>
+        <w:rPr>
+          <w:rFonts w:ascii="Aptos Display" w:hAnsi="Aptos Display" w:cs="Times New Roman"/>
+          <w:bCs/>
+          <w:w w:val="105"/>
+          <w:sz w:val="24"/>
+          <w:szCs w:val="24"/>
+        </w:rPr>
+      </w:pPr>
+      <w:r>
+        <w:rPr>
+          <w:rFonts w:ascii="Aptos Display" w:hAnsi="Aptos Display" w:cs="Times New Roman"/>
+          <w:bCs/>
+          <w:w w:val="105"/>
+          <w:sz w:val="24"/>
+          <w:szCs w:val="24"/>
+        </w:rPr>
+        <w:t>Assisted with infrastructure transitions during legacy-to-SAP migrations</w:t>
+      </w:r>
+    </w:p>
+    <w:p>
+      <w:pPr>
+        <w:keepNext/>
+        <w:keepLines/>
+        <w:widowControl/>
+        <w:spacing w:before="106"/>
+        <w:ind w:left="360"/>
+        <w:rPr>
+          <w:rFonts w:ascii="Aptos Display" w:hAnsi="Aptos Display"/>
+          <w:b/>
+          <w:bCs/>
+          <w:w w:val="105"/>
+          <w:sz w:val="26"/>
+          <w:szCs w:val="26"/>
+        </w:rPr>
+      </w:pPr>
+      <w:r>
+        <w:rPr>
+          <w:rFonts w:ascii="Aptos Display" w:hAnsi="Aptos Display"/>
+          <w:b/>
+          <w:bCs/>
+          <w:w w:val="105"/>
+          <w:sz w:val="26"/>
+          <w:szCs w:val="26"/>
+        </w:rPr>
+        <w:lastRenderedPageBreak/>
+        <w:t>PM Realty Group — MIS Manager</w:t>
+      </w:r>
+    </w:p>
+    <w:p>
+      <w:pPr>
+        <w:keepNext/>
+        <w:keepLines/>
+        <w:widowControl/>
+        <w:autoSpaceDE/>
+        <w:autoSpaceDN/>
+        <w:spacing w:after="160"/>
+        <w:ind w:left="330" w:right="680"/>
+        <w:rPr>
+          <w:rFonts w:ascii="Aptos Display" w:eastAsia="Times New Roman" w:hAnsi="Aptos Display" w:cs="Times New Roman"/>
+          <w:sz w:val="24"/>
+          <w:szCs w:val="24"/>
+        </w:rPr>
+      </w:pPr>
+      <w:r>
+        <w:rPr>
+          <w:rFonts w:ascii="Aptos Display" w:eastAsia="Times New Roman" w:hAnsi="Aptos Display" w:cs="Times New Roman"/>
+          <w:sz w:val="24"/>
+          <w:szCs w:val="24"/>
+        </w:rPr>
+        <w:t>01/</w:t>
+      </w:r>
+      <w:r>
+        <w:rPr>
+          <w:rFonts w:ascii="Aptos Display" w:eastAsia="Times New Roman" w:hAnsi="Aptos Display" w:cs="Times New Roman"/>
+          <w:sz w:val="24"/>
+          <w:szCs w:val="24"/>
+        </w:rPr>
+        <w:t xml:space="preserve">1996 – </w:t>
+      </w:r>
+      <w:r>
+        <w:rPr>
+          <w:rFonts w:ascii="Aptos Display" w:eastAsia="Times New Roman" w:hAnsi="Aptos Display" w:cs="Times New Roman"/>
+          <w:sz w:val="24"/>
+          <w:szCs w:val="24"/>
+        </w:rPr>
+        <w:t>01/</w:t>
+      </w:r>
+      <w:r>
+        <w:rPr>
+          <w:rFonts w:ascii="Aptos Display" w:eastAsia="Times New Roman" w:hAnsi="Aptos Display" w:cs="Times New Roman"/>
+          <w:sz w:val="24"/>
+          <w:szCs w:val="24"/>
+        </w:rPr>
+        <w:t>1999</w:t>
       </w:r>
     </w:p>
     <w:p>
@@ -981,222 +1791,7 @@
           <w:sz w:val="24"/>
           <w:szCs w:val="24"/>
         </w:rPr>
-        <w:t xml:space="preserve">Troubleshot and resolved production issues across distributed systems, including database, </w:t>
-      </w:r>
-      <w:r>
-        <w:rPr>
-          <w:rFonts w:ascii="Aptos Display" w:eastAsia="Times New Roman" w:hAnsi="Aptos Display" w:cs="Times New Roman"/>
-          <w:sz w:val="24"/>
-          <w:szCs w:val="24"/>
-        </w:rPr>
-        <w:t>integration services</w:t>
-      </w:r>
-      <w:r>
-        <w:rPr>
-          <w:rFonts w:ascii="Aptos Display" w:eastAsia="Times New Roman" w:hAnsi="Aptos Display" w:cs="Times New Roman"/>
-          <w:sz w:val="24"/>
-          <w:szCs w:val="24"/>
-        </w:rPr>
-        <w:t xml:space="preserve">, and </w:t>
-      </w:r>
-      <w:r>
-        <w:rPr>
-          <w:rFonts w:ascii="Aptos Display" w:eastAsia="Times New Roman" w:hAnsi="Aptos Display" w:cs="Times New Roman"/>
-          <w:sz w:val="24"/>
-          <w:szCs w:val="24"/>
-        </w:rPr>
-        <w:t>connectivity and infrastructure-related failures</w:t>
-      </w:r>
-    </w:p>
-    <w:p>
-      <w:pPr>
-        <w:pStyle w:val="ListParagraph"/>
-        <w:keepNext/>
-        <w:keepLines/>
-        <w:widowControl/>
-        <w:numPr>
-          <w:ilvl w:val="0"/>
-          <w:numId w:val="27"/>
-        </w:numPr>
-        <w:autoSpaceDE/>
-        <w:autoSpaceDN/>
-        <w:ind w:right="680"/>
-        <w:rPr>
-          <w:rFonts w:ascii="Aptos Display" w:eastAsia="Times New Roman" w:hAnsi="Aptos Display" w:cs="Times New Roman"/>
-          <w:sz w:val="24"/>
-          <w:szCs w:val="24"/>
-        </w:rPr>
-      </w:pPr>
-      <w:r>
-        <w:rPr>
-          <w:rFonts w:ascii="Aptos Display" w:eastAsia="Times New Roman" w:hAnsi="Aptos Display" w:cs="Times New Roman"/>
-          <w:sz w:val="24"/>
-          <w:szCs w:val="24"/>
-        </w:rPr>
-        <w:t>Supported enterprise data platforms and integration systems, ensuring reliable system performance and uptime</w:t>
-      </w:r>
-    </w:p>
-    <w:p>
-      <w:pPr>
-        <w:pStyle w:val="ListParagraph"/>
-        <w:keepNext/>
-        <w:keepLines/>
-        <w:widowControl/>
-        <w:numPr>
-          <w:ilvl w:val="0"/>
-          <w:numId w:val="27"/>
-        </w:numPr>
-        <w:autoSpaceDE/>
-        <w:autoSpaceDN/>
-        <w:ind w:right="680"/>
-        <w:rPr>
-          <w:rFonts w:ascii="Aptos Display" w:eastAsia="Times New Roman" w:hAnsi="Aptos Display" w:cs="Times New Roman"/>
-          <w:sz w:val="24"/>
-          <w:szCs w:val="24"/>
-        </w:rPr>
-      </w:pPr>
-      <w:r>
-        <w:rPr>
-          <w:rFonts w:ascii="Aptos Display" w:eastAsia="Times New Roman" w:hAnsi="Aptos Display" w:cs="Times New Roman"/>
-          <w:sz w:val="24"/>
-          <w:szCs w:val="24"/>
-        </w:rPr>
-        <w:t>Diagnosed performance bottlenecks and system slowdowns, improving responsiveness and stability</w:t>
-      </w:r>
-    </w:p>
-    <w:p>
-      <w:pPr>
-        <w:pStyle w:val="ListParagraph"/>
-        <w:keepNext/>
-        <w:keepLines/>
-        <w:widowControl/>
-        <w:numPr>
-          <w:ilvl w:val="0"/>
-          <w:numId w:val="27"/>
-        </w:numPr>
-        <w:autoSpaceDE/>
-        <w:autoSpaceDN/>
-        <w:ind w:right="680"/>
-        <w:rPr>
-          <w:rFonts w:ascii="Aptos Display" w:eastAsia="Times New Roman" w:hAnsi="Aptos Display" w:cs="Times New Roman"/>
-          <w:sz w:val="24"/>
-          <w:szCs w:val="24"/>
-        </w:rPr>
-      </w:pPr>
-      <w:r>
-        <w:rPr>
-          <w:rFonts w:ascii="Aptos Display" w:eastAsia="Times New Roman" w:hAnsi="Aptos Display" w:cs="Times New Roman"/>
-          <w:sz w:val="24"/>
-          <w:szCs w:val="24"/>
-        </w:rPr>
-        <w:t>Collaborated with infrastructure and development teams to resolve system-level issues impacting application performance</w:t>
-      </w:r>
-    </w:p>
-    <w:p>
-      <w:pPr>
-        <w:numPr>
-          <w:ilvl w:val="0"/>
-          <w:numId w:val="26"/>
-        </w:numPr>
-        <w:spacing w:after="160"/>
-        <w:rPr>
-          <w:rFonts w:ascii="Aptos Display" w:hAnsi="Aptos Display" w:cs="Times New Roman"/>
-          <w:bCs/>
-          <w:w w:val="105"/>
-          <w:sz w:val="24"/>
-          <w:szCs w:val="24"/>
-        </w:rPr>
-      </w:pPr>
-      <w:r>
-        <w:rPr>
-          <w:rFonts w:ascii="Aptos Display" w:hAnsi="Aptos Display" w:cs="Times New Roman"/>
-          <w:bCs/>
-          <w:w w:val="105"/>
-          <w:sz w:val="24"/>
-          <w:szCs w:val="24"/>
-        </w:rPr>
-        <w:t>Worked with cloud-hosted environments (Azure SQL and related services) to maintain system reliability</w:t>
-      </w:r>
-    </w:p>
-    <w:p>
-      <w:pPr>
-        <w:spacing w:before="106"/>
-        <w:ind w:left="360"/>
-        <w:rPr>
-          <w:rFonts w:ascii="Aptos Display" w:hAnsi="Aptos Display"/>
-          <w:b/>
-          <w:bCs/>
-          <w:w w:val="105"/>
-          <w:sz w:val="26"/>
-          <w:szCs w:val="26"/>
-        </w:rPr>
-      </w:pPr>
-      <w:r>
-        <w:rPr>
-          <w:rFonts w:ascii="Aptos Display" w:hAnsi="Aptos Display"/>
-          <w:b/>
-          <w:bCs/>
-          <w:w w:val="105"/>
-          <w:sz w:val="26"/>
-          <w:szCs w:val="26"/>
-        </w:rPr>
-        <w:t>Independent Consultant</w:t>
-      </w:r>
-    </w:p>
-    <w:p>
-      <w:pPr>
-        <w:ind w:left="331"/>
-        <w:rPr>
-          <w:rFonts w:ascii="Aptos Display" w:hAnsi="Aptos Display"/>
-          <w:spacing w:val="-4"/>
-          <w:w w:val="105"/>
-          <w:sz w:val="26"/>
-          <w:szCs w:val="26"/>
-        </w:rPr>
-      </w:pPr>
-      <w:r>
-        <w:rPr>
-          <w:rFonts w:ascii="Aptos Display" w:hAnsi="Aptos Display"/>
-          <w:spacing w:val="-4"/>
-          <w:w w:val="105"/>
-          <w:sz w:val="26"/>
-          <w:szCs w:val="26"/>
-        </w:rPr>
-        <w:t xml:space="preserve">Industry / Client Focus: </w:t>
-      </w:r>
-      <w:r>
-        <w:rPr>
-          <w:rFonts w:ascii="Aptos Display" w:hAnsi="Aptos Display"/>
-          <w:spacing w:val="-4"/>
-          <w:w w:val="105"/>
-          <w:sz w:val="26"/>
-          <w:szCs w:val="26"/>
-        </w:rPr>
-        <w:t>legacy modernization enterprise applications</w:t>
-      </w:r>
-    </w:p>
-    <w:p>
-      <w:pPr>
-        <w:keepNext/>
-        <w:keepLines/>
-        <w:widowControl/>
-        <w:autoSpaceDE/>
-        <w:autoSpaceDN/>
-        <w:spacing w:after="160"/>
-        <w:ind w:left="330" w:right="680"/>
-        <w:rPr>
-          <w:rFonts w:ascii="Aptos Display" w:eastAsia="Times New Roman" w:hAnsi="Aptos Display" w:cs="Times New Roman"/>
-          <w:sz w:val="24"/>
-          <w:szCs w:val="24"/>
-        </w:rPr>
-      </w:pPr>
-      <w:r>
-        <w:rPr>
-          <w:rFonts w:ascii="Aptos Display" w:eastAsia="Times New Roman" w:hAnsi="Aptos Display" w:cs="Times New Roman"/>
-          <w:sz w:val="24"/>
-          <w:szCs w:val="24"/>
-        </w:rPr>
-        <w:t>03/2014 – 08/2015</w:t>
+        <w:t>Managed IT operations, including network infrastructure, system connectivity, and user support</w:t>
       </w:r>
     </w:p>
     <w:p>
@@ -1222,39 +1817,104 @@
           <w:sz w:val="24"/>
           <w:szCs w:val="24"/>
         </w:rPr>
-        <w:t xml:space="preserve">Delivered custom .NET/MVC and </w:t>
-      </w:r>
-      <w:r>
-        <w:rPr>
-          <w:rFonts w:ascii="Aptos Display" w:eastAsia="Times New Roman" w:hAnsi="Aptos Display" w:cs="Times New Roman"/>
-          <w:sz w:val="24"/>
-          <w:szCs w:val="24"/>
-        </w:rPr>
-        <w:t>web applications</w:t>
-      </w:r>
-      <w:r>
-        <w:rPr>
-          <w:rFonts w:ascii="Aptos Display" w:eastAsia="Times New Roman" w:hAnsi="Aptos Display" w:cs="Times New Roman"/>
-          <w:sz w:val="24"/>
-          <w:szCs w:val="24"/>
-        </w:rPr>
-        <w:t xml:space="preserve"> using HTML5, CSS3, JavaScript, and </w:t>
-      </w:r>
-      <w:r>
-        <w:rPr>
-          <w:rFonts w:ascii="Aptos Display" w:eastAsia="Times New Roman" w:hAnsi="Aptos Display" w:cs="Times New Roman"/>
-          <w:sz w:val="24"/>
-          <w:szCs w:val="24"/>
-        </w:rPr>
-        <w:t>Database-backed application architecture</w:t>
-      </w:r>
-      <w:r>
-        <w:rPr>
-          <w:rFonts w:ascii="Aptos Display" w:eastAsia="Times New Roman" w:hAnsi="Aptos Display" w:cs="Times New Roman"/>
-          <w:sz w:val="24"/>
-          <w:szCs w:val="24"/>
-        </w:rPr>
-        <w:t>.</w:t>
+        <w:t>Led LAN/WAN upgrades and ensured reliable communication across office locations</w:t>
+      </w:r>
+    </w:p>
+    <w:p>
+      <w:pPr>
+        <w:numPr>
+          <w:ilvl w:val="0"/>
+          <w:numId w:val="26"/>
+        </w:numPr>
+        <w:spacing w:after="160"/>
+        <w:rPr>
+          <w:rFonts w:ascii="Aptos Display" w:hAnsi="Aptos Display" w:cs="Times New Roman"/>
+          <w:bCs/>
+          <w:w w:val="105"/>
+          <w:sz w:val="24"/>
+          <w:szCs w:val="24"/>
+        </w:rPr>
+      </w:pPr>
+      <w:r>
+        <w:rPr>
+          <w:rFonts w:ascii="Aptos Display" w:hAnsi="Aptos Display" w:cs="Times New Roman"/>
+          <w:bCs/>
+          <w:w w:val="105"/>
+          <w:sz w:val="24"/>
+          <w:szCs w:val="24"/>
+        </w:rPr>
+        <w:t>Supported business-critical systems and provided hands-on technical troubleshooting</w:t>
+      </w:r>
+    </w:p>
+    <w:p>
+      <w:pPr>
+        <w:spacing w:before="106"/>
+        <w:ind w:left="360"/>
+        <w:rPr>
+          <w:rFonts w:ascii="Aptos Display" w:hAnsi="Aptos Display"/>
+          <w:b/>
+          <w:bCs/>
+          <w:w w:val="105"/>
+          <w:sz w:val="26"/>
+          <w:szCs w:val="26"/>
+        </w:rPr>
+      </w:pPr>
+      <w:r>
+        <w:rPr>
+          <w:rFonts w:ascii="Aptos Display" w:hAnsi="Aptos Display"/>
+          <w:b/>
+          <w:bCs/>
+          <w:w w:val="105"/>
+          <w:sz w:val="26"/>
+          <w:szCs w:val="26"/>
+        </w:rPr>
+        <w:t>Access Development Corp — System Administrator / Programmer</w:t>
+      </w:r>
+    </w:p>
+    <w:p>
+      <w:pPr>
+        <w:widowControl/>
+        <w:autoSpaceDE/>
+        <w:autoSpaceDN/>
+        <w:spacing w:after="160"/>
+        <w:ind w:left="330" w:right="680"/>
+        <w:rPr>
+          <w:rFonts w:ascii="Aptos Display" w:eastAsia="Times New Roman" w:hAnsi="Aptos Display" w:cs="Times New Roman"/>
+          <w:sz w:val="24"/>
+          <w:szCs w:val="24"/>
+        </w:rPr>
+      </w:pPr>
+      <w:r>
+        <w:rPr>
+          <w:rFonts w:ascii="Aptos Display" w:eastAsia="Times New Roman" w:hAnsi="Aptos Display" w:cs="Times New Roman"/>
+          <w:sz w:val="24"/>
+          <w:szCs w:val="24"/>
+        </w:rPr>
+        <w:t>05/</w:t>
+      </w:r>
+      <w:r>
+        <w:rPr>
+          <w:rFonts w:ascii="Aptos Display" w:eastAsia="Times New Roman" w:hAnsi="Aptos Display" w:cs="Times New Roman"/>
+          <w:sz w:val="24"/>
+          <w:szCs w:val="24"/>
+        </w:rPr>
+        <w:t xml:space="preserve">1986 – </w:t>
+      </w:r>
+      <w:r>
+        <w:rPr>
+          <w:rFonts w:ascii="Aptos Display" w:eastAsia="Times New Roman" w:hAnsi="Aptos Display" w:cs="Times New Roman"/>
+          <w:sz w:val="24"/>
+          <w:szCs w:val="24"/>
+        </w:rPr>
+        <w:t>01/</w:t>
+      </w:r>
+      <w:r>
+        <w:rPr>
+          <w:rFonts w:ascii="Aptos Display" w:eastAsia="Times New Roman" w:hAnsi="Aptos Display" w:cs="Times New Roman"/>
+          <w:sz w:val="24"/>
+          <w:szCs w:val="24"/>
+        </w:rPr>
+        <w:t>1996</w:t>
       </w:r>
     </w:p>
     <w:p>
@@ -1280,182 +1940,7 @@
           <w:sz w:val="24"/>
           <w:szCs w:val="24"/>
         </w:rPr>
-        <w:t>Built responsive UI, database-driven workflows, reporting views, and analytics outputs for small business and enterprise use cases.</w:t>
-      </w:r>
-    </w:p>
-    <w:p>
-      <w:pPr>
-        <w:numPr>
-          <w:ilvl w:val="0"/>
-          <w:numId w:val="26"/>
-        </w:numPr>
-        <w:spacing w:after="160"/>
-        <w:rPr>
-          <w:rFonts w:ascii="Aptos Display" w:hAnsi="Aptos Display" w:cs="Times New Roman"/>
-          <w:bCs/>
-          <w:w w:val="105"/>
-          <w:sz w:val="24"/>
-          <w:szCs w:val="24"/>
-        </w:rPr>
-      </w:pPr>
-      <w:r>
-        <w:rPr>
-          <w:rFonts w:ascii="Aptos Display" w:hAnsi="Aptos Display" w:cs="Times New Roman"/>
-          <w:bCs/>
-          <w:w w:val="105"/>
-          <w:sz w:val="24"/>
-          <w:szCs w:val="24"/>
-        </w:rPr>
-        <w:t xml:space="preserve">Supported legacy modernization by integrating older systems with web applications, relational databases, APIs, and </w:t>
-      </w:r>
-      <w:r>
-        <w:rPr>
-          <w:rFonts w:ascii="Aptos Display" w:hAnsi="Aptos Display" w:cs="Times New Roman"/>
-          <w:bCs/>
-          <w:w w:val="105"/>
-          <w:sz w:val="24"/>
-          <w:szCs w:val="24"/>
-        </w:rPr>
-        <w:t>integration services</w:t>
-      </w:r>
-      <w:r>
-        <w:rPr>
-          <w:rFonts w:ascii="Aptos Display" w:hAnsi="Aptos Display" w:cs="Times New Roman"/>
-          <w:bCs/>
-          <w:w w:val="105"/>
-          <w:sz w:val="24"/>
-          <w:szCs w:val="24"/>
-        </w:rPr>
-        <w:t>-style data flows.</w:t>
-      </w:r>
-    </w:p>
-    <w:p>
-      <w:pPr>
-        <w:spacing w:before="106"/>
-        <w:ind w:left="360"/>
-        <w:rPr>
-          <w:rFonts w:ascii="Aptos Display" w:hAnsi="Aptos Display"/>
-          <w:b/>
-          <w:bCs/>
-          <w:w w:val="105"/>
-          <w:sz w:val="26"/>
-          <w:szCs w:val="26"/>
-        </w:rPr>
-      </w:pPr>
-      <w:r>
-        <w:rPr>
-          <w:rFonts w:ascii="Aptos Display" w:hAnsi="Aptos Display"/>
-          <w:b/>
-          <w:bCs/>
-          <w:w w:val="105"/>
-          <w:sz w:val="26"/>
-          <w:szCs w:val="26"/>
-        </w:rPr>
-        <w:t>Steton Technology Group — Lead Architect</w:t>
-      </w:r>
-    </w:p>
-    <w:p>
-      <w:pPr>
-        <w:ind w:left="331"/>
-        <w:rPr>
-          <w:rFonts w:ascii="Aptos Display" w:hAnsi="Aptos Display"/>
-          <w:spacing w:val="-4"/>
-          <w:w w:val="105"/>
-          <w:sz w:val="26"/>
-          <w:szCs w:val="26"/>
-        </w:rPr>
-      </w:pPr>
-      <w:r>
-        <w:rPr>
-          <w:rFonts w:ascii="Aptos Display" w:hAnsi="Aptos Display"/>
-          <w:spacing w:val="-4"/>
-          <w:w w:val="105"/>
-          <w:sz w:val="26"/>
-          <w:szCs w:val="26"/>
-        </w:rPr>
-        <w:t xml:space="preserve">Industry / Client Focus: </w:t>
-      </w:r>
-      <w:r>
-        <w:rPr>
-          <w:rFonts w:ascii="Aptos Display" w:hAnsi="Aptos Display"/>
-          <w:spacing w:val="-4"/>
-          <w:w w:val="105"/>
-          <w:sz w:val="26"/>
-          <w:szCs w:val="26"/>
-        </w:rPr>
-        <w:t>Food &amp; Hospitality, SaaS platforms, mobile data collection</w:t>
-      </w:r>
-    </w:p>
-    <w:p>
-      <w:pPr>
-        <w:keepNext/>
-        <w:keepLines/>
-        <w:widowControl/>
-        <w:autoSpaceDE/>
-        <w:autoSpaceDN/>
-        <w:spacing w:after="160"/>
-        <w:ind w:left="330" w:right="680"/>
-        <w:rPr>
-          <w:rFonts w:ascii="Aptos Display" w:eastAsia="Times New Roman" w:hAnsi="Aptos Display" w:cs="Times New Roman"/>
-          <w:sz w:val="24"/>
-          <w:szCs w:val="24"/>
-        </w:rPr>
-      </w:pPr>
-      <w:r>
-        <w:rPr>
-          <w:rFonts w:ascii="Aptos Display" w:eastAsia="Times New Roman" w:hAnsi="Aptos Display" w:cs="Times New Roman"/>
-          <w:sz w:val="24"/>
-          <w:szCs w:val="24"/>
-        </w:rPr>
-        <w:t>01/</w:t>
-      </w:r>
-      <w:r>
-        <w:rPr>
-          <w:rFonts w:ascii="Aptos Display" w:eastAsia="Times New Roman" w:hAnsi="Aptos Display" w:cs="Times New Roman"/>
-          <w:sz w:val="24"/>
-          <w:szCs w:val="24"/>
-        </w:rPr>
-        <w:t>200</w:t>
-      </w:r>
-      <w:r>
-        <w:rPr>
-          <w:rFonts w:ascii="Aptos Display" w:eastAsia="Times New Roman" w:hAnsi="Aptos Display" w:cs="Times New Roman"/>
-          <w:sz w:val="24"/>
-          <w:szCs w:val="24"/>
-        </w:rPr>
-        <w:t>4</w:t>
-      </w:r>
-      <w:r>
-        <w:rPr>
-          <w:rFonts w:ascii="Aptos Display" w:eastAsia="Times New Roman" w:hAnsi="Aptos Display" w:cs="Times New Roman"/>
-          <w:sz w:val="24"/>
-          <w:szCs w:val="24"/>
-        </w:rPr>
-        <w:t xml:space="preserve"> – </w:t>
-      </w:r>
-      <w:r>
-        <w:rPr>
-          <w:rFonts w:ascii="Aptos Display" w:eastAsia="Times New Roman" w:hAnsi="Aptos Display" w:cs="Times New Roman"/>
-          <w:sz w:val="24"/>
-          <w:szCs w:val="24"/>
-        </w:rPr>
-        <w:t>03/</w:t>
-      </w:r>
-      <w:r>
-        <w:rPr>
-          <w:rFonts w:ascii="Aptos Display" w:eastAsia="Times New Roman" w:hAnsi="Aptos Display" w:cs="Times New Roman"/>
-          <w:sz w:val="24"/>
-          <w:szCs w:val="24"/>
-        </w:rPr>
-        <w:t>201</w:t>
-      </w:r>
-      <w:r>
-        <w:rPr>
-          <w:rFonts w:ascii="Aptos Display" w:eastAsia="Times New Roman" w:hAnsi="Aptos Display" w:cs="Times New Roman"/>
-          <w:sz w:val="24"/>
-          <w:szCs w:val="24"/>
-        </w:rPr>
-        <w:t>4</w:t>
+        <w:t>Administered LAN-based systems and supported internal users with hardware and software issues</w:t>
       </w:r>
     </w:p>
     <w:p>
@@ -1481,59 +1966,7 @@
           <w:sz w:val="24"/>
           <w:szCs w:val="24"/>
         </w:rPr>
-        <w:t>Led operation and support of a multi-tenant SaaS platform, including system monitoring, issue resolution, and performance tuning</w:t>
-      </w:r>
-    </w:p>
-    <w:p>
-      <w:pPr>
-        <w:pStyle w:val="ListParagraph"/>
-        <w:widowControl/>
-        <w:numPr>
-          <w:ilvl w:val="0"/>
-          <w:numId w:val="27"/>
-        </w:numPr>
-        <w:autoSpaceDE/>
-        <w:autoSpaceDN/>
-        <w:ind w:right="680"/>
-        <w:rPr>
-          <w:rFonts w:ascii="Aptos Display" w:eastAsia="Times New Roman" w:hAnsi="Aptos Display" w:cs="Times New Roman"/>
-          <w:sz w:val="24"/>
-          <w:szCs w:val="24"/>
-        </w:rPr>
-      </w:pPr>
-      <w:r>
-        <w:rPr>
-          <w:rFonts w:ascii="Aptos Display" w:eastAsia="Times New Roman" w:hAnsi="Aptos Display" w:cs="Times New Roman"/>
-          <w:sz w:val="24"/>
-          <w:szCs w:val="24"/>
-        </w:rPr>
-        <w:t>Maintained application and database infrastructure supporting thousands of users</w:t>
-      </w:r>
-    </w:p>
-    <w:p>
-      <w:pPr>
-        <w:pStyle w:val="ListParagraph"/>
-        <w:widowControl/>
-        <w:numPr>
-          <w:ilvl w:val="0"/>
-          <w:numId w:val="27"/>
-        </w:numPr>
-        <w:autoSpaceDE/>
-        <w:autoSpaceDN/>
-        <w:ind w:right="680"/>
-        <w:rPr>
-          <w:rFonts w:ascii="Aptos Display" w:eastAsia="Times New Roman" w:hAnsi="Aptos Display" w:cs="Times New Roman"/>
-          <w:sz w:val="24"/>
-          <w:szCs w:val="24"/>
-        </w:rPr>
-      </w:pPr>
-      <w:r>
-        <w:rPr>
-          <w:rFonts w:ascii="Aptos Display" w:eastAsia="Times New Roman" w:hAnsi="Aptos Display" w:cs="Times New Roman"/>
-          <w:sz w:val="24"/>
-          <w:szCs w:val="24"/>
-        </w:rPr>
-        <w:t>Implemented cloud-based infrastructure improvements to enhance system availability and reliability</w:t>
+        <w:t>Installed, configured, and maintained business applications and system environments</w:t>
       </w:r>
     </w:p>
     <w:p>
@@ -1559,74 +1992,7 @@
           <w:sz w:val="24"/>
           <w:szCs w:val="24"/>
         </w:rPr>
-        <w:t>Diagnosed and resolved production issues across application, database, and infrastructure layers</w:t>
-      </w:r>
-    </w:p>
-    <w:p>
-      <w:pPr>
-        <w:spacing w:before="106"/>
-        <w:ind w:left="360"/>
-        <w:rPr>
-          <w:rFonts w:ascii="Aptos Display" w:hAnsi="Aptos Display"/>
-          <w:b/>
-          <w:bCs/>
-          <w:w w:val="105"/>
-          <w:sz w:val="26"/>
-          <w:szCs w:val="26"/>
-        </w:rPr>
-      </w:pPr>
-      <w:r>
-        <w:rPr>
-          <w:rFonts w:ascii="Aptos Display" w:hAnsi="Aptos Display"/>
-          <w:b/>
-          <w:bCs/>
-          <w:w w:val="105"/>
-          <w:sz w:val="26"/>
-          <w:szCs w:val="26"/>
-        </w:rPr>
-        <w:t>SeeBeyond — Senior Consultant</w:t>
-      </w:r>
-    </w:p>
-    <w:p>
-      <w:pPr>
-        <w:ind w:left="331"/>
-        <w:rPr>
-          <w:rFonts w:ascii="Aptos Display" w:hAnsi="Aptos Display"/>
-          <w:spacing w:val="-4"/>
-          <w:w w:val="105"/>
-          <w:sz w:val="26"/>
-          <w:szCs w:val="26"/>
-        </w:rPr>
-      </w:pPr>
-      <w:r>
-        <w:rPr>
-          <w:rFonts w:ascii="Aptos Display" w:hAnsi="Aptos Display"/>
-          <w:spacing w:val="-4"/>
-          <w:w w:val="105"/>
-          <w:sz w:val="26"/>
-          <w:szCs w:val="26"/>
-        </w:rPr>
-        <w:t xml:space="preserve">Industry / Client Focus: </w:t>
-      </w:r>
-      <w:r>
-        <w:rPr>
-          <w:rFonts w:ascii="Aptos Display" w:hAnsi="Aptos Display"/>
-          <w:spacing w:val="-4"/>
-          <w:w w:val="105"/>
-          <w:sz w:val="26"/>
-          <w:szCs w:val="26"/>
-        </w:rPr>
-        <w:t xml:space="preserve">Software, </w:t>
-      </w:r>
-      <w:r>
-        <w:rPr>
-          <w:rFonts w:ascii="Aptos Display" w:hAnsi="Aptos Display"/>
-          <w:spacing w:val="-4"/>
-          <w:w w:val="105"/>
-          <w:sz w:val="26"/>
-          <w:szCs w:val="26"/>
-        </w:rPr>
-        <w:t>integration platform / iPaaS</w:t>
+        <w:t>Migrated systems from legacy platforms to client/server architecture</w:t>
       </w:r>
     </w:p>
     <w:p>
@@ -1634,9 +2000,11 @@
         <w:keepNext/>
         <w:keepLines/>
         <w:widowControl/>
+        <w:tabs>
+          <w:tab w:val="right" w:pos="10080"/>
+        </w:tabs>
         <w:autoSpaceDE/>
         <w:autoSpaceDN/>
-        <w:spacing w:after="160"/>
         <w:ind w:left="330" w:right="680"/>
         <w:rPr>
           <w:rFonts w:ascii="Aptos Display" w:eastAsia="Times New Roman" w:hAnsi="Aptos Display" w:cs="Times New Roman"/>
@@ -1649,118 +2017,9 @@
           <w:rFonts w:ascii="Aptos Display" w:eastAsia="Times New Roman" w:hAnsi="Aptos Display" w:cs="Times New Roman"/>
           <w:sz w:val="24"/>
           <w:szCs w:val="24"/>
-        </w:rPr>
-        <w:t>10/</w:t>
-      </w:r>
-      <w:r>
-        <w:rPr>
-          <w:rFonts w:ascii="Aptos Display" w:eastAsia="Times New Roman" w:hAnsi="Aptos Display" w:cs="Times New Roman"/>
-          <w:sz w:val="24"/>
-          <w:szCs w:val="24"/>
-        </w:rPr>
-        <w:t xml:space="preserve">2002 – </w:t>
-      </w:r>
-      <w:r>
-        <w:rPr>
-          <w:rFonts w:ascii="Aptos Display" w:eastAsia="Times New Roman" w:hAnsi="Aptos Display" w:cs="Times New Roman"/>
-          <w:sz w:val="24"/>
-          <w:szCs w:val="24"/>
-        </w:rPr>
-        <w:t>12/</w:t>
-      </w:r>
-      <w:r>
-        <w:rPr>
-          <w:rFonts w:ascii="Aptos Display" w:eastAsia="Times New Roman" w:hAnsi="Aptos Display" w:cs="Times New Roman"/>
-          <w:sz w:val="24"/>
-          <w:szCs w:val="24"/>
-        </w:rPr>
-        <w:t>200</w:t>
-      </w:r>
-      <w:r>
-        <w:rPr>
-          <w:rFonts w:ascii="Aptos Display" w:eastAsia="Times New Roman" w:hAnsi="Aptos Display" w:cs="Times New Roman"/>
-          <w:sz w:val="24"/>
-          <w:szCs w:val="24"/>
-        </w:rPr>
-        <w:t>3</w:t>
-      </w:r>
-    </w:p>
-    <w:p>
-      <w:pPr>
-        <w:pStyle w:val="ListParagraph"/>
-        <w:widowControl/>
-        <w:numPr>
-          <w:ilvl w:val="0"/>
-          <w:numId w:val="27"/>
-        </w:numPr>
-        <w:autoSpaceDE/>
-        <w:autoSpaceDN/>
-        <w:ind w:right="680"/>
-        <w:rPr>
-          <w:rFonts w:ascii="Aptos Display" w:eastAsia="Times New Roman" w:hAnsi="Aptos Display" w:cs="Times New Roman"/>
-          <w:sz w:val="24"/>
-          <w:szCs w:val="24"/>
-        </w:rPr>
-      </w:pPr>
-      <w:r>
-        <w:rPr>
-          <w:rFonts w:ascii="Aptos Display" w:eastAsia="Times New Roman" w:hAnsi="Aptos Display" w:cs="Times New Roman"/>
-          <w:sz w:val="24"/>
-          <w:szCs w:val="24"/>
-        </w:rPr>
-        <w:t>Supported enterprise integration environments, troubleshooting data flow and system communication issues</w:t>
-      </w:r>
-    </w:p>
-    <w:p>
-      <w:pPr>
-        <w:pStyle w:val="ListParagraph"/>
-        <w:widowControl/>
-        <w:numPr>
-          <w:ilvl w:val="0"/>
-          <w:numId w:val="27"/>
-        </w:numPr>
-        <w:autoSpaceDE/>
-        <w:autoSpaceDN/>
-        <w:ind w:right="680"/>
-        <w:rPr>
-          <w:rFonts w:ascii="Aptos Display" w:eastAsia="Times New Roman" w:hAnsi="Aptos Display" w:cs="Times New Roman"/>
-          <w:sz w:val="24"/>
-          <w:szCs w:val="24"/>
-        </w:rPr>
-      </w:pPr>
-      <w:r>
-        <w:rPr>
-          <w:rFonts w:ascii="Aptos Display" w:eastAsia="Times New Roman" w:hAnsi="Aptos Display" w:cs="Times New Roman"/>
-          <w:sz w:val="24"/>
-          <w:szCs w:val="24"/>
-        </w:rPr>
-        <w:t>Maintained and monitored interfaces across distributed systems to ensure reliable data exchange</w:t>
-      </w:r>
-    </w:p>
-    <w:p>
-      <w:pPr>
-        <w:numPr>
-          <w:ilvl w:val="0"/>
-          <w:numId w:val="26"/>
-        </w:numPr>
-        <w:spacing w:after="160"/>
-        <w:rPr>
-          <w:rFonts w:ascii="Aptos Display" w:hAnsi="Aptos Display" w:cs="Times New Roman"/>
-          <w:bCs/>
-          <w:w w:val="105"/>
-          <w:sz w:val="24"/>
-          <w:szCs w:val="24"/>
-        </w:rPr>
-      </w:pPr>
-      <w:r>
-        <w:rPr>
-          <w:rFonts w:ascii="Aptos Display" w:hAnsi="Aptos Display" w:cs="Times New Roman"/>
-          <w:bCs/>
-          <w:w w:val="105"/>
-          <w:sz w:val="24"/>
-          <w:szCs w:val="24"/>
-        </w:rPr>
-        <w:t>Worked within regulated environments requiring stable and secure system operation</w:t>
+          <w:u w:val="single"/>
+        </w:rPr>
+        <w:tab/>
       </w:r>
     </w:p>
     <w:p>
@@ -1775,141 +2034,232 @@
           <w:b/>
           <w:bCs/>
           <w:w w:val="105"/>
+          <w:sz w:val="32"/>
+          <w:szCs w:val="32"/>
+        </w:rPr>
+      </w:pPr>
+      <w:r>
+        <w:rPr>
+          <w:rFonts w:ascii="Aptos Display" w:hAnsi="Aptos Display"/>
+          <w:b/>
+          <w:bCs/>
+          <w:w w:val="105"/>
+          <w:sz w:val="32"/>
+          <w:szCs w:val="32"/>
+        </w:rPr>
+        <w:t>Technical Skills</w:t>
+      </w:r>
+    </w:p>
+    <w:p>
+      <w:pPr>
+        <w:spacing w:before="106"/>
+        <w:ind w:left="360"/>
+        <w:rPr>
+          <w:rFonts w:ascii="Aptos Display" w:hAnsi="Aptos Display"/>
+          <w:b/>
+          <w:w w:val="105"/>
+          <w:sz w:val="24"/>
+          <w:szCs w:val="24"/>
+        </w:rPr>
+      </w:pPr>
+      <w:r>
+        <w:rPr>
+          <w:rFonts w:ascii="Aptos Display" w:hAnsi="Aptos Display"/>
+          <w:b/>
+          <w:bCs/>
+          <w:w w:val="105"/>
           <w:sz w:val="26"/>
           <w:szCs w:val="26"/>
         </w:rPr>
-      </w:pPr>
+        <w:t>Systems &amp; Infrastructure</w:t>
+      </w:r>
       <w:r>
         <w:rPr>
           <w:rFonts w:ascii="Aptos Display" w:hAnsi="Aptos Display"/>
           <w:b/>
+          <w:w w:val="105"/>
+          <w:sz w:val="24"/>
+          <w:szCs w:val="24"/>
+        </w:rPr>
+        <w:br/>
+      </w:r>
+      <w:r>
+        <w:rPr>
+          <w:rFonts w:ascii="Aptos Display" w:hAnsi="Aptos Display" w:cs="Times New Roman"/>
+          <w:bCs/>
+          <w:w w:val="105"/>
+          <w:sz w:val="24"/>
+          <w:szCs w:val="24"/>
+        </w:rPr>
+        <w:t>Windows/Linux environments, system configuration, environment setup</w:t>
+      </w:r>
+    </w:p>
+    <w:p>
+      <w:pPr>
+        <w:spacing w:before="106"/>
+        <w:ind w:left="360"/>
+        <w:rPr>
+          <w:rFonts w:ascii="Aptos Display" w:hAnsi="Aptos Display"/>
+          <w:b/>
+          <w:w w:val="105"/>
+          <w:sz w:val="24"/>
+          <w:szCs w:val="24"/>
+        </w:rPr>
+      </w:pPr>
+      <w:r>
+        <w:rPr>
+          <w:rFonts w:ascii="Aptos Display" w:hAnsi="Aptos Display"/>
+          <w:b/>
           <w:bCs/>
           <w:w w:val="105"/>
           <w:sz w:val="26"/>
           <w:szCs w:val="26"/>
         </w:rPr>
-        <w:lastRenderedPageBreak/>
-        <w:t>Computer Sciences Corporation — Senior Consultant</w:t>
-      </w:r>
-    </w:p>
-    <w:p>
-      <w:pPr>
-        <w:keepNext/>
-        <w:keepLines/>
-        <w:widowControl/>
-        <w:ind w:left="331"/>
+        <w:t>Networking</w:t>
+      </w:r>
+      <w:r>
         <w:rPr>
           <w:rFonts w:ascii="Aptos Display" w:hAnsi="Aptos Display"/>
-          <w:spacing w:val="-4"/>
+          <w:b/>
+          <w:w w:val="105"/>
+          <w:sz w:val="24"/>
+          <w:szCs w:val="24"/>
+        </w:rPr>
+        <w:br/>
+      </w:r>
+      <w:r>
+        <w:rPr>
+          <w:rFonts w:ascii="Aptos Display" w:hAnsi="Aptos Display" w:cs="Times New Roman"/>
+          <w:bCs/>
+          <w:w w:val="105"/>
+          <w:sz w:val="24"/>
+          <w:szCs w:val="24"/>
+        </w:rPr>
+        <w:t>LAN/WAN concepts, connectivity troubleshooting, distributed systems communication</w:t>
+      </w:r>
+    </w:p>
+    <w:p>
+      <w:pPr>
+        <w:spacing w:before="106"/>
+        <w:ind w:left="360"/>
+        <w:rPr>
+          <w:rFonts w:ascii="Aptos Display" w:hAnsi="Aptos Display"/>
+          <w:b/>
+          <w:w w:val="105"/>
+          <w:sz w:val="24"/>
+          <w:szCs w:val="24"/>
+        </w:rPr>
+      </w:pPr>
+      <w:r>
+        <w:rPr>
+          <w:rFonts w:ascii="Aptos Display" w:hAnsi="Aptos Display"/>
+          <w:b/>
+          <w:bCs/>
           <w:w w:val="105"/>
           <w:sz w:val="26"/>
           <w:szCs w:val="26"/>
         </w:rPr>
-      </w:pPr>
+        <w:t>Databases</w:t>
+      </w:r>
       <w:r>
         <w:rPr>
           <w:rFonts w:ascii="Aptos Display" w:hAnsi="Aptos Display"/>
-          <w:spacing w:val="-4"/>
+          <w:b/>
+          <w:w w:val="105"/>
+          <w:sz w:val="24"/>
+          <w:szCs w:val="24"/>
+        </w:rPr>
+        <w:br/>
+      </w:r>
+      <w:r>
+        <w:rPr>
+          <w:rFonts w:ascii="Aptos Display" w:hAnsi="Aptos Display" w:cs="Times New Roman"/>
+          <w:bCs/>
+          <w:w w:val="105"/>
+          <w:sz w:val="24"/>
+          <w:szCs w:val="24"/>
+        </w:rPr>
+        <w:t>SQL Server, PostgreSQL, Azure SQL, database troubleshooting and performance</w:t>
+      </w:r>
+    </w:p>
+    <w:p>
+      <w:pPr>
+        <w:spacing w:before="106"/>
+        <w:ind w:left="360"/>
+        <w:rPr>
+          <w:rFonts w:ascii="Aptos Display" w:hAnsi="Aptos Display"/>
+          <w:b/>
+          <w:w w:val="105"/>
+          <w:sz w:val="24"/>
+          <w:szCs w:val="24"/>
+        </w:rPr>
+      </w:pPr>
+      <w:r>
+        <w:rPr>
+          <w:rFonts w:ascii="Aptos Display" w:hAnsi="Aptos Display"/>
+          <w:b/>
+          <w:bCs/>
           <w:w w:val="105"/>
           <w:sz w:val="26"/>
           <w:szCs w:val="26"/>
         </w:rPr>
-        <w:t xml:space="preserve">Industry / Client Focus: </w:t>
+        <w:t>Cloud Platforms</w:t>
       </w:r>
       <w:r>
         <w:rPr>
           <w:rFonts w:ascii="Aptos Display" w:hAnsi="Aptos Display"/>
-          <w:spacing w:val="-4"/>
+          <w:b/>
+          <w:w w:val="105"/>
+          <w:sz w:val="24"/>
+          <w:szCs w:val="24"/>
+        </w:rPr>
+        <w:br/>
+      </w:r>
+      <w:r>
+        <w:rPr>
+          <w:rFonts w:ascii="Aptos Display" w:hAnsi="Aptos Display" w:cs="Times New Roman"/>
+          <w:bCs/>
+          <w:w w:val="105"/>
+          <w:sz w:val="24"/>
+          <w:szCs w:val="24"/>
+        </w:rPr>
+        <w:t>Azure, AWS, GCP</w:t>
+      </w:r>
+    </w:p>
+    <w:p>
+      <w:pPr>
+        <w:spacing w:before="106"/>
+        <w:ind w:left="360"/>
+        <w:rPr>
+          <w:rFonts w:ascii="Aptos Display" w:hAnsi="Aptos Display"/>
+          <w:b/>
+          <w:w w:val="105"/>
+          <w:sz w:val="24"/>
+          <w:szCs w:val="24"/>
+        </w:rPr>
+      </w:pPr>
+      <w:r>
+        <w:rPr>
+          <w:rFonts w:ascii="Aptos Display" w:hAnsi="Aptos Display"/>
+          <w:b/>
+          <w:bCs/>
           <w:w w:val="105"/>
           <w:sz w:val="26"/>
           <w:szCs w:val="26"/>
         </w:rPr>
-        <w:t>Professional Services</w:t>
-      </w:r>
-    </w:p>
-    <w:p>
-      <w:pPr>
-        <w:keepNext/>
-        <w:keepLines/>
-        <w:widowControl/>
-        <w:autoSpaceDE/>
-        <w:autoSpaceDN/>
-        <w:spacing w:after="160"/>
-        <w:ind w:left="330" w:right="680"/>
-        <w:rPr>
-          <w:rFonts w:ascii="Aptos Display" w:eastAsia="Times New Roman" w:hAnsi="Aptos Display" w:cs="Times New Roman"/>
-          <w:sz w:val="24"/>
-          <w:szCs w:val="24"/>
-        </w:rPr>
-      </w:pPr>
-      <w:r>
-        <w:rPr>
-          <w:rFonts w:ascii="Aptos Display" w:eastAsia="Times New Roman" w:hAnsi="Aptos Display" w:cs="Times New Roman"/>
-          <w:sz w:val="24"/>
-          <w:szCs w:val="24"/>
-        </w:rPr>
-        <w:t>10/</w:t>
-      </w:r>
-      <w:r>
-        <w:rPr>
-          <w:rFonts w:ascii="Aptos Display" w:eastAsia="Times New Roman" w:hAnsi="Aptos Display" w:cs="Times New Roman"/>
-          <w:sz w:val="24"/>
-          <w:szCs w:val="24"/>
-        </w:rPr>
-        <w:t xml:space="preserve">2001 – </w:t>
-      </w:r>
-      <w:r>
-        <w:rPr>
-          <w:rFonts w:ascii="Aptos Display" w:eastAsia="Times New Roman" w:hAnsi="Aptos Display" w:cs="Times New Roman"/>
-          <w:sz w:val="24"/>
-          <w:szCs w:val="24"/>
-        </w:rPr>
-        <w:t>10/</w:t>
-      </w:r>
-      <w:r>
-        <w:rPr>
-          <w:rFonts w:ascii="Aptos Display" w:eastAsia="Times New Roman" w:hAnsi="Aptos Display" w:cs="Times New Roman"/>
-          <w:sz w:val="24"/>
-          <w:szCs w:val="24"/>
-        </w:rPr>
-        <w:t>2002</w:t>
-      </w:r>
-    </w:p>
-    <w:p>
-      <w:pPr>
-        <w:pStyle w:val="ListParagraph"/>
-        <w:keepNext/>
-        <w:keepLines/>
-        <w:widowControl/>
-        <w:numPr>
-          <w:ilvl w:val="0"/>
-          <w:numId w:val="27"/>
-        </w:numPr>
-        <w:autoSpaceDE/>
-        <w:autoSpaceDN/>
-        <w:ind w:right="680"/>
-        <w:rPr>
-          <w:rFonts w:ascii="Aptos Display" w:eastAsia="Times New Roman" w:hAnsi="Aptos Display" w:cs="Times New Roman"/>
-          <w:sz w:val="24"/>
-          <w:szCs w:val="24"/>
-        </w:rPr>
-      </w:pPr>
-      <w:r>
-        <w:rPr>
-          <w:rFonts w:ascii="Aptos Display" w:eastAsia="Times New Roman" w:hAnsi="Aptos Display" w:cs="Times New Roman"/>
-          <w:sz w:val="24"/>
-          <w:szCs w:val="24"/>
-        </w:rPr>
-        <w:t>Supported enterprise integration systems and assisted in resolving system connectivity and data exchange issues</w:t>
-      </w:r>
-    </w:p>
-    <w:p>
-      <w:pPr>
-        <w:numPr>
-          <w:ilvl w:val="0"/>
-          <w:numId w:val="26"/>
-        </w:numPr>
-        <w:spacing w:after="160"/>
+        <w:t>Tools &amp; Platforms</w:t>
+      </w:r>
+      <w:r>
+        <w:rPr>
+          <w:rFonts w:ascii="Aptos Display" w:hAnsi="Aptos Display"/>
+          <w:b/>
+          <w:w w:val="105"/>
+          <w:sz w:val="24"/>
+          <w:szCs w:val="24"/>
+        </w:rPr>
+        <w:br/>
+      </w:r>
+      <w:r>
         <w:rPr>
           <w:rFonts w:ascii="Aptos Display" w:hAnsi="Aptos Display" w:cs="Times New Roman"/>
           <w:bCs/>
@@ -1917,7 +2267,8 @@
           <w:sz w:val="24"/>
           <w:szCs w:val="24"/>
         </w:rPr>
-      </w:pPr>
+        <w:t>Docker,</w:t>
+      </w:r>
       <w:r>
         <w:rPr>
           <w:rFonts w:ascii="Aptos Display" w:hAnsi="Aptos Display" w:cs="Times New Roman"/>
@@ -1926,8 +2277,9 @@
           <w:sz w:val="24"/>
           <w:szCs w:val="24"/>
         </w:rPr>
-        <w:t xml:space="preserve">Developed and maintained </w:t>
-      </w:r>
+        <w:t xml:space="preserve"> </w:t>
+      </w:r>
+      <w:proofErr w:type="spellStart"/>
       <w:r>
         <w:rPr>
           <w:rFonts w:ascii="Aptos Display" w:hAnsi="Aptos Display" w:cs="Times New Roman"/>
@@ -1936,8 +2288,9 @@
           <w:sz w:val="24"/>
           <w:szCs w:val="24"/>
         </w:rPr>
-        <w:t>integration services</w:t>
-      </w:r>
+        <w:t>Portainer</w:t>
+      </w:r>
+      <w:proofErr w:type="spellEnd"/>
       <w:r>
         <w:rPr>
           <w:rFonts w:ascii="Aptos Display" w:hAnsi="Aptos Display" w:cs="Times New Roman"/>
@@ -1946,7 +2299,17 @@
           <w:sz w:val="24"/>
           <w:szCs w:val="24"/>
         </w:rPr>
-        <w:t xml:space="preserve"> components supporting large-scale environments</w:t>
+        <w:t>,</w:t>
+      </w:r>
+      <w:r>
+        <w:rPr>
+          <w:rFonts w:ascii="Aptos Display" w:hAnsi="Aptos Display" w:cs="Times New Roman"/>
+          <w:bCs/>
+          <w:w w:val="105"/>
+          <w:sz w:val="24"/>
+          <w:szCs w:val="24"/>
+        </w:rPr>
+        <w:t xml:space="preserve"> CI/CD pipelines, system monitoring tools</w:t>
       </w:r>
     </w:p>
     <w:p>
@@ -1956,190 +2319,33 @@
         <w:rPr>
           <w:rFonts w:ascii="Aptos Display" w:hAnsi="Aptos Display"/>
           <w:b/>
+          <w:w w:val="105"/>
+          <w:sz w:val="24"/>
+          <w:szCs w:val="24"/>
+        </w:rPr>
+      </w:pPr>
+      <w:r>
+        <w:rPr>
+          <w:rFonts w:ascii="Aptos Display" w:hAnsi="Aptos Display"/>
+          <w:b/>
           <w:bCs/>
           <w:w w:val="105"/>
           <w:sz w:val="26"/>
           <w:szCs w:val="26"/>
         </w:rPr>
-      </w:pPr>
+        <w:t>Programming/Scripting (support-focused use)</w:t>
+      </w:r>
       <w:r>
         <w:rPr>
           <w:rFonts w:ascii="Aptos Display" w:hAnsi="Aptos Display"/>
           <w:b/>
-          <w:bCs/>
-          <w:w w:val="105"/>
-          <w:sz w:val="26"/>
-          <w:szCs w:val="26"/>
-        </w:rPr>
-        <w:t xml:space="preserve">Fluor Corporation — </w:t>
-      </w:r>
-      <w:r>
-        <w:rPr>
-          <w:rFonts w:ascii="Aptos Display" w:hAnsi="Aptos Display"/>
-          <w:b/>
-          <w:bCs/>
-          <w:w w:val="105"/>
-          <w:sz w:val="26"/>
-          <w:szCs w:val="26"/>
-        </w:rPr>
-        <w:t>Enterprise Integration Team Lead</w:t>
-      </w:r>
-    </w:p>
-    <w:p>
-      <w:pPr>
-        <w:ind w:left="331"/>
-        <w:rPr>
-          <w:rFonts w:ascii="Aptos Display" w:hAnsi="Aptos Display"/>
-          <w:spacing w:val="-4"/>
-          <w:w w:val="105"/>
-          <w:sz w:val="26"/>
-          <w:szCs w:val="26"/>
-        </w:rPr>
-      </w:pPr>
-      <w:r>
-        <w:rPr>
-          <w:rFonts w:ascii="Aptos Display" w:hAnsi="Aptos Display"/>
-          <w:spacing w:val="-4"/>
-          <w:w w:val="105"/>
-          <w:sz w:val="26"/>
-          <w:szCs w:val="26"/>
-        </w:rPr>
-        <w:t xml:space="preserve">Industry / Client Focus: </w:t>
-      </w:r>
-      <w:r>
-        <w:rPr>
-          <w:rFonts w:ascii="Aptos Display" w:hAnsi="Aptos Display"/>
-          <w:spacing w:val="-4"/>
-          <w:w w:val="105"/>
-          <w:sz w:val="26"/>
-          <w:szCs w:val="26"/>
-        </w:rPr>
-        <w:t>Engineering, procurement, and construction, large scale projects</w:t>
-      </w:r>
-    </w:p>
-    <w:p>
-      <w:pPr>
-        <w:keepNext/>
-        <w:keepLines/>
-        <w:widowControl/>
-        <w:autoSpaceDE/>
-        <w:autoSpaceDN/>
-        <w:spacing w:after="160"/>
-        <w:ind w:left="330" w:right="680"/>
-        <w:rPr>
-          <w:rFonts w:ascii="Aptos Display" w:eastAsia="Times New Roman" w:hAnsi="Aptos Display" w:cs="Times New Roman"/>
-          <w:sz w:val="24"/>
-          <w:szCs w:val="24"/>
-        </w:rPr>
-      </w:pPr>
-      <w:r>
-        <w:rPr>
-          <w:rFonts w:ascii="Aptos Display" w:eastAsia="Times New Roman" w:hAnsi="Aptos Display" w:cs="Times New Roman"/>
-          <w:sz w:val="24"/>
-          <w:szCs w:val="24"/>
-        </w:rPr>
-        <w:t>01/</w:t>
-      </w:r>
-      <w:r>
-        <w:rPr>
-          <w:rFonts w:ascii="Aptos Display" w:eastAsia="Times New Roman" w:hAnsi="Aptos Display" w:cs="Times New Roman"/>
-          <w:sz w:val="24"/>
-          <w:szCs w:val="24"/>
-        </w:rPr>
-        <w:t xml:space="preserve">1999 – </w:t>
-      </w:r>
-      <w:r>
-        <w:rPr>
-          <w:rFonts w:ascii="Aptos Display" w:eastAsia="Times New Roman" w:hAnsi="Aptos Display" w:cs="Times New Roman"/>
-          <w:sz w:val="24"/>
-          <w:szCs w:val="24"/>
-        </w:rPr>
-        <w:t>10/</w:t>
-      </w:r>
-      <w:r>
-        <w:rPr>
-          <w:rFonts w:ascii="Aptos Display" w:eastAsia="Times New Roman" w:hAnsi="Aptos Display" w:cs="Times New Roman"/>
-          <w:sz w:val="24"/>
-          <w:szCs w:val="24"/>
-        </w:rPr>
-        <w:t>2001</w:t>
-      </w:r>
-    </w:p>
-    <w:p>
-      <w:pPr>
-        <w:pStyle w:val="ListParagraph"/>
-        <w:widowControl/>
-        <w:numPr>
-          <w:ilvl w:val="0"/>
-          <w:numId w:val="27"/>
-        </w:numPr>
-        <w:autoSpaceDE/>
-        <w:autoSpaceDN/>
-        <w:ind w:right="680"/>
-        <w:rPr>
-          <w:rFonts w:ascii="Aptos Display" w:eastAsia="Times New Roman" w:hAnsi="Aptos Display" w:cs="Times New Roman"/>
-          <w:sz w:val="24"/>
-          <w:szCs w:val="24"/>
-        </w:rPr>
-      </w:pPr>
-      <w:r>
-        <w:rPr>
-          <w:rFonts w:ascii="Aptos Display" w:eastAsia="Times New Roman" w:hAnsi="Aptos Display" w:cs="Times New Roman"/>
-          <w:sz w:val="24"/>
-          <w:szCs w:val="24"/>
-        </w:rPr>
-        <w:t xml:space="preserve">Supported </w:t>
-      </w:r>
-      <w:r>
-        <w:rPr>
-          <w:rFonts w:ascii="Aptos Display" w:eastAsia="Times New Roman" w:hAnsi="Aptos Display" w:cs="Times New Roman"/>
-          <w:sz w:val="24"/>
-          <w:szCs w:val="24"/>
-        </w:rPr>
-        <w:t>enterprise messaging and integration</w:t>
-      </w:r>
-      <w:r>
-        <w:rPr>
-          <w:rFonts w:ascii="Aptos Display" w:eastAsia="Times New Roman" w:hAnsi="Aptos Display" w:cs="Times New Roman"/>
-          <w:sz w:val="24"/>
-          <w:szCs w:val="24"/>
-        </w:rPr>
-        <w:t xml:space="preserve"> and integration infrastructure</w:t>
-      </w:r>
-    </w:p>
-    <w:p>
-      <w:pPr>
-        <w:pStyle w:val="ListParagraph"/>
-        <w:widowControl/>
-        <w:numPr>
-          <w:ilvl w:val="0"/>
-          <w:numId w:val="27"/>
-        </w:numPr>
-        <w:autoSpaceDE/>
-        <w:autoSpaceDN/>
-        <w:ind w:right="680"/>
-        <w:rPr>
-          <w:rFonts w:ascii="Aptos Display" w:eastAsia="Times New Roman" w:hAnsi="Aptos Display" w:cs="Times New Roman"/>
-          <w:sz w:val="24"/>
-          <w:szCs w:val="24"/>
-        </w:rPr>
-      </w:pPr>
-      <w:r>
-        <w:rPr>
-          <w:rFonts w:ascii="Aptos Display" w:eastAsia="Times New Roman" w:hAnsi="Aptos Display" w:cs="Times New Roman"/>
-          <w:sz w:val="24"/>
-          <w:szCs w:val="24"/>
-        </w:rPr>
-        <w:t>Conducted troubleshooting and validation of system communication across platforms</w:t>
-      </w:r>
-    </w:p>
-    <w:p>
-      <w:pPr>
-        <w:numPr>
-          <w:ilvl w:val="0"/>
-          <w:numId w:val="26"/>
-        </w:numPr>
-        <w:spacing w:after="160"/>
+          <w:w w:val="105"/>
+          <w:sz w:val="24"/>
+          <w:szCs w:val="24"/>
+        </w:rPr>
+        <w:br/>
+      </w:r>
+      <w:r>
         <w:rPr>
           <w:rFonts w:ascii="Aptos Display" w:hAnsi="Aptos Display" w:cs="Times New Roman"/>
           <w:bCs/>
@@ -2147,436 +2353,11 @@
           <w:sz w:val="24"/>
           <w:szCs w:val="24"/>
         </w:rPr>
-      </w:pPr>
-      <w:r>
-        <w:rPr>
-          <w:rFonts w:ascii="Aptos Display" w:hAnsi="Aptos Display" w:cs="Times New Roman"/>
-          <w:bCs/>
-          <w:w w:val="105"/>
-          <w:sz w:val="24"/>
-          <w:szCs w:val="24"/>
-        </w:rPr>
-        <w:t>Assisted with infrastructure transitions during legacy-to-SAP migrations</w:t>
-      </w:r>
-    </w:p>
-    <w:p>
-      <w:pPr>
-        <w:keepNext/>
-        <w:keepLines/>
-        <w:widowControl/>
-        <w:spacing w:before="106"/>
-        <w:ind w:left="360"/>
-        <w:rPr>
-          <w:rFonts w:ascii="Aptos Display" w:hAnsi="Aptos Display"/>
-          <w:b/>
-          <w:bCs/>
-          <w:w w:val="105"/>
-          <w:sz w:val="26"/>
-          <w:szCs w:val="26"/>
-        </w:rPr>
-      </w:pPr>
-      <w:r>
-        <w:rPr>
-          <w:rFonts w:ascii="Aptos Display" w:hAnsi="Aptos Display"/>
-          <w:b/>
-          <w:bCs/>
-          <w:w w:val="105"/>
-          <w:sz w:val="26"/>
-          <w:szCs w:val="26"/>
-        </w:rPr>
-        <w:t>PM Realty Group — MIS Manager</w:t>
-      </w:r>
-    </w:p>
-    <w:p>
-      <w:pPr>
-        <w:keepNext/>
-        <w:keepLines/>
-        <w:widowControl/>
-        <w:ind w:left="331"/>
-        <w:rPr>
-          <w:rFonts w:ascii="Aptos Display" w:hAnsi="Aptos Display"/>
-          <w:spacing w:val="-4"/>
-          <w:w w:val="105"/>
-          <w:sz w:val="26"/>
-          <w:szCs w:val="26"/>
-        </w:rPr>
-      </w:pPr>
-      <w:r>
-        <w:rPr>
-          <w:rFonts w:ascii="Aptos Display" w:hAnsi="Aptos Display"/>
-          <w:spacing w:val="-4"/>
-          <w:w w:val="105"/>
-          <w:sz w:val="26"/>
-          <w:szCs w:val="26"/>
-        </w:rPr>
-        <w:t xml:space="preserve">Industry / Client Focus: </w:t>
-      </w:r>
-      <w:r>
-        <w:rPr>
-          <w:rFonts w:ascii="Aptos Display" w:hAnsi="Aptos Display"/>
-          <w:spacing w:val="-4"/>
-          <w:w w:val="105"/>
-          <w:sz w:val="26"/>
-          <w:szCs w:val="26"/>
-        </w:rPr>
-        <w:t>Asset management, real estate</w:t>
-      </w:r>
-    </w:p>
-    <w:p>
-      <w:pPr>
-        <w:keepNext/>
-        <w:keepLines/>
-        <w:widowControl/>
-        <w:autoSpaceDE/>
-        <w:autoSpaceDN/>
-        <w:spacing w:after="160"/>
-        <w:ind w:left="330" w:right="680"/>
-        <w:rPr>
-          <w:rFonts w:ascii="Aptos Display" w:eastAsia="Times New Roman" w:hAnsi="Aptos Display" w:cs="Times New Roman"/>
-          <w:sz w:val="24"/>
-          <w:szCs w:val="24"/>
-        </w:rPr>
-      </w:pPr>
-      <w:r>
-        <w:rPr>
-          <w:rFonts w:ascii="Aptos Display" w:eastAsia="Times New Roman" w:hAnsi="Aptos Display" w:cs="Times New Roman"/>
-          <w:sz w:val="24"/>
-          <w:szCs w:val="24"/>
-        </w:rPr>
-        <w:t>01/</w:t>
-      </w:r>
-      <w:r>
-        <w:rPr>
-          <w:rFonts w:ascii="Aptos Display" w:eastAsia="Times New Roman" w:hAnsi="Aptos Display" w:cs="Times New Roman"/>
-          <w:sz w:val="24"/>
-          <w:szCs w:val="24"/>
-        </w:rPr>
-        <w:t xml:space="preserve">1996 – </w:t>
-      </w:r>
-      <w:r>
-        <w:rPr>
-          <w:rFonts w:ascii="Aptos Display" w:eastAsia="Times New Roman" w:hAnsi="Aptos Display" w:cs="Times New Roman"/>
-          <w:sz w:val="24"/>
-          <w:szCs w:val="24"/>
-        </w:rPr>
-        <w:t>01/</w:t>
-      </w:r>
-      <w:r>
-        <w:rPr>
-          <w:rFonts w:ascii="Aptos Display" w:eastAsia="Times New Roman" w:hAnsi="Aptos Display" w:cs="Times New Roman"/>
-          <w:sz w:val="24"/>
-          <w:szCs w:val="24"/>
-        </w:rPr>
-        <w:t>1999</w:t>
-      </w:r>
-    </w:p>
-    <w:p>
-      <w:pPr>
-        <w:pStyle w:val="ListParagraph"/>
-        <w:keepNext/>
-        <w:keepLines/>
-        <w:widowControl/>
-        <w:numPr>
-          <w:ilvl w:val="0"/>
-          <w:numId w:val="27"/>
-        </w:numPr>
-        <w:autoSpaceDE/>
-        <w:autoSpaceDN/>
-        <w:ind w:right="680"/>
-        <w:rPr>
-          <w:rFonts w:ascii="Aptos Display" w:eastAsia="Times New Roman" w:hAnsi="Aptos Display" w:cs="Times New Roman"/>
-          <w:sz w:val="24"/>
-          <w:szCs w:val="24"/>
-        </w:rPr>
-      </w:pPr>
-      <w:r>
-        <w:rPr>
-          <w:rFonts w:ascii="Aptos Display" w:eastAsia="Times New Roman" w:hAnsi="Aptos Display" w:cs="Times New Roman"/>
-          <w:sz w:val="24"/>
-          <w:szCs w:val="24"/>
-        </w:rPr>
-        <w:t xml:space="preserve">Managed IT operations, including </w:t>
-      </w:r>
-      <w:r>
-        <w:rPr>
-          <w:rFonts w:ascii="Aptos Display" w:eastAsia="Times New Roman" w:hAnsi="Aptos Display" w:cs="Times New Roman"/>
-          <w:sz w:val="24"/>
-          <w:szCs w:val="24"/>
-        </w:rPr>
-        <w:t>IT infrastructure</w:t>
-      </w:r>
-      <w:r>
-        <w:rPr>
-          <w:rFonts w:ascii="Aptos Display" w:eastAsia="Times New Roman" w:hAnsi="Aptos Display" w:cs="Times New Roman"/>
-          <w:sz w:val="24"/>
-          <w:szCs w:val="24"/>
-        </w:rPr>
-        <w:t>, system connectivity, and user support</w:t>
-      </w:r>
-    </w:p>
-    <w:p>
-      <w:pPr>
-        <w:pStyle w:val="ListParagraph"/>
-        <w:widowControl/>
-        <w:numPr>
-          <w:ilvl w:val="0"/>
-          <w:numId w:val="27"/>
-        </w:numPr>
-        <w:autoSpaceDE/>
-        <w:autoSpaceDN/>
-        <w:ind w:right="680"/>
-        <w:rPr>
-          <w:rFonts w:ascii="Aptos Display" w:eastAsia="Times New Roman" w:hAnsi="Aptos Display" w:cs="Times New Roman"/>
-          <w:sz w:val="24"/>
-          <w:szCs w:val="24"/>
-        </w:rPr>
-      </w:pPr>
-      <w:r>
-        <w:rPr>
-          <w:rFonts w:ascii="Aptos Display" w:eastAsia="Times New Roman" w:hAnsi="Aptos Display" w:cs="Times New Roman"/>
-          <w:sz w:val="24"/>
-          <w:szCs w:val="24"/>
-        </w:rPr>
-        <w:t>Led LAN/WAN upgrades and ensured reliable communication across office locations</w:t>
-      </w:r>
-    </w:p>
-    <w:p>
-      <w:pPr>
-        <w:numPr>
-          <w:ilvl w:val="0"/>
-          <w:numId w:val="26"/>
-        </w:numPr>
-        <w:spacing w:after="160"/>
-        <w:rPr>
-          <w:rFonts w:ascii="Aptos Display" w:hAnsi="Aptos Display" w:cs="Times New Roman"/>
-          <w:bCs/>
-          <w:w w:val="105"/>
-          <w:sz w:val="24"/>
-          <w:szCs w:val="24"/>
-        </w:rPr>
-      </w:pPr>
-      <w:r>
-        <w:rPr>
-          <w:rFonts w:ascii="Aptos Display" w:hAnsi="Aptos Display" w:cs="Times New Roman"/>
-          <w:bCs/>
-          <w:w w:val="105"/>
-          <w:sz w:val="24"/>
-          <w:szCs w:val="24"/>
-        </w:rPr>
-        <w:t>Supported business-critical systems and provided hands-on technical troubleshooting</w:t>
-      </w:r>
-    </w:p>
-    <w:p>
-      <w:pPr>
-        <w:spacing w:before="106"/>
-        <w:ind w:left="360"/>
-        <w:rPr>
-          <w:rFonts w:ascii="Aptos Display" w:hAnsi="Aptos Display"/>
-          <w:b/>
-          <w:bCs/>
-          <w:w w:val="105"/>
-          <w:sz w:val="26"/>
-          <w:szCs w:val="26"/>
-        </w:rPr>
-      </w:pPr>
-      <w:r>
-        <w:rPr>
-          <w:rFonts w:ascii="Aptos Display" w:hAnsi="Aptos Display"/>
-          <w:b/>
-          <w:bCs/>
-          <w:w w:val="105"/>
-          <w:sz w:val="26"/>
-          <w:szCs w:val="26"/>
-        </w:rPr>
-        <w:t>Access Development Corp — System Administrator / Programmer</w:t>
-      </w:r>
-    </w:p>
-    <w:p>
-      <w:pPr>
-        <w:ind w:left="331"/>
-        <w:rPr>
-          <w:rFonts w:ascii="Aptos Display" w:hAnsi="Aptos Display"/>
-          <w:spacing w:val="-4"/>
-          <w:w w:val="105"/>
-          <w:sz w:val="26"/>
-          <w:szCs w:val="26"/>
-        </w:rPr>
-      </w:pPr>
-      <w:r>
-        <w:rPr>
-          <w:rFonts w:ascii="Aptos Display" w:hAnsi="Aptos Display"/>
-          <w:spacing w:val="-4"/>
-          <w:w w:val="105"/>
-          <w:sz w:val="26"/>
-          <w:szCs w:val="26"/>
-        </w:rPr>
-        <w:t xml:space="preserve">Industry / Client Focus: </w:t>
-      </w:r>
-      <w:r>
-        <w:rPr>
-          <w:rFonts w:ascii="Aptos Display" w:hAnsi="Aptos Display"/>
-          <w:spacing w:val="-4"/>
-          <w:w w:val="105"/>
-          <w:sz w:val="26"/>
-          <w:szCs w:val="26"/>
-        </w:rPr>
-        <w:t>Travel and merchandise discount platform</w:t>
-      </w:r>
-    </w:p>
-    <w:p>
-      <w:pPr>
-        <w:widowControl/>
-        <w:autoSpaceDE/>
-        <w:autoSpaceDN/>
-        <w:spacing w:after="160"/>
-        <w:ind w:left="330" w:right="680"/>
-        <w:rPr>
-          <w:rFonts w:ascii="Aptos Display" w:eastAsia="Times New Roman" w:hAnsi="Aptos Display" w:cs="Times New Roman"/>
-          <w:sz w:val="24"/>
-          <w:szCs w:val="24"/>
-        </w:rPr>
-      </w:pPr>
-      <w:r>
-        <w:rPr>
-          <w:rFonts w:ascii="Aptos Display" w:eastAsia="Times New Roman" w:hAnsi="Aptos Display" w:cs="Times New Roman"/>
-          <w:sz w:val="24"/>
-          <w:szCs w:val="24"/>
-        </w:rPr>
-        <w:t>05/</w:t>
-      </w:r>
-      <w:r>
-        <w:rPr>
-          <w:rFonts w:ascii="Aptos Display" w:eastAsia="Times New Roman" w:hAnsi="Aptos Display" w:cs="Times New Roman"/>
-          <w:sz w:val="24"/>
-          <w:szCs w:val="24"/>
-        </w:rPr>
-        <w:t xml:space="preserve">1986 – </w:t>
-      </w:r>
-      <w:r>
-        <w:rPr>
-          <w:rFonts w:ascii="Aptos Display" w:eastAsia="Times New Roman" w:hAnsi="Aptos Display" w:cs="Times New Roman"/>
-          <w:sz w:val="24"/>
-          <w:szCs w:val="24"/>
-        </w:rPr>
-        <w:t>01/</w:t>
-      </w:r>
-      <w:r>
-        <w:rPr>
-          <w:rFonts w:ascii="Aptos Display" w:eastAsia="Times New Roman" w:hAnsi="Aptos Display" w:cs="Times New Roman"/>
-          <w:sz w:val="24"/>
-          <w:szCs w:val="24"/>
-        </w:rPr>
-        <w:t>1996</w:t>
-      </w:r>
-    </w:p>
-    <w:p>
-      <w:pPr>
-        <w:pStyle w:val="ListParagraph"/>
-        <w:widowControl/>
-        <w:numPr>
-          <w:ilvl w:val="0"/>
-          <w:numId w:val="27"/>
-        </w:numPr>
-        <w:autoSpaceDE/>
-        <w:autoSpaceDN/>
-        <w:ind w:right="680"/>
-        <w:rPr>
-          <w:rFonts w:ascii="Aptos Display" w:eastAsia="Times New Roman" w:hAnsi="Aptos Display" w:cs="Times New Roman"/>
-          <w:sz w:val="24"/>
-          <w:szCs w:val="24"/>
-        </w:rPr>
-      </w:pPr>
-      <w:r>
-        <w:rPr>
-          <w:rFonts w:ascii="Aptos Display" w:eastAsia="Times New Roman" w:hAnsi="Aptos Display" w:cs="Times New Roman"/>
-          <w:sz w:val="24"/>
-          <w:szCs w:val="24"/>
-        </w:rPr>
-        <w:t xml:space="preserve">Administered </w:t>
-      </w:r>
-      <w:r>
-        <w:rPr>
-          <w:rFonts w:ascii="Aptos Display" w:eastAsia="Times New Roman" w:hAnsi="Aptos Display" w:cs="Times New Roman"/>
-          <w:sz w:val="24"/>
-          <w:szCs w:val="24"/>
-        </w:rPr>
-        <w:t>Client/server and LAN-based systems</w:t>
-      </w:r>
-      <w:r>
-        <w:rPr>
-          <w:rFonts w:ascii="Aptos Display" w:eastAsia="Times New Roman" w:hAnsi="Aptos Display" w:cs="Times New Roman"/>
-          <w:sz w:val="24"/>
-          <w:szCs w:val="24"/>
-        </w:rPr>
-        <w:t xml:space="preserve"> and supported internal users with hardware and software issues</w:t>
-      </w:r>
-    </w:p>
-    <w:p>
-      <w:pPr>
-        <w:pStyle w:val="ListParagraph"/>
-        <w:widowControl/>
-        <w:numPr>
-          <w:ilvl w:val="0"/>
-          <w:numId w:val="27"/>
-        </w:numPr>
-        <w:autoSpaceDE/>
-        <w:autoSpaceDN/>
-        <w:ind w:right="680"/>
-        <w:rPr>
-          <w:rFonts w:ascii="Aptos Display" w:eastAsia="Times New Roman" w:hAnsi="Aptos Display" w:cs="Times New Roman"/>
-          <w:sz w:val="24"/>
-          <w:szCs w:val="24"/>
-        </w:rPr>
-      </w:pPr>
-      <w:r>
-        <w:rPr>
-          <w:rFonts w:ascii="Aptos Display" w:eastAsia="Times New Roman" w:hAnsi="Aptos Display" w:cs="Times New Roman"/>
-          <w:sz w:val="24"/>
-          <w:szCs w:val="24"/>
-        </w:rPr>
-        <w:t>Installed, configured, and maintained business applications and system environments</w:t>
-      </w:r>
-    </w:p>
-    <w:p>
-      <w:pPr>
-        <w:numPr>
-          <w:ilvl w:val="0"/>
-          <w:numId w:val="26"/>
-        </w:numPr>
-        <w:spacing w:after="160"/>
-        <w:rPr>
-          <w:rFonts w:ascii="Aptos Display" w:hAnsi="Aptos Display" w:cs="Times New Roman"/>
-          <w:bCs/>
-          <w:w w:val="105"/>
-          <w:sz w:val="24"/>
-          <w:szCs w:val="24"/>
-        </w:rPr>
-      </w:pPr>
-      <w:r>
-        <w:rPr>
-          <w:rFonts w:ascii="Aptos Display" w:hAnsi="Aptos Display" w:cs="Times New Roman"/>
-          <w:bCs/>
-          <w:w w:val="105"/>
-          <w:sz w:val="24"/>
-          <w:szCs w:val="24"/>
-        </w:rPr>
-        <w:t xml:space="preserve">Migrated systems from legacy platforms to </w:t>
-      </w:r>
-      <w:r>
-        <w:rPr>
-          <w:rFonts w:ascii="Aptos Display" w:hAnsi="Aptos Display" w:cs="Times New Roman"/>
-          <w:bCs/>
-          <w:w w:val="105"/>
-          <w:sz w:val="24"/>
-          <w:szCs w:val="24"/>
-        </w:rPr>
-        <w:t>client/server and LAN-based systems</w:t>
-      </w:r>
-    </w:p>
-    <w:p>
-      <w:pPr>
-        <w:keepNext/>
-        <w:keepLines/>
+        <w:t>C#, Bash, PowerShell, SQL</w:t>
+      </w:r>
+    </w:p>
+    <w:p>
+      <w:pPr>
         <w:widowControl/>
         <w:tabs>
           <w:tab w:val="right" w:pos="10080"/>
@@ -2602,9 +2383,6 @@
     </w:p>
     <w:p>
       <w:pPr>
-        <w:keepNext/>
-        <w:keepLines/>
-        <w:widowControl/>
         <w:spacing w:before="106"/>
         <w:ind w:left="360"/>
         <w:rPr>
@@ -2625,7 +2403,7 @@
           <w:sz w:val="32"/>
           <w:szCs w:val="32"/>
         </w:rPr>
-        <w:t>Technical Skills</w:t>
+        <w:t>Education</w:t>
       </w:r>
     </w:p>
     <w:p>
@@ -2644,12 +2422,11 @@
         <w:rPr>
           <w:rFonts w:ascii="Aptos Display" w:hAnsi="Aptos Display"/>
           <w:b/>
-          <w:bCs/>
-          <w:w w:val="105"/>
-          <w:sz w:val="26"/>
-          <w:szCs w:val="26"/>
-        </w:rPr>
-        <w:t>Systems &amp; Infrastructure</w:t>
+          <w:w w:val="105"/>
+          <w:sz w:val="24"/>
+          <w:szCs w:val="24"/>
+        </w:rPr>
+        <w:t>Brigham Young University — Computer Science</w:t>
       </w:r>
       <w:r>
         <w:rPr>
@@ -2660,16 +2437,7 @@
           <w:szCs w:val="24"/>
         </w:rPr>
         <w:br/>
-      </w:r>
-      <w:r>
-        <w:rPr>
-          <w:rFonts w:ascii="Aptos Display" w:hAnsi="Aptos Display" w:cs="Times New Roman"/>
-          <w:bCs/>
-          <w:w w:val="105"/>
-          <w:sz w:val="24"/>
-          <w:szCs w:val="24"/>
-        </w:rPr>
-        <w:t>Windows/Linux environments, system configuration, environment setup</w:t>
+        <w:t>1985 – 1986</w:t>
       </w:r>
     </w:p>
     <w:p>
@@ -2684,356 +2452,9 @@
           <w:szCs w:val="24"/>
         </w:rPr>
       </w:pPr>
-      <w:r>
-        <w:rPr>
-          <w:rFonts w:ascii="Aptos Display" w:hAnsi="Aptos Display"/>
-          <w:b/>
-          <w:bCs/>
-          <w:w w:val="105"/>
-          <w:sz w:val="26"/>
-          <w:szCs w:val="26"/>
-        </w:rPr>
-        <w:t>Networking</w:t>
-      </w:r>
-      <w:r>
-        <w:rPr>
-          <w:rFonts w:ascii="Aptos Display" w:hAnsi="Aptos Display"/>
-          <w:b/>
-          <w:w w:val="105"/>
-          <w:sz w:val="24"/>
-          <w:szCs w:val="24"/>
-        </w:rPr>
-        <w:br/>
-      </w:r>
-      <w:r>
-        <w:rPr>
-          <w:rFonts w:ascii="Aptos Display" w:hAnsi="Aptos Display" w:cs="Times New Roman"/>
-          <w:bCs/>
-          <w:w w:val="105"/>
-          <w:sz w:val="24"/>
-          <w:szCs w:val="24"/>
-        </w:rPr>
-        <w:t>LAN/WAN concepts, connectivity troubleshooting, distributed systems communication</w:t>
-      </w:r>
-    </w:p>
-    <w:p>
-      <w:pPr>
-        <w:spacing w:before="106"/>
-        <w:ind w:left="360"/>
-        <w:rPr>
-          <w:rFonts w:ascii="Aptos Display" w:hAnsi="Aptos Display"/>
-          <w:b/>
-          <w:w w:val="105"/>
-          <w:sz w:val="24"/>
-          <w:szCs w:val="24"/>
-        </w:rPr>
-      </w:pPr>
-      <w:r>
-        <w:rPr>
-          <w:rFonts w:ascii="Aptos Display" w:hAnsi="Aptos Display"/>
-          <w:b/>
-          <w:bCs/>
-          <w:w w:val="105"/>
-          <w:sz w:val="26"/>
-          <w:szCs w:val="26"/>
-        </w:rPr>
-        <w:t>Databases</w:t>
-      </w:r>
-      <w:r>
-        <w:rPr>
-          <w:rFonts w:ascii="Aptos Display" w:hAnsi="Aptos Display"/>
-          <w:b/>
-          <w:w w:val="105"/>
-          <w:sz w:val="24"/>
-          <w:szCs w:val="24"/>
-        </w:rPr>
-        <w:br/>
-      </w:r>
-      <w:r>
-        <w:rPr>
-          <w:rFonts w:ascii="Aptos Display" w:hAnsi="Aptos Display" w:cs="Times New Roman"/>
-          <w:bCs/>
-          <w:w w:val="105"/>
-          <w:sz w:val="24"/>
-          <w:szCs w:val="24"/>
-        </w:rPr>
-        <w:t>SQL Server, PostgreSQL, Azure SQL, database troubleshooting and performance</w:t>
-      </w:r>
-    </w:p>
-    <w:p>
-      <w:pPr>
-        <w:spacing w:before="106"/>
-        <w:ind w:left="360"/>
-        <w:rPr>
-          <w:rFonts w:ascii="Aptos Display" w:hAnsi="Aptos Display"/>
-          <w:b/>
-          <w:w w:val="105"/>
-          <w:sz w:val="24"/>
-          <w:szCs w:val="24"/>
-        </w:rPr>
-      </w:pPr>
-      <w:r>
-        <w:rPr>
-          <w:rFonts w:ascii="Aptos Display" w:hAnsi="Aptos Display"/>
-          <w:b/>
-          <w:bCs/>
-          <w:w w:val="105"/>
-          <w:sz w:val="26"/>
-          <w:szCs w:val="26"/>
-        </w:rPr>
-        <w:t>Cloud Platforms</w:t>
-      </w:r>
-      <w:r>
-        <w:rPr>
-          <w:rFonts w:ascii="Aptos Display" w:hAnsi="Aptos Display"/>
-          <w:b/>
-          <w:w w:val="105"/>
-          <w:sz w:val="24"/>
-          <w:szCs w:val="24"/>
-        </w:rPr>
-        <w:br/>
-      </w:r>
-      <w:r>
-        <w:rPr>
-          <w:rFonts w:ascii="Aptos Display" w:hAnsi="Aptos Display" w:cs="Times New Roman"/>
-          <w:bCs/>
-          <w:w w:val="105"/>
-          <w:sz w:val="24"/>
-          <w:szCs w:val="24"/>
-        </w:rPr>
-        <w:t>Azure, AWS, GCP</w:t>
-      </w:r>
-    </w:p>
-    <w:p>
-      <w:pPr>
-        <w:spacing w:before="106"/>
-        <w:ind w:left="360"/>
-        <w:rPr>
-          <w:rFonts w:ascii="Aptos Display" w:hAnsi="Aptos Display"/>
-          <w:b/>
-          <w:w w:val="105"/>
-          <w:sz w:val="24"/>
-          <w:szCs w:val="24"/>
-        </w:rPr>
-      </w:pPr>
-      <w:r>
-        <w:rPr>
-          <w:rFonts w:ascii="Aptos Display" w:hAnsi="Aptos Display"/>
-          <w:b/>
-          <w:bCs/>
-          <w:w w:val="105"/>
-          <w:sz w:val="26"/>
-          <w:szCs w:val="26"/>
-        </w:rPr>
-        <w:t>Tools &amp; Platforms</w:t>
-      </w:r>
-      <w:r>
-        <w:rPr>
-          <w:rFonts w:ascii="Aptos Display" w:hAnsi="Aptos Display"/>
-          <w:b/>
-          <w:w w:val="105"/>
-          <w:sz w:val="24"/>
-          <w:szCs w:val="24"/>
-        </w:rPr>
-        <w:br/>
-      </w:r>
-      <w:r>
-        <w:rPr>
-          <w:rFonts w:ascii="Aptos Display" w:hAnsi="Aptos Display" w:cs="Times New Roman"/>
-          <w:bCs/>
-          <w:w w:val="105"/>
-          <w:sz w:val="24"/>
-          <w:szCs w:val="24"/>
-        </w:rPr>
-        <w:t>Docker,</w:t>
-      </w:r>
-      <w:r>
-        <w:rPr>
-          <w:rFonts w:ascii="Aptos Display" w:hAnsi="Aptos Display" w:cs="Times New Roman"/>
-          <w:bCs/>
-          <w:w w:val="105"/>
-          <w:sz w:val="24"/>
-          <w:szCs w:val="24"/>
-        </w:rPr>
-        <w:t xml:space="preserve"> </w:t>
-      </w:r>
-      <w:proofErr w:type="spellStart"/>
-      <w:r>
-        <w:rPr>
-          <w:rFonts w:ascii="Aptos Display" w:hAnsi="Aptos Display" w:cs="Times New Roman"/>
-          <w:bCs/>
-          <w:w w:val="105"/>
-          <w:sz w:val="24"/>
-          <w:szCs w:val="24"/>
-        </w:rPr>
-        <w:t>Portainer</w:t>
-      </w:r>
-      <w:proofErr w:type="spellEnd"/>
-      <w:r>
-        <w:rPr>
-          <w:rFonts w:ascii="Aptos Display" w:hAnsi="Aptos Display" w:cs="Times New Roman"/>
-          <w:bCs/>
-          <w:w w:val="105"/>
-          <w:sz w:val="24"/>
-          <w:szCs w:val="24"/>
-        </w:rPr>
-        <w:t>,</w:t>
-      </w:r>
-      <w:r>
-        <w:rPr>
-          <w:rFonts w:ascii="Aptos Display" w:hAnsi="Aptos Display" w:cs="Times New Roman"/>
-          <w:bCs/>
-          <w:w w:val="105"/>
-          <w:sz w:val="24"/>
-          <w:szCs w:val="24"/>
-        </w:rPr>
-        <w:t xml:space="preserve"> CI/CD pipelines, system monitoring tools</w:t>
-      </w:r>
-    </w:p>
-    <w:p>
-      <w:pPr>
-        <w:spacing w:before="106"/>
-        <w:ind w:left="360"/>
-        <w:rPr>
-          <w:rFonts w:ascii="Aptos Display" w:hAnsi="Aptos Display"/>
-          <w:b/>
-          <w:w w:val="105"/>
-          <w:sz w:val="24"/>
-          <w:szCs w:val="24"/>
-        </w:rPr>
-      </w:pPr>
-      <w:r>
-        <w:rPr>
-          <w:rFonts w:ascii="Aptos Display" w:hAnsi="Aptos Display"/>
-          <w:b/>
-          <w:bCs/>
-          <w:w w:val="105"/>
-          <w:sz w:val="26"/>
-          <w:szCs w:val="26"/>
-        </w:rPr>
-        <w:lastRenderedPageBreak/>
-        <w:t>Programming/Scripting (support-focused use)</w:t>
-      </w:r>
-      <w:r>
-        <w:rPr>
-          <w:rFonts w:ascii="Aptos Display" w:hAnsi="Aptos Display"/>
-          <w:b/>
-          <w:w w:val="105"/>
-          <w:sz w:val="24"/>
-          <w:szCs w:val="24"/>
-        </w:rPr>
-        <w:br/>
-      </w:r>
-      <w:r>
-        <w:rPr>
-          <w:rFonts w:ascii="Aptos Display" w:hAnsi="Aptos Display" w:cs="Times New Roman"/>
-          <w:bCs/>
-          <w:w w:val="105"/>
-          <w:sz w:val="24"/>
-          <w:szCs w:val="24"/>
-        </w:rPr>
-        <w:t>C#, Bash, PowerShell, SQL</w:t>
-      </w:r>
-    </w:p>
-    <w:p>
-      <w:pPr>
-        <w:widowControl/>
-        <w:tabs>
-          <w:tab w:val="right" w:pos="10080"/>
-        </w:tabs>
-        <w:autoSpaceDE/>
-        <w:autoSpaceDN/>
-        <w:ind w:left="330" w:right="680"/>
-        <w:rPr>
-          <w:rFonts w:ascii="Aptos Display" w:eastAsia="Times New Roman" w:hAnsi="Aptos Display" w:cs="Times New Roman"/>
-          <w:sz w:val="24"/>
-          <w:szCs w:val="24"/>
-        </w:rPr>
-      </w:pPr>
-      <w:r>
-        <w:rPr>
-          <w:rFonts w:ascii="Aptos Display" w:eastAsia="Times New Roman" w:hAnsi="Aptos Display" w:cs="Times New Roman"/>
-          <w:sz w:val="24"/>
-          <w:szCs w:val="24"/>
-          <w:u w:val="single"/>
-        </w:rPr>
-        <w:tab/>
-      </w:r>
-    </w:p>
-    <w:p>
-      <w:pPr>
-        <w:spacing w:before="106"/>
-        <w:ind w:left="360"/>
-        <w:rPr>
-          <w:rFonts w:ascii="Aptos Display" w:hAnsi="Aptos Display"/>
-          <w:b/>
-          <w:bCs/>
-          <w:w w:val="105"/>
-          <w:sz w:val="32"/>
-          <w:szCs w:val="32"/>
-        </w:rPr>
-      </w:pPr>
-      <w:r>
-        <w:rPr>
-          <w:rFonts w:ascii="Aptos Display" w:hAnsi="Aptos Display"/>
-          <w:b/>
-          <w:bCs/>
-          <w:w w:val="105"/>
-          <w:sz w:val="32"/>
-          <w:szCs w:val="32"/>
-        </w:rPr>
-        <w:t>Education</w:t>
-      </w:r>
-    </w:p>
-    <w:p>
-      <w:pPr>
-        <w:spacing w:before="106"/>
-        <w:ind w:left="360"/>
-        <w:rPr>
-          <w:rFonts w:ascii="Aptos Display" w:hAnsi="Aptos Display"/>
-          <w:b/>
-          <w:w w:val="105"/>
-          <w:sz w:val="24"/>
-          <w:szCs w:val="24"/>
-        </w:rPr>
-      </w:pPr>
-      <w:r>
-        <w:rPr>
-          <w:rFonts w:ascii="Aptos Display" w:hAnsi="Aptos Display"/>
-          <w:b/>
-          <w:w w:val="105"/>
-          <w:sz w:val="24"/>
-          <w:szCs w:val="24"/>
-        </w:rPr>
-        <w:t>Brigham Young University — Computer Science</w:t>
-      </w:r>
-      <w:r>
-        <w:rPr>
-          <w:rFonts w:ascii="Aptos Display" w:hAnsi="Aptos Display"/>
-          <w:b/>
-          <w:w w:val="105"/>
-          <w:sz w:val="24"/>
-          <w:szCs w:val="24"/>
-        </w:rPr>
-        <w:br/>
-        <w:t>1985 – 1986</w:t>
-      </w:r>
-    </w:p>
-    <w:p>
-      <w:pPr>
-        <w:spacing w:before="106"/>
-        <w:ind w:left="360"/>
-        <w:rPr>
-          <w:rFonts w:ascii="Aptos Display" w:hAnsi="Aptos Display"/>
-          <w:b/>
-          <w:w w:val="105"/>
-          <w:sz w:val="24"/>
-          <w:szCs w:val="24"/>
-        </w:rPr>
-      </w:pPr>
     </w:p>
     <w:sectPr>
-      <w:footerReference w:type="default" r:id="rId10"/>
+      <w:footerReference w:type="default" r:id="rId9"/>
       <w:type w:val="continuous"/>
       <w:pgSz w:w="12240" w:h="15840"/>
       <w:pgMar w:top="980" w:right="720" w:bottom="700" w:left="720" w:header="0" w:footer="507" w:gutter="0"/>
@@ -3066,286 +2487,151 @@
 <w:ftr xmlns:wpc="http://schemas.microsoft.com/office/word/2010/wordprocessingCanvas" xmlns:cx="http://schemas.microsoft.com/office/drawing/2014/chartex" xmlns:cx1="http://schemas.microsoft.com/office/drawing/2015/9/8/chartex" xmlns:cx2="http://schemas.microsoft.com/office/drawing/2015/10/21/chartex" xmlns:cx3="http://schemas.microsoft.com/office/drawing/2016/5/9/chartex" xmlns:cx4="http://schemas.microsoft.com/office/drawing/2016/5/10/chartex" xmlns:cx5="http://schemas.microsoft.com/office/drawing/2016/5/11/chartex" xmlns:cx6="http://schemas.microsoft.com/office/drawing/2016/5/12/chartex" xmlns:cx7="http://schemas.microsoft.com/office/drawing/2016/5/13/chartex" xmlns:cx8="http://schemas.microsoft.com/office/drawing/2016/5/14/chartex" xmlns:mc="http://schemas.openxmlformats.org/markup-compatibility/2006" xmlns:aink="http://schemas.microsoft.com/office/drawing/2016/ink" xmlns:am3d="http://schemas.microsoft.com/office/drawing/2017/model3d" xmlns:o="urn:schemas-microsoft-com:office:office" xmlns:oel="http://schemas.microsoft.com/office/2019/extlst" xmlns:r="http://schemas.openxmlformats.org/officeDocument/2006/relationships" xmlns:m="http://schemas.openxmlformats.org/officeDocument/2006/math" xmlns:v="urn:schemas-microsoft-com:vml" xmlns:wp14="http://schemas.microsoft.com/office/word/2010/wordprocessingDrawing" xmlns:wp="http://schemas.openxmlformats.org/drawingml/2006/wordprocessingDrawing" xmlns:w10="urn:schemas-microsoft-com:office:word" xmlns:w="http://schemas.openxmlformats.org/wordprocessingml/2006/main" xmlns:w14="http://schemas.microsoft.com/office/word/2010/wordml" xmlns:w15="http://schemas.microsoft.com/office/word/2012/wordml" xmlns:w16cex="http://schemas.microsoft.com/office/word/2018/wordml/cex" xmlns:w16cid="http://schemas.microsoft.com/office/word/2016/wordml/cid" xmlns:w16="http://schemas.microsoft.com/office/word/2018/wordml" xmlns:w16du="http://schemas.microsoft.com/office/word/2023/wordml/word16du" xmlns:w16sdtdh="http://schemas.microsoft.com/office/word/2020/wordml/sdtdatahash" xmlns:w16sdtfl="http://schemas.microsoft.com/office/word/2024/wordml/sdtformatlock" xmlns:w16se="http://schemas.microsoft.com/office/word/2015/wordml/symex" xmlns:wpg="http://schemas.microsoft.com/office/word/2010/wordprocessingGroup" xmlns:wpi="http://schemas.microsoft.com/office/word/2010/wordprocessingInk" xmlns:wne="http://schemas.microsoft.com/office/word/2006/wordml" xmlns:wps="http://schemas.microsoft.com/office/word/2010/wordprocessingShape" mc:Ignorable="w14 w15 w16se w16cid w16 w16cex w16sdtdh w16sdtfl w16du wp14">
   <w:p>
     <w:pPr>
-      <w:pStyle w:val="Footer"/>
-      <w:pBdr>
-        <w:bottom w:val="single" w:sz="6" w:space="1" w:color="auto"/>
-      </w:pBdr>
-      <w:tabs>
-        <w:tab w:val="clear" w:pos="4680"/>
-        <w:tab w:val="clear" w:pos="9360"/>
-        <w:tab w:val="right" w:pos="10560"/>
-      </w:tabs>
-      <w:rPr>
-        <w:rFonts w:ascii="Aptos Display" w:hAnsi="Aptos Display"/>
-      </w:rPr>
-    </w:pPr>
-  </w:p>
-  <w:p>
-    <w:pPr>
-      <w:tabs>
-        <w:tab w:val="right" w:pos="10800"/>
-      </w:tabs>
-      <w:spacing w:before="106"/>
-      <w:ind w:left="360"/>
-      <w:rPr>
-        <w:rFonts w:ascii="Aptos Display" w:hAnsi="Aptos Display"/>
-        <w:bCs/>
-        <w:w w:val="105"/>
-        <w:sz w:val="20"/>
-        <w:szCs w:val="20"/>
-      </w:rPr>
+      <w:pStyle w:val="BodyText"/>
+      <w:spacing w:line="14" w:lineRule="auto"/>
+      <w:ind w:left="0"/>
     </w:pPr>
     <w:r>
       <w:rPr>
-        <w:rFonts w:ascii="Aptos Display" w:hAnsi="Aptos Display"/>
-        <w:bCs/>
-        <w:w w:val="105"/>
-        <w:sz w:val="20"/>
-        <w:szCs w:val="20"/>
-      </w:rPr>
-      <w:t xml:space="preserve">Long Beach, CA • </w:t>
+        <w:noProof/>
+      </w:rPr>
+      <mc:AlternateContent>
+        <mc:Choice Requires="wps">
+          <w:drawing>
+            <wp:anchor distT="0" distB="0" distL="0" distR="0" simplePos="0" relativeHeight="251658240" behindDoc="1" locked="0" layoutInCell="1" allowOverlap="1" wp14:anchorId="60F405D1" wp14:editId="0C900D7A">
+              <wp:simplePos x="0" y="0"/>
+              <wp:positionH relativeFrom="page">
+                <wp:posOffset>3816464</wp:posOffset>
+              </wp:positionH>
+              <wp:positionV relativeFrom="page">
+                <wp:posOffset>9596878</wp:posOffset>
+              </wp:positionV>
+              <wp:extent cx="152400" cy="205104"/>
+              <wp:effectExtent l="0" t="0" r="0" b="0"/>
+              <wp:wrapNone/>
+              <wp:docPr id="1" name="Textbox 1"/>
+              <wp:cNvGraphicFramePr>
+                <a:graphicFrameLocks xmlns:a="http://schemas.openxmlformats.org/drawingml/2006/main"/>
+              </wp:cNvGraphicFramePr>
+              <a:graphic xmlns:a="http://schemas.openxmlformats.org/drawingml/2006/main">
+                <a:graphicData uri="http://schemas.microsoft.com/office/word/2010/wordprocessingShape">
+                  <wps:wsp>
+                    <wps:cNvSpPr txBox="1">
+                      <a:spLocks/>
+                    </wps:cNvSpPr>
+                    <wps:spPr>
+                      <a:xfrm>
+                        <a:off x="0" y="0"/>
+                        <a:ext cx="152400" cy="205104"/>
+                      </a:xfrm>
+                      <a:prstGeom prst="rect">
+                        <a:avLst/>
+                      </a:prstGeom>
+                    </wps:spPr>
+                    <wps:txbx>
+                      <w:txbxContent>
+                        <w:p>
+                          <w:pPr>
+                            <w:pStyle w:val="BodyText"/>
+                            <w:spacing w:before="34"/>
+                            <w:ind w:left="60"/>
+                          </w:pPr>
+                          <w:r>
+                            <w:rPr>
+                              <w:spacing w:val="-10"/>
+                            </w:rPr>
+                            <w:fldChar w:fldCharType="begin"/>
+                          </w:r>
+                          <w:r>
+                            <w:rPr>
+                              <w:spacing w:val="-10"/>
+                            </w:rPr>
+                            <w:instrText xml:space="preserve"> PAGE </w:instrText>
+                          </w:r>
+                          <w:r>
+                            <w:rPr>
+                              <w:spacing w:val="-10"/>
+                            </w:rPr>
+                            <w:fldChar w:fldCharType="separate"/>
+                          </w:r>
+                          <w:r>
+                            <w:rPr>
+                              <w:spacing w:val="-10"/>
+                            </w:rPr>
+                            <w:t>1</w:t>
+                          </w:r>
+                          <w:r>
+                            <w:rPr>
+                              <w:spacing w:val="-10"/>
+                            </w:rPr>
+                            <w:fldChar w:fldCharType="end"/>
+                          </w:r>
+                        </w:p>
+                      </w:txbxContent>
+                    </wps:txbx>
+                    <wps:bodyPr wrap="square" lIns="0" tIns="0" rIns="0" bIns="0" rtlCol="0">
+                      <a:noAutofit/>
+                    </wps:bodyPr>
+                  </wps:wsp>
+                </a:graphicData>
+              </a:graphic>
+            </wp:anchor>
+          </w:drawing>
+        </mc:Choice>
+        <mc:Fallback>
+          <w:pict>
+            <v:shapetype w14:anchorId="60F405D1" id="_x0000_t202" coordsize="21600,21600" o:spt="202" path="m,l,21600r21600,l21600,xe">
+              <v:stroke joinstyle="miter"/>
+              <v:path gradientshapeok="t" o:connecttype="rect"/>
+            </v:shapetype>
+            <v:shape id="Textbox 1" o:spid="_x0000_s1026" type="#_x0000_t202" style="position:absolute;margin-left:300.5pt;margin-top:755.65pt;width:12pt;height:16.15pt;z-index:-251658240;visibility:visible;mso-wrap-style:square;mso-wrap-distance-left:0;mso-wrap-distance-top:0;mso-wrap-distance-right:0;mso-wrap-distance-bottom:0;mso-position-horizontal:absolute;mso-position-horizontal-relative:page;mso-position-vertical:absolute;mso-position-vertical-relative:page;v-text-anchor:top" o:gfxdata="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" filled="f" stroked="f">
+              <v:textbox inset="0,0,0,0">
+                <w:txbxContent>
+                  <w:p>
+                    <w:pPr>
+                      <w:pStyle w:val="BodyText"/>
+                      <w:spacing w:before="34"/>
+                      <w:ind w:left="60"/>
+                    </w:pPr>
+                    <w:r>
+                      <w:rPr>
+                        <w:spacing w:val="-10"/>
+                      </w:rPr>
+                      <w:fldChar w:fldCharType="begin"/>
+                    </w:r>
+                    <w:r>
+                      <w:rPr>
+                        <w:spacing w:val="-10"/>
+                      </w:rPr>
+                      <w:instrText xml:space="preserve"> PAGE </w:instrText>
+                    </w:r>
+                    <w:r>
+                      <w:rPr>
+                        <w:spacing w:val="-10"/>
+                      </w:rPr>
+                      <w:fldChar w:fldCharType="separate"/>
+                    </w:r>
+                    <w:r>
+                      <w:rPr>
+                        <w:spacing w:val="-10"/>
+                      </w:rPr>
+                      <w:t>1</w:t>
+                    </w:r>
+                    <w:r>
+                      <w:rPr>
+                        <w:spacing w:val="-10"/>
+                      </w:rPr>
+                      <w:fldChar w:fldCharType="end"/>
+                    </w:r>
+                  </w:p>
+                </w:txbxContent>
+              </v:textbox>
+              <w10:wrap anchorx="page" anchory="page"/>
+            </v:shape>
+          </w:pict>
+        </mc:Fallback>
+      </mc:AlternateContent>
     </w:r>
-    <w:hyperlink r:id="rId1" w:history="1">
-      <w:r>
-        <w:rPr>
-          <w:rStyle w:val="Hyperlink"/>
-          <w:rFonts w:ascii="Aptos Display" w:hAnsi="Aptos Display"/>
-          <w:bCs/>
-          <w:w w:val="105"/>
-          <w:sz w:val="20"/>
-          <w:szCs w:val="20"/>
-        </w:rPr>
-        <w:t>c</w:t>
-      </w:r>
-      <w:r>
-        <w:rPr>
-          <w:rStyle w:val="Hyperlink"/>
-          <w:rFonts w:ascii="Aptos Display" w:hAnsi="Aptos Display"/>
-          <w:bCs/>
-          <w:w w:val="105"/>
-          <w:sz w:val="20"/>
-          <w:szCs w:val="20"/>
-        </w:rPr>
-        <w:t>ompute</w:t>
-      </w:r>
-      <w:r>
-        <w:rPr>
-          <w:rStyle w:val="Hyperlink"/>
-          <w:rFonts w:ascii="Aptos Display" w:hAnsi="Aptos Display"/>
-          <w:bCs/>
-          <w:w w:val="105"/>
-          <w:sz w:val="20"/>
-          <w:szCs w:val="20"/>
-        </w:rPr>
-        <w:t>456@outlook.com</w:t>
-      </w:r>
-    </w:hyperlink>
-    <w:r>
-      <w:t xml:space="preserve"> </w:t>
-    </w:r>
-    <w:r>
-      <w:rPr>
-        <w:rFonts w:ascii="Aptos Display" w:hAnsi="Aptos Display"/>
-        <w:bCs/>
-        <w:w w:val="105"/>
-        <w:sz w:val="20"/>
-        <w:szCs w:val="20"/>
-      </w:rPr>
-      <w:t>•</w:t>
-    </w:r>
-    <w:r>
-      <w:rPr>
-        <w:rFonts w:ascii="Aptos Display" w:hAnsi="Aptos Display"/>
-        <w:bCs/>
-        <w:w w:val="105"/>
-        <w:sz w:val="20"/>
-        <w:szCs w:val="20"/>
-      </w:rPr>
-      <w:t xml:space="preserve"> </w:t>
-    </w:r>
-    <w:hyperlink r:id="rId2" w:history="1">
-      <w:r>
-        <w:rPr>
-          <w:rStyle w:val="Hyperlink"/>
-          <w:rFonts w:ascii="Aptos Display" w:hAnsi="Aptos Display"/>
-          <w:bCs/>
-          <w:w w:val="105"/>
-          <w:sz w:val="20"/>
-          <w:szCs w:val="20"/>
-        </w:rPr>
-        <w:t>https://david.simplifai.team</w:t>
-      </w:r>
-    </w:hyperlink>
-    <w:r>
-      <w:rPr>
-        <w:rFonts w:ascii="Aptos Display" w:hAnsi="Aptos Display"/>
-        <w:bCs/>
-        <w:w w:val="105"/>
-        <w:sz w:val="20"/>
-        <w:szCs w:val="20"/>
-      </w:rPr>
-      <w:t xml:space="preserve"> </w:t>
-    </w:r>
-    <w:r>
-      <w:rPr>
-        <w:rFonts w:ascii="Aptos Display" w:hAnsi="Aptos Display"/>
-        <w:bCs/>
-        <w:w w:val="105"/>
-        <w:sz w:val="20"/>
-        <w:szCs w:val="20"/>
-      </w:rPr>
-      <w:t>• +1 562-833-4552</w:t>
-    </w:r>
-    <w:r>
-      <w:rPr>
-        <w:rFonts w:ascii="Aptos Display" w:hAnsi="Aptos Display"/>
-      </w:rPr>
-      <w:tab/>
-    </w:r>
-    <w:sdt>
-      <w:sdtPr>
-        <w:rPr>
-          <w:rFonts w:ascii="Aptos Display" w:hAnsi="Aptos Display"/>
-        </w:rPr>
-        <w:id w:val="1486276946"/>
-        <w:docPartObj>
-          <w:docPartGallery w:val="Page Numbers (Bottom of Page)"/>
-          <w:docPartUnique/>
-        </w:docPartObj>
-      </w:sdtPr>
-      <w:sdtEndPr/>
-      <w:sdtContent>
-        <w:sdt>
-          <w:sdtPr>
-            <w:rPr>
-              <w:rFonts w:ascii="Aptos Display" w:hAnsi="Aptos Display"/>
-            </w:rPr>
-            <w:id w:val="-1769616900"/>
-            <w:docPartObj>
-              <w:docPartGallery w:val="Page Numbers (Top of Page)"/>
-              <w:docPartUnique/>
-            </w:docPartObj>
-          </w:sdtPr>
-          <w:sdtEndPr/>
-          <w:sdtContent>
-            <w:r>
-              <w:rPr>
-                <w:rFonts w:ascii="Aptos Display" w:hAnsi="Aptos Display"/>
-              </w:rPr>
-              <w:t xml:space="preserve">Page </w:t>
-            </w:r>
-            <w:r>
-              <w:rPr>
-                <w:rFonts w:ascii="Aptos Display" w:hAnsi="Aptos Display"/>
-                <w:b/>
-                <w:bCs/>
-                <w:sz w:val="24"/>
-                <w:szCs w:val="24"/>
-              </w:rPr>
-              <w:fldChar w:fldCharType="begin"/>
-            </w:r>
-            <w:r>
-              <w:rPr>
-                <w:rFonts w:ascii="Aptos Display" w:hAnsi="Aptos Display"/>
-                <w:b/>
-                <w:bCs/>
-              </w:rPr>
-              <w:instrText xml:space="preserve"> PAGE </w:instrText>
-            </w:r>
-            <w:r>
-              <w:rPr>
-                <w:rFonts w:ascii="Aptos Display" w:hAnsi="Aptos Display"/>
-                <w:b/>
-                <w:bCs/>
-                <w:sz w:val="24"/>
-                <w:szCs w:val="24"/>
-              </w:rPr>
-              <w:fldChar w:fldCharType="separate"/>
-            </w:r>
-            <w:r>
-              <w:rPr>
-                <w:rFonts w:ascii="Aptos Display" w:hAnsi="Aptos Display"/>
-                <w:b/>
-                <w:bCs/>
-              </w:rPr>
-              <w:t>1</w:t>
-            </w:r>
-            <w:r>
-              <w:rPr>
-                <w:rFonts w:ascii="Aptos Display" w:hAnsi="Aptos Display"/>
-                <w:b/>
-                <w:bCs/>
-                <w:sz w:val="24"/>
-                <w:szCs w:val="24"/>
-              </w:rPr>
-              <w:fldChar w:fldCharType="end"/>
-            </w:r>
-            <w:r>
-              <w:rPr>
-                <w:rFonts w:ascii="Aptos Display" w:hAnsi="Aptos Display"/>
-              </w:rPr>
-              <w:t xml:space="preserve"> of </w:t>
-            </w:r>
-            <w:r>
-              <w:rPr>
-                <w:rFonts w:ascii="Aptos Display" w:hAnsi="Aptos Display"/>
-                <w:b/>
-                <w:bCs/>
-                <w:sz w:val="24"/>
-                <w:szCs w:val="24"/>
-              </w:rPr>
-              <w:fldChar w:fldCharType="begin"/>
-            </w:r>
-            <w:r>
-              <w:rPr>
-                <w:rFonts w:ascii="Aptos Display" w:hAnsi="Aptos Display"/>
-                <w:b/>
-                <w:bCs/>
-              </w:rPr>
-              <w:instrText xml:space="preserve"> NUMPAGES  </w:instrText>
-            </w:r>
-            <w:r>
-              <w:rPr>
-                <w:rFonts w:ascii="Aptos Display" w:hAnsi="Aptos Display"/>
-                <w:b/>
-                <w:bCs/>
-                <w:sz w:val="24"/>
-                <w:szCs w:val="24"/>
-              </w:rPr>
-              <w:fldChar w:fldCharType="separate"/>
-            </w:r>
-            <w:r>
-              <w:rPr>
-                <w:rFonts w:ascii="Aptos Display" w:hAnsi="Aptos Display"/>
-                <w:b/>
-                <w:bCs/>
-              </w:rPr>
-              <w:t>4</w:t>
-            </w:r>
-            <w:r>
-              <w:rPr>
-                <w:rFonts w:ascii="Aptos Display" w:hAnsi="Aptos Display"/>
-                <w:b/>
-                <w:bCs/>
-                <w:sz w:val="24"/>
-                <w:szCs w:val="24"/>
-              </w:rPr>
-              <w:fldChar w:fldCharType="end"/>
-            </w:r>
-          </w:sdtContent>
-        </w:sdt>
-      </w:sdtContent>
-    </w:sdt>
-  </w:p>
-  <w:p>
-    <w:pPr>
-      <w:pStyle w:val="Footer"/>
-      <w:tabs>
-        <w:tab w:val="clear" w:pos="4680"/>
-        <w:tab w:val="clear" w:pos="9360"/>
-        <w:tab w:val="right" w:pos="10670"/>
-      </w:tabs>
-    </w:pPr>
   </w:p>
 </w:ftr>
 </file>
@@ -8390,52 +7676,21 @@
       <w:szCs w:val="26"/>
     </w:rPr>
   </w:style>
-  <w:style w:type="paragraph" w:styleId="Header">
-    <w:name w:val="header"/>
+  <w:style w:type="paragraph" w:customStyle="1" w:styleId="ResumeRole">
+    <w:name w:val="Resume Role"/>
     <w:basedOn w:val="Normal"/>
-    <w:link w:val="HeaderChar"/>
-    <w:uiPriority w:val="99"/>
-    <w:unhideWhenUsed/>
-    <w:rsid w:val="009124F5"/>
+    <w:rsid w:val="00117BD4"/>
     <w:pPr>
-      <w:tabs>
-        <w:tab w:val="center" w:pos="4680"/>
-        <w:tab w:val="right" w:pos="9360"/>
-      </w:tabs>
+      <w:widowControl/>
+      <w:autoSpaceDE/>
+      <w:autoSpaceDN/>
+      <w:spacing w:before="50"/>
     </w:pPr>
-  </w:style>
-  <w:style w:type="character" w:customStyle="1" w:styleId="HeaderChar">
-    <w:name w:val="Header Char"/>
-    <w:basedOn w:val="DefaultParagraphFont"/>
-    <w:link w:val="Header"/>
-    <w:uiPriority w:val="99"/>
-    <w:rsid w:val="009124F5"/>
     <w:rPr>
-      <w:rFonts w:ascii="Palatino Linotype" w:eastAsia="Palatino Linotype" w:hAnsi="Palatino Linotype" w:cs="Palatino Linotype"/>
-    </w:rPr>
-  </w:style>
-  <w:style w:type="paragraph" w:styleId="Footer">
-    <w:name w:val="footer"/>
-    <w:basedOn w:val="Normal"/>
-    <w:link w:val="FooterChar"/>
-    <w:uiPriority w:val="99"/>
-    <w:unhideWhenUsed/>
-    <w:rsid w:val="009124F5"/>
-    <w:pPr>
-      <w:tabs>
-        <w:tab w:val="center" w:pos="4680"/>
-        <w:tab w:val="right" w:pos="9360"/>
-      </w:tabs>
-    </w:pPr>
-  </w:style>
-  <w:style w:type="character" w:customStyle="1" w:styleId="FooterChar">
-    <w:name w:val="Footer Char"/>
-    <w:basedOn w:val="DefaultParagraphFont"/>
-    <w:link w:val="Footer"/>
-    <w:uiPriority w:val="99"/>
-    <w:rsid w:val="009124F5"/>
-    <w:rPr>
-      <w:rFonts w:ascii="Palatino Linotype" w:eastAsia="Palatino Linotype" w:hAnsi="Palatino Linotype" w:cs="Palatino Linotype"/>
+      <w:rFonts w:ascii="Arial" w:eastAsia="Arial" w:hAnsi="Arial" w:cstheme="minorBidi"/>
+      <w:b/>
+      <w:color w:val="000000"/>
+      <w:sz w:val="19"/>
     </w:rPr>
   </w:style>
 </w:styles>

</xml_diff>

<commit_message>
chore: sync 2026-06-12 10:04:55 UTC
</commit_message>
<xml_diff>
--- a/resumes/IT_Networking_resume.docx
+++ b/resumes/IT_Networking_resume.docx
@@ -520,6 +520,8 @@
       <w:pPr>
         <w:spacing w:before="106"/>
         <w:ind w:left="360"/>
+      </w:pPr>
+      <w:r>
         <w:rPr>
           <w:rFonts w:ascii="Aptos Display" w:hAnsi="Aptos Display"/>
           <w:b/>
@@ -528,28 +530,10 @@
           <w:sz w:val="26"/>
           <w:szCs w:val="26"/>
         </w:rPr>
-      </w:pPr>
-      <w:r>
-        <w:rPr>
-          <w:rFonts w:ascii="Aptos Display" w:hAnsi="Aptos Display"/>
-          <w:b/>
-          <w:bCs/>
-          <w:w w:val="105"/>
-          <w:sz w:val="26"/>
-          <w:szCs w:val="26"/>
-        </w:rPr>
-        <w:t xml:space="preserve">Independent </w:t>
-      </w:r>
-      <w:r>
-        <w:rPr>
-          <w:rFonts w:ascii="Aptos Display" w:hAnsi="Aptos Display"/>
-          <w:b/>
-          <w:bCs/>
-          <w:w w:val="105"/>
-          <w:sz w:val="26"/>
-          <w:szCs w:val="26"/>
-        </w:rPr>
-        <w:t>Consultant</w:t>
+        <w:t>Independent Technical Projects &amp; Professional Development</w:t>
+      </w:r>
+      <w:r>
+        <w:tab/>
       </w:r>
     </w:p>
     <w:p>
@@ -573,127 +557,79 @@
           <w:sz w:val="24"/>
           <w:szCs w:val="24"/>
         </w:rPr>
-        <w:t>04/</w:t>
-      </w:r>
-      <w:r>
-        <w:rPr>
-          <w:rFonts w:ascii="Aptos Display" w:eastAsia="Times New Roman" w:hAnsi="Aptos Display" w:cs="Times New Roman"/>
-          <w:sz w:val="24"/>
-          <w:szCs w:val="24"/>
-        </w:rPr>
-        <w:t xml:space="preserve">2024 – </w:t>
-      </w:r>
-      <w:r>
-        <w:rPr>
-          <w:rFonts w:ascii="Aptos Display" w:eastAsia="Times New Roman" w:hAnsi="Aptos Display" w:cs="Times New Roman"/>
-          <w:sz w:val="24"/>
-          <w:szCs w:val="24"/>
-        </w:rPr>
-        <w:t>current</w:t>
-      </w:r>
-    </w:p>
-    <w:p>
-      <w:pPr>
-        <w:pStyle w:val="ListParagraph"/>
-        <w:widowControl/>
-        <w:numPr>
-          <w:ilvl w:val="0"/>
-          <w:numId w:val="27"/>
-        </w:numPr>
-        <w:autoSpaceDE/>
-        <w:autoSpaceDN/>
-        <w:ind w:right="680"/>
-        <w:rPr>
-          <w:rFonts w:ascii="Aptos Display" w:eastAsia="Times New Roman" w:hAnsi="Aptos Display" w:cs="Times New Roman"/>
-          <w:sz w:val="24"/>
-          <w:szCs w:val="24"/>
-        </w:rPr>
-      </w:pPr>
-      <w:r>
-        <w:rPr>
-          <w:rFonts w:ascii="Aptos Display" w:eastAsia="Times New Roman" w:hAnsi="Aptos Display" w:cs="Times New Roman"/>
-          <w:sz w:val="24"/>
-          <w:szCs w:val="24"/>
-        </w:rPr>
-        <w:t>Provided technical support and troubleshooting across small business systems, including application, database, and infrastructure issues</w:t>
-      </w:r>
-    </w:p>
-    <w:p>
-      <w:pPr>
-        <w:pStyle w:val="ListParagraph"/>
-        <w:widowControl/>
-        <w:numPr>
-          <w:ilvl w:val="0"/>
-          <w:numId w:val="27"/>
-        </w:numPr>
-        <w:autoSpaceDE/>
-        <w:autoSpaceDN/>
-        <w:ind w:right="680"/>
-        <w:rPr>
-          <w:rFonts w:ascii="Aptos Display" w:eastAsia="Times New Roman" w:hAnsi="Aptos Display" w:cs="Times New Roman"/>
-          <w:sz w:val="24"/>
-          <w:szCs w:val="24"/>
-        </w:rPr>
-      </w:pPr>
-      <w:r>
-        <w:rPr>
-          <w:rFonts w:ascii="Aptos Display" w:eastAsia="Times New Roman" w:hAnsi="Aptos Display" w:cs="Times New Roman"/>
-          <w:sz w:val="24"/>
-          <w:szCs w:val="24"/>
-        </w:rPr>
-        <w:t>Configured and maintained development and runtime environments using Docker and cloud platforms</w:t>
-      </w:r>
-    </w:p>
-    <w:p>
-      <w:pPr>
-        <w:pStyle w:val="ListParagraph"/>
-        <w:widowControl/>
-        <w:numPr>
-          <w:ilvl w:val="0"/>
-          <w:numId w:val="27"/>
-        </w:numPr>
-        <w:autoSpaceDE/>
-        <w:autoSpaceDN/>
-        <w:ind w:right="680"/>
-        <w:rPr>
-          <w:rFonts w:ascii="Aptos Display" w:eastAsia="Times New Roman" w:hAnsi="Aptos Display" w:cs="Times New Roman"/>
-          <w:sz w:val="24"/>
-          <w:szCs w:val="24"/>
-        </w:rPr>
-      </w:pPr>
-      <w:r>
-        <w:rPr>
-          <w:rFonts w:ascii="Aptos Display" w:eastAsia="Times New Roman" w:hAnsi="Aptos Display" w:cs="Times New Roman"/>
-          <w:sz w:val="24"/>
-          <w:szCs w:val="24"/>
-        </w:rPr>
-        <w:t>Diagnosed and resolved system performance and connectivity issues across API integrations and database systems</w:t>
-      </w:r>
-    </w:p>
-    <w:p>
-      <w:pPr>
+        <w:t>04/2024 – current</w:t>
+      </w:r>
+    </w:p>
+    <w:p>
+      <w:pPr>
+        <w:pStyle w:val="BulletedList"/>
         <w:numPr>
           <w:ilvl w:val="0"/>
           <w:numId w:val="26"/>
         </w:numPr>
-        <w:spacing w:after="160"/>
-        <w:rPr>
-          <w:rFonts w:ascii="Aptos Display" w:hAnsi="Aptos Display" w:cs="Times New Roman"/>
-          <w:bCs/>
-          <w:w w:val="105"/>
-          <w:sz w:val="24"/>
-          <w:szCs w:val="24"/>
-        </w:rPr>
-      </w:pPr>
-      <w:r>
-        <w:rPr>
-          <w:rFonts w:ascii="Aptos Display" w:hAnsi="Aptos Display" w:cs="Times New Roman"/>
-          <w:bCs/>
-          <w:w w:val="105"/>
-          <w:sz w:val="24"/>
-          <w:szCs w:val="24"/>
-        </w:rPr>
-        <w:t>Assisted with setup and configuration of software environments, ensuring stable and repeatable deployments</w:t>
+        <w:rPr>
+          <w:rFonts w:ascii="Aptos Display" w:hAnsi="Aptos Display"/>
+        </w:rPr>
+      </w:pPr>
+      <w:r>
+        <w:rPr>
+          <w:rFonts w:ascii="Aptos Display" w:hAnsi="Aptos Display"/>
+        </w:rPr>
+        <w:t>Designed and implemented .NET-based applications, APIs, integration components, and automation workflows using relational databases and cloud-ready patterns.</w:t>
+      </w:r>
+    </w:p>
+    <w:p>
+      <w:pPr>
+        <w:pStyle w:val="BulletedList"/>
+        <w:numPr>
+          <w:ilvl w:val="0"/>
+          <w:numId w:val="26"/>
+        </w:numPr>
+        <w:rPr>
+          <w:rFonts w:ascii="Aptos Display" w:hAnsi="Aptos Display"/>
+        </w:rPr>
+      </w:pPr>
+      <w:r>
+        <w:rPr>
+          <w:rFonts w:ascii="Aptos Display" w:hAnsi="Aptos Display"/>
+        </w:rPr>
+        <w:t>Built repeatable development and runtime environments using Docker, cloud platforms, and documented deployment practices.</w:t>
+      </w:r>
+    </w:p>
+    <w:p>
+      <w:pPr>
+        <w:pStyle w:val="BulletedList"/>
+        <w:numPr>
+          <w:ilvl w:val="0"/>
+          <w:numId w:val="26"/>
+        </w:numPr>
+        <w:rPr>
+          <w:rFonts w:ascii="Aptos Display" w:hAnsi="Aptos Display"/>
+        </w:rPr>
+      </w:pPr>
+      <w:r>
+        <w:rPr>
+          <w:rFonts w:ascii="Aptos Display" w:hAnsi="Aptos Display"/>
+        </w:rPr>
+        <w:t xml:space="preserve">Developed reporting and data-processing workflows and applied A.I.-assisted automation to reduce manual overhead. </w:t>
+      </w:r>
+    </w:p>
+    <w:p>
+      <w:pPr>
+        <w:pStyle w:val="BulletedList"/>
+        <w:numPr>
+          <w:ilvl w:val="0"/>
+          <w:numId w:val="26"/>
+        </w:numPr>
+        <w:rPr>
+          <w:rFonts w:ascii="Aptos Display" w:hAnsi="Aptos Display"/>
+        </w:rPr>
+      </w:pPr>
+      <w:r>
+        <w:rPr>
+          <w:rFonts w:ascii="Aptos Display" w:hAnsi="Aptos Display"/>
+        </w:rPr>
+        <w:t>Continued hands-on work in portable, maintainable architecture patterns for small-business and SaaS-style platforms.</w:t>
       </w:r>
     </w:p>
     <w:p>

</xml_diff>

<commit_message>
chore: sync 2026-06-21 20:55:09 UTC
</commit_message>
<xml_diff>
--- a/resumes/IT_Networking_resume.docx
+++ b/resumes/IT_Networking_resume.docx
@@ -153,7 +153,27 @@
           <w:sz w:val="24"/>
           <w:szCs w:val="24"/>
         </w:rPr>
-        <w:t xml:space="preserve"> with 20+ years of experience supporting enterprise applications, network infrastructure, and data platforms across distributed environments.</w:t>
+        <w:t xml:space="preserve"> with </w:t>
+      </w:r>
+      <w:r>
+        <w:rPr>
+          <w:rFonts w:ascii="Aptos Display" w:hAnsi="Aptos Display" w:cs="Times New Roman"/>
+          <w:bCs/>
+          <w:w w:val="105"/>
+          <w:sz w:val="24"/>
+          <w:szCs w:val="24"/>
+        </w:rPr>
+        <w:t>15</w:t>
+      </w:r>
+      <w:r>
+        <w:rPr>
+          <w:rFonts w:ascii="Aptos Display" w:hAnsi="Aptos Display" w:cs="Times New Roman"/>
+          <w:bCs/>
+          <w:w w:val="105"/>
+          <w:sz w:val="24"/>
+          <w:szCs w:val="24"/>
+        </w:rPr>
+        <w:t>+ years of experience supporting enterprise applications, network infrastructure, and data platforms across distributed environments.</w:t>
       </w:r>
     </w:p>
     <w:p>
@@ -530,7 +550,18 @@
           <w:sz w:val="26"/>
           <w:szCs w:val="26"/>
         </w:rPr>
-        <w:t>Independent Technical Projects &amp; Professional Development</w:t>
+        <w:t xml:space="preserve">Independent Technical Projects &amp; </w:t>
+      </w:r>
+      <w:r>
+        <w:rPr>
+          <w:rFonts w:ascii="Aptos Display" w:hAnsi="Aptos Display"/>
+          <w:b/>
+          <w:bCs/>
+          <w:w w:val="105"/>
+          <w:sz w:val="26"/>
+          <w:szCs w:val="26"/>
+        </w:rPr>
+        <w:t>Platform Engineering</w:t>
       </w:r>
       <w:r>
         <w:tab/>
@@ -562,74 +593,94 @@
     </w:p>
     <w:p>
       <w:pPr>
-        <w:pStyle w:val="BulletedList"/>
+        <w:pStyle w:val="ListParagraph"/>
         <w:numPr>
           <w:ilvl w:val="0"/>
-          <w:numId w:val="26"/>
+          <w:numId w:val="31"/>
         </w:numPr>
-        <w:rPr>
-          <w:rFonts w:ascii="Aptos Display" w:hAnsi="Aptos Display"/>
-        </w:rPr>
-      </w:pPr>
-      <w:r>
-        <w:rPr>
-          <w:rFonts w:ascii="Aptos Display" w:hAnsi="Aptos Display"/>
-        </w:rPr>
-        <w:t>Designed and implemented .NET-based applications, APIs, integration components, and automation workflows using relational databases and cloud-ready patterns.</w:t>
+        <w:spacing w:before="106"/>
+        <w:rPr>
+          <w:rFonts w:ascii="Aptos Display" w:eastAsia="Times New Roman" w:hAnsi="Aptos Display" w:cs="Times New Roman"/>
+          <w:sz w:val="24"/>
+          <w:szCs w:val="24"/>
+        </w:rPr>
+      </w:pPr>
+      <w:r>
+        <w:rPr>
+          <w:rFonts w:ascii="Aptos Display" w:eastAsia="Times New Roman" w:hAnsi="Aptos Display" w:cs="Times New Roman"/>
+          <w:sz w:val="24"/>
+          <w:szCs w:val="24"/>
+        </w:rPr>
+        <w:t>Designed and implemented .NET applications, APIs, integration components, automation workflows, and relational data solutions using cloud-ready architectural patterns.</w:t>
       </w:r>
     </w:p>
     <w:p>
       <w:pPr>
-        <w:pStyle w:val="BulletedList"/>
+        <w:pStyle w:val="ListParagraph"/>
         <w:numPr>
           <w:ilvl w:val="0"/>
-          <w:numId w:val="26"/>
+          <w:numId w:val="31"/>
         </w:numPr>
-        <w:rPr>
-          <w:rFonts w:ascii="Aptos Display" w:hAnsi="Aptos Display"/>
-        </w:rPr>
-      </w:pPr>
-      <w:r>
-        <w:rPr>
-          <w:rFonts w:ascii="Aptos Display" w:hAnsi="Aptos Display"/>
+        <w:spacing w:before="106"/>
+        <w:rPr>
+          <w:rFonts w:ascii="Aptos Display" w:eastAsia="Times New Roman" w:hAnsi="Aptos Display" w:cs="Times New Roman"/>
+          <w:sz w:val="24"/>
+          <w:szCs w:val="24"/>
+        </w:rPr>
+      </w:pPr>
+      <w:r>
+        <w:rPr>
+          <w:rFonts w:ascii="Aptos Display" w:eastAsia="Times New Roman" w:hAnsi="Aptos Display" w:cs="Times New Roman"/>
+          <w:sz w:val="24"/>
+          <w:szCs w:val="24"/>
         </w:rPr>
         <w:t>Built repeatable development and runtime environments using Docker, cloud platforms, and documented deployment practices.</w:t>
       </w:r>
     </w:p>
     <w:p>
       <w:pPr>
-        <w:pStyle w:val="BulletedList"/>
+        <w:pStyle w:val="ListParagraph"/>
         <w:numPr>
           <w:ilvl w:val="0"/>
-          <w:numId w:val="26"/>
+          <w:numId w:val="31"/>
         </w:numPr>
-        <w:rPr>
-          <w:rFonts w:ascii="Aptos Display" w:hAnsi="Aptos Display"/>
-        </w:rPr>
-      </w:pPr>
-      <w:r>
-        <w:rPr>
-          <w:rFonts w:ascii="Aptos Display" w:hAnsi="Aptos Display"/>
-        </w:rPr>
-        <w:t xml:space="preserve">Developed reporting and data-processing workflows and applied A.I.-assisted automation to reduce manual overhead. </w:t>
+        <w:spacing w:before="106"/>
+        <w:rPr>
+          <w:rFonts w:ascii="Aptos Display" w:eastAsia="Times New Roman" w:hAnsi="Aptos Display" w:cs="Times New Roman"/>
+          <w:sz w:val="24"/>
+          <w:szCs w:val="24"/>
+        </w:rPr>
+      </w:pPr>
+      <w:r>
+        <w:rPr>
+          <w:rFonts w:ascii="Aptos Display" w:eastAsia="Times New Roman" w:hAnsi="Aptos Display" w:cs="Times New Roman"/>
+          <w:sz w:val="24"/>
+          <w:szCs w:val="24"/>
+        </w:rPr>
+        <w:t xml:space="preserve">Developed reporting and data-processing workflows and applied A.I.-assisted automation to u manual overhead. </w:t>
       </w:r>
     </w:p>
     <w:p>
       <w:pPr>
-        <w:pStyle w:val="BulletedList"/>
+        <w:pStyle w:val="ListParagraph"/>
         <w:numPr>
           <w:ilvl w:val="0"/>
-          <w:numId w:val="26"/>
+          <w:numId w:val="31"/>
         </w:numPr>
-        <w:rPr>
-          <w:rFonts w:ascii="Aptos Display" w:hAnsi="Aptos Display"/>
-        </w:rPr>
-      </w:pPr>
-      <w:r>
-        <w:rPr>
-          <w:rFonts w:ascii="Aptos Display" w:hAnsi="Aptos Display"/>
-        </w:rPr>
-        <w:t>Continued hands-on work in portable, maintainable architecture patterns for small-business and SaaS-style platforms.</w:t>
+        <w:spacing w:before="106"/>
+        <w:rPr>
+          <w:rFonts w:ascii="Aptos Display" w:eastAsia="Times New Roman" w:hAnsi="Aptos Display" w:cs="Times New Roman"/>
+          <w:sz w:val="24"/>
+          <w:szCs w:val="24"/>
+        </w:rPr>
+      </w:pPr>
+      <w:r>
+        <w:rPr>
+          <w:rFonts w:ascii="Aptos Display" w:eastAsia="Times New Roman" w:hAnsi="Aptos Display" w:cs="Times New Roman"/>
+          <w:sz w:val="24"/>
+          <w:szCs w:val="24"/>
+        </w:rPr>
+        <w:t>Designed, built, and maintain the public Et al Solutions technology platform (https://etal.solutions), demonstrating modern web architecture, API integration, automated deployment, and technical content delivery.</w:t>
       </w:r>
     </w:p>
     <w:p>
@@ -707,132 +758,42 @@
     </w:p>
     <w:p>
       <w:pPr>
-        <w:pStyle w:val="ListParagraph"/>
-        <w:widowControl/>
-        <w:numPr>
-          <w:ilvl w:val="0"/>
-          <w:numId w:val="27"/>
-        </w:numPr>
-        <w:autoSpaceDE/>
-        <w:autoSpaceDN/>
-        <w:ind w:right="680"/>
-        <w:rPr>
-          <w:rFonts w:ascii="Aptos Display" w:eastAsia="Times New Roman" w:hAnsi="Aptos Display" w:cs="Times New Roman"/>
-          <w:sz w:val="24"/>
-          <w:szCs w:val="24"/>
-        </w:rPr>
-      </w:pPr>
-      <w:r>
-        <w:rPr>
-          <w:rFonts w:ascii="Aptos Display" w:eastAsia="Times New Roman" w:hAnsi="Aptos Display" w:cs="Times New Roman"/>
-          <w:sz w:val="24"/>
-          <w:szCs w:val="24"/>
-        </w:rPr>
+        <w:pStyle w:val="BulletedList"/>
+      </w:pPr>
+      <w:r>
         <w:t>Troubleshot and resolved production issues across distributed systems, including database, middleware, and network-related failures</w:t>
       </w:r>
     </w:p>
     <w:p>
       <w:pPr>
-        <w:pStyle w:val="ListParagraph"/>
-        <w:widowControl/>
-        <w:numPr>
-          <w:ilvl w:val="0"/>
-          <w:numId w:val="27"/>
-        </w:numPr>
-        <w:autoSpaceDE/>
-        <w:autoSpaceDN/>
-        <w:ind w:right="680"/>
-        <w:rPr>
-          <w:rFonts w:ascii="Aptos Display" w:eastAsia="Times New Roman" w:hAnsi="Aptos Display" w:cs="Times New Roman"/>
-          <w:sz w:val="24"/>
-          <w:szCs w:val="24"/>
-        </w:rPr>
-      </w:pPr>
-      <w:r>
-        <w:rPr>
-          <w:rFonts w:ascii="Aptos Display" w:eastAsia="Times New Roman" w:hAnsi="Aptos Display" w:cs="Times New Roman"/>
-          <w:sz w:val="24"/>
-          <w:szCs w:val="24"/>
-        </w:rPr>
+        <w:pStyle w:val="BulletedList"/>
+      </w:pPr>
+      <w:r>
+        <w:lastRenderedPageBreak/>
         <w:t>Supported enterprise data platforms and integration systems, ensuring reliable system performance and uptime</w:t>
       </w:r>
     </w:p>
     <w:p>
       <w:pPr>
-        <w:pStyle w:val="ListParagraph"/>
-        <w:widowControl/>
-        <w:numPr>
-          <w:ilvl w:val="0"/>
-          <w:numId w:val="27"/>
-        </w:numPr>
-        <w:autoSpaceDE/>
-        <w:autoSpaceDN/>
-        <w:ind w:right="680"/>
-        <w:rPr>
-          <w:rFonts w:ascii="Aptos Display" w:eastAsia="Times New Roman" w:hAnsi="Aptos Display" w:cs="Times New Roman"/>
-          <w:sz w:val="24"/>
-          <w:szCs w:val="24"/>
-        </w:rPr>
-      </w:pPr>
-      <w:r>
-        <w:rPr>
-          <w:rFonts w:ascii="Aptos Display" w:eastAsia="Times New Roman" w:hAnsi="Aptos Display" w:cs="Times New Roman"/>
-          <w:sz w:val="24"/>
-          <w:szCs w:val="24"/>
-        </w:rPr>
-        <w:lastRenderedPageBreak/>
+        <w:pStyle w:val="BulletedList"/>
+      </w:pPr>
+      <w:r>
         <w:t>Diagnosed performance bottlenecks and system slowdowns, improving responsiveness and stability</w:t>
       </w:r>
     </w:p>
     <w:p>
       <w:pPr>
-        <w:pStyle w:val="ListParagraph"/>
-        <w:widowControl/>
-        <w:numPr>
-          <w:ilvl w:val="0"/>
-          <w:numId w:val="27"/>
-        </w:numPr>
-        <w:autoSpaceDE/>
-        <w:autoSpaceDN/>
-        <w:ind w:right="680"/>
-        <w:rPr>
-          <w:rFonts w:ascii="Aptos Display" w:eastAsia="Times New Roman" w:hAnsi="Aptos Display" w:cs="Times New Roman"/>
-          <w:sz w:val="24"/>
-          <w:szCs w:val="24"/>
-        </w:rPr>
-      </w:pPr>
-      <w:r>
-        <w:rPr>
-          <w:rFonts w:ascii="Aptos Display" w:eastAsia="Times New Roman" w:hAnsi="Aptos Display" w:cs="Times New Roman"/>
-          <w:sz w:val="24"/>
-          <w:szCs w:val="24"/>
-        </w:rPr>
+        <w:pStyle w:val="BulletedList"/>
+      </w:pPr>
+      <w:r>
         <w:t>Collaborated with infrastructure and development teams to resolve system-level issues impacting application performance</w:t>
       </w:r>
     </w:p>
     <w:p>
       <w:pPr>
-        <w:numPr>
-          <w:ilvl w:val="0"/>
-          <w:numId w:val="26"/>
-        </w:numPr>
-        <w:spacing w:after="160"/>
-        <w:rPr>
-          <w:rFonts w:ascii="Aptos Display" w:hAnsi="Aptos Display" w:cs="Times New Roman"/>
-          <w:bCs/>
-          <w:w w:val="105"/>
-          <w:sz w:val="24"/>
-          <w:szCs w:val="24"/>
-        </w:rPr>
-      </w:pPr>
-      <w:r>
-        <w:rPr>
-          <w:rFonts w:ascii="Aptos Display" w:hAnsi="Aptos Display" w:cs="Times New Roman"/>
-          <w:bCs/>
-          <w:w w:val="105"/>
-          <w:sz w:val="24"/>
-          <w:szCs w:val="24"/>
-        </w:rPr>
+        <w:pStyle w:val="BulletedList"/>
+      </w:pPr>
+      <w:r>
         <w:t>Worked with cloud-hosted environments (Azure SQL and related services) to maintain system reliability</w:t>
       </w:r>
     </w:p>
@@ -887,105 +848,33 @@
     </w:p>
     <w:p>
       <w:pPr>
-        <w:pStyle w:val="ListParagraph"/>
-        <w:widowControl/>
-        <w:numPr>
-          <w:ilvl w:val="0"/>
-          <w:numId w:val="27"/>
-        </w:numPr>
-        <w:autoSpaceDE/>
-        <w:autoSpaceDN/>
-        <w:ind w:right="680"/>
-        <w:rPr>
-          <w:rFonts w:ascii="Aptos Display" w:eastAsia="Times New Roman" w:hAnsi="Aptos Display" w:cs="Times New Roman"/>
-          <w:sz w:val="24"/>
-          <w:szCs w:val="24"/>
-        </w:rPr>
-      </w:pPr>
-      <w:r>
-        <w:rPr>
-          <w:rFonts w:ascii="Aptos Display" w:eastAsia="Times New Roman" w:hAnsi="Aptos Display" w:cs="Times New Roman"/>
-          <w:sz w:val="24"/>
-          <w:szCs w:val="24"/>
-        </w:rPr>
+        <w:pStyle w:val="BulletedList"/>
+      </w:pPr>
+      <w:r>
         <w:t xml:space="preserve">Took an intentional career break while continuing hands-on technical work and professional development. </w:t>
       </w:r>
     </w:p>
     <w:p>
       <w:pPr>
-        <w:pStyle w:val="ListParagraph"/>
-        <w:widowControl/>
-        <w:numPr>
-          <w:ilvl w:val="0"/>
-          <w:numId w:val="27"/>
-        </w:numPr>
-        <w:autoSpaceDE/>
-        <w:autoSpaceDN/>
-        <w:ind w:right="680"/>
-        <w:rPr>
-          <w:rFonts w:ascii="Aptos Display" w:eastAsia="Times New Roman" w:hAnsi="Aptos Display" w:cs="Times New Roman"/>
-          <w:sz w:val="24"/>
-          <w:szCs w:val="24"/>
-        </w:rPr>
-      </w:pPr>
-      <w:r>
-        <w:rPr>
-          <w:rFonts w:ascii="Aptos Display" w:eastAsia="Times New Roman" w:hAnsi="Aptos Display" w:cs="Times New Roman"/>
-          <w:sz w:val="24"/>
-          <w:szCs w:val="24"/>
-        </w:rPr>
+        <w:pStyle w:val="BulletedList"/>
+      </w:pPr>
+      <w:r>
         <w:t>Built .NET/MVC and browser-based applications using HTML5, CSS3, JavaScript, and SQL-backed application architecture.</w:t>
       </w:r>
     </w:p>
     <w:p>
       <w:pPr>
-        <w:pStyle w:val="ListParagraph"/>
-        <w:widowControl/>
-        <w:numPr>
-          <w:ilvl w:val="0"/>
-          <w:numId w:val="27"/>
-        </w:numPr>
-        <w:autoSpaceDE/>
-        <w:autoSpaceDN/>
-        <w:ind w:right="680"/>
-        <w:rPr>
-          <w:rFonts w:ascii="Aptos Display" w:eastAsia="Times New Roman" w:hAnsi="Aptos Display" w:cs="Times New Roman"/>
-          <w:sz w:val="24"/>
-          <w:szCs w:val="24"/>
-        </w:rPr>
-      </w:pPr>
-      <w:r>
-        <w:rPr>
-          <w:rFonts w:ascii="Aptos Display" w:eastAsia="Times New Roman" w:hAnsi="Aptos Display" w:cs="Times New Roman"/>
-          <w:sz w:val="24"/>
-          <w:szCs w:val="24"/>
-        </w:rPr>
+        <w:pStyle w:val="BulletedList"/>
+      </w:pPr>
+      <w:r>
         <w:t xml:space="preserve">Developed responsive user interfaces, database-driven workflows, reporting views, and analytics outputs. </w:t>
       </w:r>
     </w:p>
     <w:p>
       <w:pPr>
-        <w:pStyle w:val="ListParagraph"/>
-        <w:widowControl/>
-        <w:numPr>
-          <w:ilvl w:val="0"/>
-          <w:numId w:val="27"/>
-        </w:numPr>
-        <w:autoSpaceDE/>
-        <w:autoSpaceDN/>
-        <w:ind w:right="680"/>
-        <w:rPr>
-          <w:rFonts w:ascii="Aptos Display" w:eastAsia="Times New Roman" w:hAnsi="Aptos Display" w:cs="Times New Roman"/>
-          <w:sz w:val="24"/>
-          <w:szCs w:val="24"/>
-        </w:rPr>
-      </w:pPr>
-      <w:r>
-        <w:rPr>
-          <w:rFonts w:ascii="Aptos Display" w:eastAsia="Times New Roman" w:hAnsi="Aptos Display" w:cs="Times New Roman"/>
-          <w:sz w:val="24"/>
-          <w:szCs w:val="24"/>
-        </w:rPr>
+        <w:pStyle w:val="BulletedList"/>
+      </w:pPr>
+      <w:r>
         <w:t>Explored legacy-modernization approaches using web applications, relational databases, APIs, and integration patterns.</w:t>
       </w:r>
     </w:p>
@@ -1088,131 +977,42 @@
     </w:p>
     <w:p>
       <w:pPr>
-        <w:pStyle w:val="ListParagraph"/>
-        <w:widowControl/>
-        <w:numPr>
-          <w:ilvl w:val="0"/>
-          <w:numId w:val="27"/>
-        </w:numPr>
-        <w:autoSpaceDE/>
-        <w:autoSpaceDN/>
-        <w:ind w:right="680"/>
-        <w:rPr>
-          <w:rFonts w:ascii="Aptos Display" w:eastAsia="Times New Roman" w:hAnsi="Aptos Display" w:cs="Times New Roman"/>
-          <w:sz w:val="24"/>
-          <w:szCs w:val="24"/>
-        </w:rPr>
-      </w:pPr>
-      <w:r>
-        <w:rPr>
-          <w:rFonts w:ascii="Aptos Display" w:eastAsia="Times New Roman" w:hAnsi="Aptos Display" w:cs="Times New Roman"/>
-          <w:sz w:val="24"/>
-          <w:szCs w:val="24"/>
-        </w:rPr>
+        <w:pStyle w:val="BulletedList"/>
+      </w:pPr>
+      <w:r>
         <w:t>Led operation and support of a multi-tenant SaaS platform, including system monitoring, issue resolution, and performance tuning</w:t>
       </w:r>
     </w:p>
     <w:p>
       <w:pPr>
-        <w:pStyle w:val="ListParagraph"/>
-        <w:widowControl/>
-        <w:numPr>
-          <w:ilvl w:val="0"/>
-          <w:numId w:val="27"/>
-        </w:numPr>
-        <w:autoSpaceDE/>
-        <w:autoSpaceDN/>
-        <w:ind w:right="680"/>
-        <w:rPr>
-          <w:rFonts w:ascii="Aptos Display" w:eastAsia="Times New Roman" w:hAnsi="Aptos Display" w:cs="Times New Roman"/>
-          <w:sz w:val="24"/>
-          <w:szCs w:val="24"/>
-        </w:rPr>
-      </w:pPr>
-      <w:r>
-        <w:rPr>
-          <w:rFonts w:ascii="Aptos Display" w:eastAsia="Times New Roman" w:hAnsi="Aptos Display" w:cs="Times New Roman"/>
-          <w:sz w:val="24"/>
-          <w:szCs w:val="24"/>
-        </w:rPr>
+        <w:pStyle w:val="BulletedList"/>
+      </w:pPr>
+      <w:r>
         <w:t>Maintained application and database infrastructure supporting thousands of users</w:t>
       </w:r>
     </w:p>
     <w:p>
       <w:pPr>
-        <w:pStyle w:val="ListParagraph"/>
-        <w:widowControl/>
-        <w:numPr>
-          <w:ilvl w:val="0"/>
-          <w:numId w:val="27"/>
-        </w:numPr>
-        <w:autoSpaceDE/>
-        <w:autoSpaceDN/>
-        <w:ind w:right="680"/>
-        <w:rPr>
-          <w:rFonts w:ascii="Aptos Display" w:eastAsia="Times New Roman" w:hAnsi="Aptos Display" w:cs="Times New Roman"/>
-          <w:sz w:val="24"/>
-          <w:szCs w:val="24"/>
-        </w:rPr>
-      </w:pPr>
-      <w:r>
-        <w:rPr>
-          <w:rFonts w:ascii="Aptos Display" w:eastAsia="Times New Roman" w:hAnsi="Aptos Display" w:cs="Times New Roman"/>
-          <w:sz w:val="24"/>
-          <w:szCs w:val="24"/>
-        </w:rPr>
+        <w:pStyle w:val="BulletedList"/>
+      </w:pPr>
+      <w:r>
         <w:t>Implemented cloud-based infrastructure improvements to enhance system availability and reliability</w:t>
       </w:r>
     </w:p>
     <w:p>
       <w:pPr>
-        <w:numPr>
-          <w:ilvl w:val="0"/>
-          <w:numId w:val="26"/>
-        </w:numPr>
-        <w:spacing w:after="160"/>
-        <w:rPr>
-          <w:rFonts w:ascii="Aptos Display" w:hAnsi="Aptos Display" w:cs="Times New Roman"/>
+        <w:pStyle w:val="BulletedList"/>
+        <w:rPr>
           <w:bCs/>
           <w:w w:val="105"/>
-          <w:sz w:val="24"/>
-          <w:szCs w:val="24"/>
-        </w:rPr>
-      </w:pPr>
-      <w:r>
-        <w:rPr>
-          <w:rFonts w:ascii="Aptos Display" w:hAnsi="Aptos Display" w:cs="Times New Roman"/>
+        </w:rPr>
+      </w:pPr>
+      <w:r>
+        <w:rPr>
           <w:bCs/>
           <w:w w:val="105"/>
-          <w:sz w:val="24"/>
-          <w:szCs w:val="24"/>
         </w:rPr>
         <w:t>Diagnosed and resolved production issues across application, database, and infrastructure layers</w:t>
-      </w:r>
-    </w:p>
-    <w:p>
-      <w:pPr>
-        <w:spacing w:before="106"/>
-        <w:ind w:left="360"/>
-        <w:rPr>
-          <w:rFonts w:ascii="Aptos Display" w:hAnsi="Aptos Display"/>
-          <w:b/>
-          <w:bCs/>
-          <w:w w:val="105"/>
-          <w:sz w:val="26"/>
-          <w:szCs w:val="26"/>
-        </w:rPr>
-      </w:pPr>
-      <w:r>
-        <w:rPr>
-          <w:rFonts w:ascii="Aptos Display" w:hAnsi="Aptos Display"/>
-          <w:b/>
-          <w:bCs/>
-          <w:w w:val="105"/>
-          <w:sz w:val="26"/>
-          <w:szCs w:val="26"/>
-        </w:rPr>
-        <w:t>SeeBeyond — Senior Consultant</w:t>
       </w:r>
     </w:p>
     <w:p>
@@ -1220,9 +1020,11 @@
         <w:keepNext/>
         <w:keepLines/>
         <w:widowControl/>
+        <w:tabs>
+          <w:tab w:val="right" w:pos="10080"/>
+        </w:tabs>
         <w:autoSpaceDE/>
         <w:autoSpaceDN/>
-        <w:spacing w:after="160"/>
         <w:ind w:left="330" w:right="680"/>
         <w:rPr>
           <w:rFonts w:ascii="Aptos Display" w:eastAsia="Times New Roman" w:hAnsi="Aptos Display" w:cs="Times New Roman"/>
@@ -1235,394 +1037,9 @@
           <w:rFonts w:ascii="Aptos Display" w:eastAsia="Times New Roman" w:hAnsi="Aptos Display" w:cs="Times New Roman"/>
           <w:sz w:val="24"/>
           <w:szCs w:val="24"/>
-        </w:rPr>
-        <w:t>10/</w:t>
-      </w:r>
-      <w:r>
-        <w:rPr>
-          <w:rFonts w:ascii="Aptos Display" w:eastAsia="Times New Roman" w:hAnsi="Aptos Display" w:cs="Times New Roman"/>
-          <w:sz w:val="24"/>
-          <w:szCs w:val="24"/>
-        </w:rPr>
-        <w:t xml:space="preserve">2002 – </w:t>
-      </w:r>
-      <w:r>
-        <w:rPr>
-          <w:rFonts w:ascii="Aptos Display" w:eastAsia="Times New Roman" w:hAnsi="Aptos Display" w:cs="Times New Roman"/>
-          <w:sz w:val="24"/>
-          <w:szCs w:val="24"/>
-        </w:rPr>
-        <w:t>12/</w:t>
-      </w:r>
-      <w:r>
-        <w:rPr>
-          <w:rFonts w:ascii="Aptos Display" w:eastAsia="Times New Roman" w:hAnsi="Aptos Display" w:cs="Times New Roman"/>
-          <w:sz w:val="24"/>
-          <w:szCs w:val="24"/>
-        </w:rPr>
-        <w:t>200</w:t>
-      </w:r>
-      <w:r>
-        <w:rPr>
-          <w:rFonts w:ascii="Aptos Display" w:eastAsia="Times New Roman" w:hAnsi="Aptos Display" w:cs="Times New Roman"/>
-          <w:sz w:val="24"/>
-          <w:szCs w:val="24"/>
-        </w:rPr>
-        <w:t>3</w:t>
-      </w:r>
-    </w:p>
-    <w:p>
-      <w:pPr>
-        <w:pStyle w:val="ListParagraph"/>
-        <w:widowControl/>
-        <w:numPr>
-          <w:ilvl w:val="0"/>
-          <w:numId w:val="27"/>
-        </w:numPr>
-        <w:autoSpaceDE/>
-        <w:autoSpaceDN/>
-        <w:ind w:right="680"/>
-        <w:rPr>
-          <w:rFonts w:ascii="Aptos Display" w:eastAsia="Times New Roman" w:hAnsi="Aptos Display" w:cs="Times New Roman"/>
-          <w:sz w:val="24"/>
-          <w:szCs w:val="24"/>
-        </w:rPr>
-      </w:pPr>
-      <w:r>
-        <w:rPr>
-          <w:rFonts w:ascii="Aptos Display" w:eastAsia="Times New Roman" w:hAnsi="Aptos Display" w:cs="Times New Roman"/>
-          <w:sz w:val="24"/>
-          <w:szCs w:val="24"/>
-        </w:rPr>
-        <w:t>Supported enterprise integration environments, troubleshooting data flow and system communication issues</w:t>
-      </w:r>
-    </w:p>
-    <w:p>
-      <w:pPr>
-        <w:pStyle w:val="ListParagraph"/>
-        <w:widowControl/>
-        <w:numPr>
-          <w:ilvl w:val="0"/>
-          <w:numId w:val="27"/>
-        </w:numPr>
-        <w:autoSpaceDE/>
-        <w:autoSpaceDN/>
-        <w:ind w:right="680"/>
-        <w:rPr>
-          <w:rFonts w:ascii="Aptos Display" w:eastAsia="Times New Roman" w:hAnsi="Aptos Display" w:cs="Times New Roman"/>
-          <w:sz w:val="24"/>
-          <w:szCs w:val="24"/>
-        </w:rPr>
-      </w:pPr>
-      <w:r>
-        <w:rPr>
-          <w:rFonts w:ascii="Aptos Display" w:eastAsia="Times New Roman" w:hAnsi="Aptos Display" w:cs="Times New Roman"/>
-          <w:sz w:val="24"/>
-          <w:szCs w:val="24"/>
-        </w:rPr>
-        <w:t>Maintained and monitored interfaces across distributed systems to ensure reliable data exchange</w:t>
-      </w:r>
-    </w:p>
-    <w:p>
-      <w:pPr>
-        <w:numPr>
-          <w:ilvl w:val="0"/>
-          <w:numId w:val="26"/>
-        </w:numPr>
-        <w:spacing w:after="160"/>
-        <w:rPr>
-          <w:rFonts w:ascii="Aptos Display" w:hAnsi="Aptos Display" w:cs="Times New Roman"/>
-          <w:bCs/>
-          <w:w w:val="105"/>
-          <w:sz w:val="24"/>
-          <w:szCs w:val="24"/>
-        </w:rPr>
-      </w:pPr>
-      <w:r>
-        <w:rPr>
-          <w:rFonts w:ascii="Aptos Display" w:hAnsi="Aptos Display" w:cs="Times New Roman"/>
-          <w:bCs/>
-          <w:w w:val="105"/>
-          <w:sz w:val="24"/>
-          <w:szCs w:val="24"/>
-        </w:rPr>
-        <w:t>Worked within regulated environments requiring stable and secure system operation</w:t>
-      </w:r>
-    </w:p>
-    <w:p>
-      <w:pPr>
-        <w:spacing w:before="106"/>
-        <w:ind w:left="360"/>
-        <w:rPr>
-          <w:rFonts w:ascii="Aptos Display" w:hAnsi="Aptos Display"/>
-          <w:b/>
-          <w:bCs/>
-          <w:w w:val="105"/>
-          <w:sz w:val="26"/>
-          <w:szCs w:val="26"/>
-        </w:rPr>
-      </w:pPr>
-      <w:r>
-        <w:rPr>
-          <w:rFonts w:ascii="Aptos Display" w:hAnsi="Aptos Display"/>
-          <w:b/>
-          <w:bCs/>
-          <w:w w:val="105"/>
-          <w:sz w:val="26"/>
-          <w:szCs w:val="26"/>
-        </w:rPr>
-        <w:t>Computer Sciences Corporation — Senior Consultant</w:t>
-      </w:r>
-    </w:p>
-    <w:p>
-      <w:pPr>
-        <w:keepNext/>
-        <w:keepLines/>
-        <w:widowControl/>
-        <w:autoSpaceDE/>
-        <w:autoSpaceDN/>
-        <w:spacing w:after="160"/>
-        <w:ind w:left="330" w:right="680"/>
-        <w:rPr>
-          <w:rFonts w:ascii="Aptos Display" w:eastAsia="Times New Roman" w:hAnsi="Aptos Display" w:cs="Times New Roman"/>
-          <w:sz w:val="24"/>
-          <w:szCs w:val="24"/>
-        </w:rPr>
-      </w:pPr>
-      <w:r>
-        <w:rPr>
-          <w:rFonts w:ascii="Aptos Display" w:eastAsia="Times New Roman" w:hAnsi="Aptos Display" w:cs="Times New Roman"/>
-          <w:sz w:val="24"/>
-          <w:szCs w:val="24"/>
-        </w:rPr>
-        <w:t>10/</w:t>
-      </w:r>
-      <w:r>
-        <w:rPr>
-          <w:rFonts w:ascii="Aptos Display" w:eastAsia="Times New Roman" w:hAnsi="Aptos Display" w:cs="Times New Roman"/>
-          <w:sz w:val="24"/>
-          <w:szCs w:val="24"/>
-        </w:rPr>
-        <w:t xml:space="preserve">2001 – </w:t>
-      </w:r>
-      <w:r>
-        <w:rPr>
-          <w:rFonts w:ascii="Aptos Display" w:eastAsia="Times New Roman" w:hAnsi="Aptos Display" w:cs="Times New Roman"/>
-          <w:sz w:val="24"/>
-          <w:szCs w:val="24"/>
-        </w:rPr>
-        <w:t>10/</w:t>
-      </w:r>
-      <w:r>
-        <w:rPr>
-          <w:rFonts w:ascii="Aptos Display" w:eastAsia="Times New Roman" w:hAnsi="Aptos Display" w:cs="Times New Roman"/>
-          <w:sz w:val="24"/>
-          <w:szCs w:val="24"/>
-        </w:rPr>
-        <w:t>2002</w:t>
-      </w:r>
-    </w:p>
-    <w:p>
-      <w:pPr>
-        <w:pStyle w:val="ListParagraph"/>
-        <w:widowControl/>
-        <w:numPr>
-          <w:ilvl w:val="0"/>
-          <w:numId w:val="27"/>
-        </w:numPr>
-        <w:autoSpaceDE/>
-        <w:autoSpaceDN/>
-        <w:ind w:right="680"/>
-        <w:rPr>
-          <w:rFonts w:ascii="Aptos Display" w:eastAsia="Times New Roman" w:hAnsi="Aptos Display" w:cs="Times New Roman"/>
-          <w:sz w:val="24"/>
-          <w:szCs w:val="24"/>
-        </w:rPr>
-      </w:pPr>
-      <w:r>
-        <w:rPr>
-          <w:rFonts w:ascii="Aptos Display" w:eastAsia="Times New Roman" w:hAnsi="Aptos Display" w:cs="Times New Roman"/>
-          <w:sz w:val="24"/>
-          <w:szCs w:val="24"/>
-        </w:rPr>
-        <w:t>Supported enterprise integration systems and assisted in resolving system connectivity and data exchange issues</w:t>
-      </w:r>
-    </w:p>
-    <w:p>
-      <w:pPr>
-        <w:numPr>
-          <w:ilvl w:val="0"/>
-          <w:numId w:val="26"/>
-        </w:numPr>
-        <w:spacing w:after="160"/>
-        <w:rPr>
-          <w:rFonts w:ascii="Aptos Display" w:hAnsi="Aptos Display" w:cs="Times New Roman"/>
-          <w:bCs/>
-          <w:w w:val="105"/>
-          <w:sz w:val="24"/>
-          <w:szCs w:val="24"/>
-        </w:rPr>
-      </w:pPr>
-      <w:r>
-        <w:rPr>
-          <w:rFonts w:ascii="Aptos Display" w:hAnsi="Aptos Display" w:cs="Times New Roman"/>
-          <w:bCs/>
-          <w:w w:val="105"/>
-          <w:sz w:val="24"/>
-          <w:szCs w:val="24"/>
-        </w:rPr>
-        <w:t>Developed and maintained middleware components supporting large-scale environments</w:t>
-      </w:r>
-    </w:p>
-    <w:p>
-      <w:pPr>
-        <w:spacing w:before="106"/>
-        <w:ind w:left="360"/>
-        <w:rPr>
-          <w:rFonts w:ascii="Aptos Display" w:hAnsi="Aptos Display"/>
-          <w:b/>
-          <w:bCs/>
-          <w:w w:val="105"/>
-          <w:sz w:val="26"/>
-          <w:szCs w:val="26"/>
-        </w:rPr>
-      </w:pPr>
-      <w:r>
-        <w:rPr>
-          <w:rFonts w:ascii="Aptos Display" w:hAnsi="Aptos Display"/>
-          <w:b/>
-          <w:bCs/>
-          <w:w w:val="105"/>
-          <w:sz w:val="26"/>
-          <w:szCs w:val="26"/>
-        </w:rPr>
-        <w:t>Fluor Corporation — EAI Team Lead</w:t>
-      </w:r>
-    </w:p>
-    <w:p>
-      <w:pPr>
-        <w:keepNext/>
-        <w:keepLines/>
-        <w:widowControl/>
-        <w:autoSpaceDE/>
-        <w:autoSpaceDN/>
-        <w:spacing w:after="160"/>
-        <w:ind w:left="330" w:right="680"/>
-        <w:rPr>
-          <w:rFonts w:ascii="Aptos Display" w:eastAsia="Times New Roman" w:hAnsi="Aptos Display" w:cs="Times New Roman"/>
-          <w:sz w:val="24"/>
-          <w:szCs w:val="24"/>
-        </w:rPr>
-      </w:pPr>
-      <w:r>
-        <w:rPr>
-          <w:rFonts w:ascii="Aptos Display" w:eastAsia="Times New Roman" w:hAnsi="Aptos Display" w:cs="Times New Roman"/>
-          <w:sz w:val="24"/>
-          <w:szCs w:val="24"/>
-        </w:rPr>
-        <w:t>01/</w:t>
-      </w:r>
-      <w:r>
-        <w:rPr>
-          <w:rFonts w:ascii="Aptos Display" w:eastAsia="Times New Roman" w:hAnsi="Aptos Display" w:cs="Times New Roman"/>
-          <w:sz w:val="24"/>
-          <w:szCs w:val="24"/>
-        </w:rPr>
-        <w:t xml:space="preserve">1999 – </w:t>
-      </w:r>
-      <w:r>
-        <w:rPr>
-          <w:rFonts w:ascii="Aptos Display" w:eastAsia="Times New Roman" w:hAnsi="Aptos Display" w:cs="Times New Roman"/>
-          <w:sz w:val="24"/>
-          <w:szCs w:val="24"/>
-        </w:rPr>
-        <w:t>10/</w:t>
-      </w:r>
-      <w:r>
-        <w:rPr>
-          <w:rFonts w:ascii="Aptos Display" w:eastAsia="Times New Roman" w:hAnsi="Aptos Display" w:cs="Times New Roman"/>
-          <w:sz w:val="24"/>
-          <w:szCs w:val="24"/>
-        </w:rPr>
-        <w:t>2001</w:t>
-      </w:r>
-    </w:p>
-    <w:p>
-      <w:pPr>
-        <w:pStyle w:val="ListParagraph"/>
-        <w:widowControl/>
-        <w:numPr>
-          <w:ilvl w:val="0"/>
-          <w:numId w:val="27"/>
-        </w:numPr>
-        <w:autoSpaceDE/>
-        <w:autoSpaceDN/>
-        <w:ind w:right="680"/>
-        <w:rPr>
-          <w:rFonts w:ascii="Aptos Display" w:eastAsia="Times New Roman" w:hAnsi="Aptos Display" w:cs="Times New Roman"/>
-          <w:sz w:val="24"/>
-          <w:szCs w:val="24"/>
-        </w:rPr>
-      </w:pPr>
-      <w:r>
-        <w:rPr>
-          <w:rFonts w:ascii="Aptos Display" w:eastAsia="Times New Roman" w:hAnsi="Aptos Display" w:cs="Times New Roman"/>
-          <w:sz w:val="24"/>
-          <w:szCs w:val="24"/>
-        </w:rPr>
-        <w:t>Supported enterprise messaging and integration infrastructure</w:t>
-      </w:r>
-    </w:p>
-    <w:p>
-      <w:pPr>
-        <w:pStyle w:val="ListParagraph"/>
-        <w:widowControl/>
-        <w:numPr>
-          <w:ilvl w:val="0"/>
-          <w:numId w:val="27"/>
-        </w:numPr>
-        <w:autoSpaceDE/>
-        <w:autoSpaceDN/>
-        <w:ind w:right="680"/>
-        <w:rPr>
-          <w:rFonts w:ascii="Aptos Display" w:eastAsia="Times New Roman" w:hAnsi="Aptos Display" w:cs="Times New Roman"/>
-          <w:sz w:val="24"/>
-          <w:szCs w:val="24"/>
-        </w:rPr>
-      </w:pPr>
-      <w:r>
-        <w:rPr>
-          <w:rFonts w:ascii="Aptos Display" w:eastAsia="Times New Roman" w:hAnsi="Aptos Display" w:cs="Times New Roman"/>
-          <w:sz w:val="24"/>
-          <w:szCs w:val="24"/>
-        </w:rPr>
-        <w:t>Conducted troubleshooting and validation of system communication across platforms</w:t>
-      </w:r>
-    </w:p>
-    <w:p>
-      <w:pPr>
-        <w:numPr>
-          <w:ilvl w:val="0"/>
-          <w:numId w:val="26"/>
-        </w:numPr>
-        <w:spacing w:after="160"/>
-        <w:rPr>
-          <w:rFonts w:ascii="Aptos Display" w:hAnsi="Aptos Display" w:cs="Times New Roman"/>
-          <w:bCs/>
-          <w:w w:val="105"/>
-          <w:sz w:val="24"/>
-          <w:szCs w:val="24"/>
-        </w:rPr>
-      </w:pPr>
-      <w:r>
-        <w:rPr>
-          <w:rFonts w:ascii="Aptos Display" w:hAnsi="Aptos Display" w:cs="Times New Roman"/>
-          <w:bCs/>
-          <w:w w:val="105"/>
-          <w:sz w:val="24"/>
-          <w:szCs w:val="24"/>
-        </w:rPr>
-        <w:t>Assisted with infrastructure transitions during legacy-to-SAP migrations</w:t>
+          <w:u w:val="single"/>
+        </w:rPr>
+        <w:tab/>
       </w:r>
     </w:p>
     <w:p>
@@ -1637,8 +1054,8 @@
           <w:b/>
           <w:bCs/>
           <w:w w:val="105"/>
-          <w:sz w:val="26"/>
-          <w:szCs w:val="26"/>
+          <w:sz w:val="32"/>
+          <w:szCs w:val="32"/>
         </w:rPr>
       </w:pPr>
       <w:r>
@@ -1647,145 +1064,25 @@
           <w:b/>
           <w:bCs/>
           <w:w w:val="105"/>
-          <w:sz w:val="26"/>
-          <w:szCs w:val="26"/>
-        </w:rPr>
-        <w:lastRenderedPageBreak/>
-        <w:t>PM Realty Group — MIS Manager</w:t>
+          <w:sz w:val="32"/>
+          <w:szCs w:val="32"/>
+        </w:rPr>
+        <w:t>Technical Skills</w:t>
       </w:r>
     </w:p>
     <w:p>
       <w:pPr>
-        <w:keepNext/>
-        <w:keepLines/>
-        <w:widowControl/>
-        <w:autoSpaceDE/>
-        <w:autoSpaceDN/>
-        <w:spacing w:after="160"/>
-        <w:ind w:left="330" w:right="680"/>
-        <w:rPr>
-          <w:rFonts w:ascii="Aptos Display" w:eastAsia="Times New Roman" w:hAnsi="Aptos Display" w:cs="Times New Roman"/>
-          <w:sz w:val="24"/>
-          <w:szCs w:val="24"/>
-        </w:rPr>
-      </w:pPr>
-      <w:r>
-        <w:rPr>
-          <w:rFonts w:ascii="Aptos Display" w:eastAsia="Times New Roman" w:hAnsi="Aptos Display" w:cs="Times New Roman"/>
-          <w:sz w:val="24"/>
-          <w:szCs w:val="24"/>
-        </w:rPr>
-        <w:t>01/</w:t>
-      </w:r>
-      <w:r>
-        <w:rPr>
-          <w:rFonts w:ascii="Aptos Display" w:eastAsia="Times New Roman" w:hAnsi="Aptos Display" w:cs="Times New Roman"/>
-          <w:sz w:val="24"/>
-          <w:szCs w:val="24"/>
-        </w:rPr>
-        <w:t xml:space="preserve">1996 – </w:t>
-      </w:r>
-      <w:r>
-        <w:rPr>
-          <w:rFonts w:ascii="Aptos Display" w:eastAsia="Times New Roman" w:hAnsi="Aptos Display" w:cs="Times New Roman"/>
-          <w:sz w:val="24"/>
-          <w:szCs w:val="24"/>
-        </w:rPr>
-        <w:t>01/</w:t>
-      </w:r>
-      <w:r>
-        <w:rPr>
-          <w:rFonts w:ascii="Aptos Display" w:eastAsia="Times New Roman" w:hAnsi="Aptos Display" w:cs="Times New Roman"/>
-          <w:sz w:val="24"/>
-          <w:szCs w:val="24"/>
-        </w:rPr>
-        <w:t>1999</w:t>
-      </w:r>
-    </w:p>
-    <w:p>
-      <w:pPr>
-        <w:pStyle w:val="ListParagraph"/>
-        <w:keepNext/>
-        <w:keepLines/>
-        <w:widowControl/>
-        <w:numPr>
-          <w:ilvl w:val="0"/>
-          <w:numId w:val="27"/>
-        </w:numPr>
-        <w:autoSpaceDE/>
-        <w:autoSpaceDN/>
-        <w:ind w:right="680"/>
-        <w:rPr>
-          <w:rFonts w:ascii="Aptos Display" w:eastAsia="Times New Roman" w:hAnsi="Aptos Display" w:cs="Times New Roman"/>
-          <w:sz w:val="24"/>
-          <w:szCs w:val="24"/>
-        </w:rPr>
-      </w:pPr>
-      <w:r>
-        <w:rPr>
-          <w:rFonts w:ascii="Aptos Display" w:eastAsia="Times New Roman" w:hAnsi="Aptos Display" w:cs="Times New Roman"/>
-          <w:sz w:val="24"/>
-          <w:szCs w:val="24"/>
-        </w:rPr>
-        <w:t>Managed IT operations, including network infrastructure, system connectivity, and user support</w:t>
-      </w:r>
-    </w:p>
-    <w:p>
-      <w:pPr>
-        <w:pStyle w:val="ListParagraph"/>
-        <w:widowControl/>
-        <w:numPr>
-          <w:ilvl w:val="0"/>
-          <w:numId w:val="27"/>
-        </w:numPr>
-        <w:autoSpaceDE/>
-        <w:autoSpaceDN/>
-        <w:ind w:right="680"/>
-        <w:rPr>
-          <w:rFonts w:ascii="Aptos Display" w:eastAsia="Times New Roman" w:hAnsi="Aptos Display" w:cs="Times New Roman"/>
-          <w:sz w:val="24"/>
-          <w:szCs w:val="24"/>
-        </w:rPr>
-      </w:pPr>
-      <w:r>
-        <w:rPr>
-          <w:rFonts w:ascii="Aptos Display" w:eastAsia="Times New Roman" w:hAnsi="Aptos Display" w:cs="Times New Roman"/>
-          <w:sz w:val="24"/>
-          <w:szCs w:val="24"/>
-        </w:rPr>
-        <w:t>Led LAN/WAN upgrades and ensured reliable communication across office locations</w:t>
-      </w:r>
-    </w:p>
-    <w:p>
-      <w:pPr>
-        <w:numPr>
-          <w:ilvl w:val="0"/>
-          <w:numId w:val="26"/>
-        </w:numPr>
-        <w:spacing w:after="160"/>
-        <w:rPr>
-          <w:rFonts w:ascii="Aptos Display" w:hAnsi="Aptos Display" w:cs="Times New Roman"/>
-          <w:bCs/>
-          <w:w w:val="105"/>
-          <w:sz w:val="24"/>
-          <w:szCs w:val="24"/>
-        </w:rPr>
-      </w:pPr>
-      <w:r>
-        <w:rPr>
-          <w:rFonts w:ascii="Aptos Display" w:hAnsi="Aptos Display" w:cs="Times New Roman"/>
-          <w:bCs/>
-          <w:w w:val="105"/>
-          <w:sz w:val="24"/>
-          <w:szCs w:val="24"/>
-        </w:rPr>
-        <w:t>Supported business-critical systems and provided hands-on technical troubleshooting</w:t>
-      </w:r>
-    </w:p>
-    <w:p>
-      <w:pPr>
         <w:spacing w:before="106"/>
         <w:ind w:left="360"/>
+        <w:rPr>
+          <w:rFonts w:ascii="Aptos Display" w:hAnsi="Aptos Display"/>
+          <w:b/>
+          <w:w w:val="105"/>
+          <w:sz w:val="24"/>
+          <w:szCs w:val="24"/>
+        </w:rPr>
+      </w:pPr>
+      <w:r>
         <w:rPr>
           <w:rFonts w:ascii="Aptos Display" w:hAnsi="Aptos Display"/>
           <w:b/>
@@ -1794,6 +1091,40 @@
           <w:sz w:val="26"/>
           <w:szCs w:val="26"/>
         </w:rPr>
+        <w:t>Systems &amp; Infrastructure</w:t>
+      </w:r>
+      <w:r>
+        <w:rPr>
+          <w:rFonts w:ascii="Aptos Display" w:hAnsi="Aptos Display"/>
+          <w:b/>
+          <w:w w:val="105"/>
+          <w:sz w:val="24"/>
+          <w:szCs w:val="24"/>
+        </w:rPr>
+        <w:br/>
+      </w:r>
+      <w:r>
+        <w:rPr>
+          <w:rFonts w:ascii="Aptos Display" w:hAnsi="Aptos Display" w:cs="Times New Roman"/>
+          <w:bCs/>
+          <w:w w:val="105"/>
+          <w:sz w:val="24"/>
+          <w:szCs w:val="24"/>
+        </w:rPr>
+        <w:t>Windows/Linux environments, system configuration, environment setup</w:t>
+      </w:r>
+    </w:p>
+    <w:p>
+      <w:pPr>
+        <w:spacing w:before="106"/>
+        <w:ind w:left="360"/>
+        <w:rPr>
+          <w:rFonts w:ascii="Aptos Display" w:hAnsi="Aptos Display"/>
+          <w:b/>
+          <w:w w:val="105"/>
+          <w:sz w:val="24"/>
+          <w:szCs w:val="24"/>
+        </w:rPr>
       </w:pPr>
       <w:r>
         <w:rPr>
@@ -1804,114 +1135,237 @@
           <w:sz w:val="26"/>
           <w:szCs w:val="26"/>
         </w:rPr>
-        <w:t>Access Development Corp — System Administrator / Programmer</w:t>
+        <w:t>Networking</w:t>
+      </w:r>
+      <w:r>
+        <w:rPr>
+          <w:rFonts w:ascii="Aptos Display" w:hAnsi="Aptos Display"/>
+          <w:b/>
+          <w:w w:val="105"/>
+          <w:sz w:val="24"/>
+          <w:szCs w:val="24"/>
+        </w:rPr>
+        <w:br/>
+      </w:r>
+      <w:r>
+        <w:rPr>
+          <w:rFonts w:ascii="Aptos Display" w:hAnsi="Aptos Display" w:cs="Times New Roman"/>
+          <w:bCs/>
+          <w:w w:val="105"/>
+          <w:sz w:val="24"/>
+          <w:szCs w:val="24"/>
+        </w:rPr>
+        <w:t>LAN/WAN concepts, connectivity troubleshooting, distributed systems communication</w:t>
       </w:r>
     </w:p>
     <w:p>
       <w:pPr>
-        <w:widowControl/>
-        <w:autoSpaceDE/>
-        <w:autoSpaceDN/>
-        <w:spacing w:after="160"/>
-        <w:ind w:left="330" w:right="680"/>
-        <w:rPr>
-          <w:rFonts w:ascii="Aptos Display" w:eastAsia="Times New Roman" w:hAnsi="Aptos Display" w:cs="Times New Roman"/>
-          <w:sz w:val="24"/>
-          <w:szCs w:val="24"/>
-        </w:rPr>
-      </w:pPr>
-      <w:r>
-        <w:rPr>
-          <w:rFonts w:ascii="Aptos Display" w:eastAsia="Times New Roman" w:hAnsi="Aptos Display" w:cs="Times New Roman"/>
-          <w:sz w:val="24"/>
-          <w:szCs w:val="24"/>
-        </w:rPr>
-        <w:t>05/</w:t>
-      </w:r>
-      <w:r>
-        <w:rPr>
-          <w:rFonts w:ascii="Aptos Display" w:eastAsia="Times New Roman" w:hAnsi="Aptos Display" w:cs="Times New Roman"/>
-          <w:sz w:val="24"/>
-          <w:szCs w:val="24"/>
-        </w:rPr>
-        <w:t xml:space="preserve">1986 – </w:t>
-      </w:r>
-      <w:r>
-        <w:rPr>
-          <w:rFonts w:ascii="Aptos Display" w:eastAsia="Times New Roman" w:hAnsi="Aptos Display" w:cs="Times New Roman"/>
-          <w:sz w:val="24"/>
-          <w:szCs w:val="24"/>
-        </w:rPr>
-        <w:t>01/</w:t>
-      </w:r>
-      <w:r>
-        <w:rPr>
-          <w:rFonts w:ascii="Aptos Display" w:eastAsia="Times New Roman" w:hAnsi="Aptos Display" w:cs="Times New Roman"/>
-          <w:sz w:val="24"/>
-          <w:szCs w:val="24"/>
-        </w:rPr>
-        <w:t>1996</w:t>
+        <w:spacing w:before="106"/>
+        <w:ind w:left="360"/>
+        <w:rPr>
+          <w:rFonts w:ascii="Aptos Display" w:hAnsi="Aptos Display"/>
+          <w:b/>
+          <w:w w:val="105"/>
+          <w:sz w:val="24"/>
+          <w:szCs w:val="24"/>
+        </w:rPr>
+      </w:pPr>
+      <w:r>
+        <w:rPr>
+          <w:rFonts w:ascii="Aptos Display" w:hAnsi="Aptos Display"/>
+          <w:b/>
+          <w:bCs/>
+          <w:w w:val="105"/>
+          <w:sz w:val="26"/>
+          <w:szCs w:val="26"/>
+        </w:rPr>
+        <w:t>Databases</w:t>
+      </w:r>
+      <w:r>
+        <w:rPr>
+          <w:rFonts w:ascii="Aptos Display" w:hAnsi="Aptos Display"/>
+          <w:b/>
+          <w:w w:val="105"/>
+          <w:sz w:val="24"/>
+          <w:szCs w:val="24"/>
+        </w:rPr>
+        <w:br/>
+      </w:r>
+      <w:r>
+        <w:rPr>
+          <w:rFonts w:ascii="Aptos Display" w:hAnsi="Aptos Display" w:cs="Times New Roman"/>
+          <w:bCs/>
+          <w:w w:val="105"/>
+          <w:sz w:val="24"/>
+          <w:szCs w:val="24"/>
+        </w:rPr>
+        <w:t>SQL Server, PostgreSQL, Azure SQL, database troubleshooting and performance</w:t>
       </w:r>
     </w:p>
     <w:p>
       <w:pPr>
-        <w:pStyle w:val="ListParagraph"/>
-        <w:widowControl/>
-        <w:numPr>
-          <w:ilvl w:val="0"/>
-          <w:numId w:val="27"/>
-        </w:numPr>
-        <w:autoSpaceDE/>
-        <w:autoSpaceDN/>
-        <w:ind w:right="680"/>
-        <w:rPr>
-          <w:rFonts w:ascii="Aptos Display" w:eastAsia="Times New Roman" w:hAnsi="Aptos Display" w:cs="Times New Roman"/>
-          <w:sz w:val="24"/>
-          <w:szCs w:val="24"/>
-        </w:rPr>
-      </w:pPr>
-      <w:r>
-        <w:rPr>
-          <w:rFonts w:ascii="Aptos Display" w:eastAsia="Times New Roman" w:hAnsi="Aptos Display" w:cs="Times New Roman"/>
-          <w:sz w:val="24"/>
-          <w:szCs w:val="24"/>
-        </w:rPr>
-        <w:t>Administered LAN-based systems and supported internal users with hardware and software issues</w:t>
+        <w:spacing w:before="106"/>
+        <w:ind w:left="360"/>
+        <w:rPr>
+          <w:rFonts w:ascii="Aptos Display" w:hAnsi="Aptos Display"/>
+          <w:b/>
+          <w:w w:val="105"/>
+          <w:sz w:val="24"/>
+          <w:szCs w:val="24"/>
+        </w:rPr>
+      </w:pPr>
+      <w:r>
+        <w:rPr>
+          <w:rFonts w:ascii="Aptos Display" w:hAnsi="Aptos Display"/>
+          <w:b/>
+          <w:bCs/>
+          <w:w w:val="105"/>
+          <w:sz w:val="26"/>
+          <w:szCs w:val="26"/>
+        </w:rPr>
+        <w:t>Cloud Platforms</w:t>
+      </w:r>
+      <w:r>
+        <w:rPr>
+          <w:rFonts w:ascii="Aptos Display" w:hAnsi="Aptos Display"/>
+          <w:b/>
+          <w:w w:val="105"/>
+          <w:sz w:val="24"/>
+          <w:szCs w:val="24"/>
+        </w:rPr>
+        <w:br/>
+      </w:r>
+      <w:r>
+        <w:rPr>
+          <w:rFonts w:ascii="Aptos Display" w:hAnsi="Aptos Display" w:cs="Times New Roman"/>
+          <w:bCs/>
+          <w:w w:val="105"/>
+          <w:sz w:val="24"/>
+          <w:szCs w:val="24"/>
+        </w:rPr>
+        <w:t>Azure, AWS, GCP</w:t>
       </w:r>
     </w:p>
     <w:p>
       <w:pPr>
-        <w:pStyle w:val="ListParagraph"/>
-        <w:widowControl/>
-        <w:numPr>
-          <w:ilvl w:val="0"/>
-          <w:numId w:val="27"/>
-        </w:numPr>
-        <w:autoSpaceDE/>
-        <w:autoSpaceDN/>
-        <w:ind w:right="680"/>
-        <w:rPr>
-          <w:rFonts w:ascii="Aptos Display" w:eastAsia="Times New Roman" w:hAnsi="Aptos Display" w:cs="Times New Roman"/>
-          <w:sz w:val="24"/>
-          <w:szCs w:val="24"/>
-        </w:rPr>
-      </w:pPr>
-      <w:r>
-        <w:rPr>
-          <w:rFonts w:ascii="Aptos Display" w:eastAsia="Times New Roman" w:hAnsi="Aptos Display" w:cs="Times New Roman"/>
-          <w:sz w:val="24"/>
-          <w:szCs w:val="24"/>
-        </w:rPr>
-        <w:t>Installed, configured, and maintained business applications and system environments</w:t>
+        <w:spacing w:before="106"/>
+        <w:ind w:left="360"/>
+        <w:rPr>
+          <w:rFonts w:ascii="Aptos Display" w:hAnsi="Aptos Display"/>
+          <w:b/>
+          <w:w w:val="105"/>
+          <w:sz w:val="24"/>
+          <w:szCs w:val="24"/>
+        </w:rPr>
+      </w:pPr>
+      <w:r>
+        <w:rPr>
+          <w:rFonts w:ascii="Aptos Display" w:hAnsi="Aptos Display"/>
+          <w:b/>
+          <w:bCs/>
+          <w:w w:val="105"/>
+          <w:sz w:val="26"/>
+          <w:szCs w:val="26"/>
+        </w:rPr>
+        <w:t>Tools &amp; Platforms</w:t>
+      </w:r>
+      <w:r>
+        <w:rPr>
+          <w:rFonts w:ascii="Aptos Display" w:hAnsi="Aptos Display"/>
+          <w:b/>
+          <w:w w:val="105"/>
+          <w:sz w:val="24"/>
+          <w:szCs w:val="24"/>
+        </w:rPr>
+        <w:br/>
+      </w:r>
+      <w:r>
+        <w:rPr>
+          <w:rFonts w:ascii="Aptos Display" w:hAnsi="Aptos Display" w:cs="Times New Roman"/>
+          <w:bCs/>
+          <w:w w:val="105"/>
+          <w:sz w:val="24"/>
+          <w:szCs w:val="24"/>
+        </w:rPr>
+        <w:t>Docker,</w:t>
+      </w:r>
+      <w:r>
+        <w:rPr>
+          <w:rFonts w:ascii="Aptos Display" w:hAnsi="Aptos Display" w:cs="Times New Roman"/>
+          <w:bCs/>
+          <w:w w:val="105"/>
+          <w:sz w:val="24"/>
+          <w:szCs w:val="24"/>
+        </w:rPr>
+        <w:t xml:space="preserve"> </w:t>
+      </w:r>
+      <w:proofErr w:type="spellStart"/>
+      <w:r>
+        <w:rPr>
+          <w:rFonts w:ascii="Aptos Display" w:hAnsi="Aptos Display" w:cs="Times New Roman"/>
+          <w:bCs/>
+          <w:w w:val="105"/>
+          <w:sz w:val="24"/>
+          <w:szCs w:val="24"/>
+        </w:rPr>
+        <w:t>Portainer</w:t>
+      </w:r>
+      <w:proofErr w:type="spellEnd"/>
+      <w:r>
+        <w:rPr>
+          <w:rFonts w:ascii="Aptos Display" w:hAnsi="Aptos Display" w:cs="Times New Roman"/>
+          <w:bCs/>
+          <w:w w:val="105"/>
+          <w:sz w:val="24"/>
+          <w:szCs w:val="24"/>
+        </w:rPr>
+        <w:t>,</w:t>
+      </w:r>
+      <w:r>
+        <w:rPr>
+          <w:rFonts w:ascii="Aptos Display" w:hAnsi="Aptos Display" w:cs="Times New Roman"/>
+          <w:bCs/>
+          <w:w w:val="105"/>
+          <w:sz w:val="24"/>
+          <w:szCs w:val="24"/>
+        </w:rPr>
+        <w:t xml:space="preserve"> CI/CD pipelines, system monitoring tools</w:t>
       </w:r>
     </w:p>
     <w:p>
       <w:pPr>
-        <w:numPr>
-          <w:ilvl w:val="0"/>
-          <w:numId w:val="26"/>
-        </w:numPr>
-        <w:spacing w:after="160"/>
+        <w:spacing w:before="106"/>
+        <w:ind w:left="360"/>
+        <w:rPr>
+          <w:rFonts w:ascii="Aptos Display" w:hAnsi="Aptos Display"/>
+          <w:b/>
+          <w:w w:val="105"/>
+          <w:sz w:val="24"/>
+          <w:szCs w:val="24"/>
+        </w:rPr>
+      </w:pPr>
+      <w:r>
+        <w:rPr>
+          <w:rFonts w:ascii="Aptos Display" w:hAnsi="Aptos Display"/>
+          <w:b/>
+          <w:bCs/>
+          <w:w w:val="105"/>
+          <w:sz w:val="26"/>
+          <w:szCs w:val="26"/>
+        </w:rPr>
+        <w:t>Programming/Scripting (support-focused use)</w:t>
+      </w:r>
+      <w:r>
+        <w:rPr>
+          <w:rFonts w:ascii="Aptos Display" w:hAnsi="Aptos Display"/>
+          <w:b/>
+          <w:w w:val="105"/>
+          <w:sz w:val="24"/>
+          <w:szCs w:val="24"/>
+        </w:rPr>
+        <w:br/>
+      </w:r>
+      <w:r>
         <w:rPr>
           <w:rFonts w:ascii="Aptos Display" w:hAnsi="Aptos Display" w:cs="Times New Roman"/>
           <w:bCs/>
@@ -1919,22 +1373,11 @@
           <w:sz w:val="24"/>
           <w:szCs w:val="24"/>
         </w:rPr>
-      </w:pPr>
-      <w:r>
-        <w:rPr>
-          <w:rFonts w:ascii="Aptos Display" w:hAnsi="Aptos Display" w:cs="Times New Roman"/>
-          <w:bCs/>
-          <w:w w:val="105"/>
-          <w:sz w:val="24"/>
-          <w:szCs w:val="24"/>
-        </w:rPr>
-        <w:t>Migrated systems from legacy platforms to client/server architecture</w:t>
+        <w:t>C#, Bash, PowerShell, SQL</w:t>
       </w:r>
     </w:p>
     <w:p>
       <w:pPr>
-        <w:keepNext/>
-        <w:keepLines/>
         <w:widowControl/>
         <w:tabs>
           <w:tab w:val="right" w:pos="10080"/>
@@ -1957,437 +1400,6 @@
         </w:rPr>
         <w:tab/>
       </w:r>
-    </w:p>
-    <w:p>
-      <w:pPr>
-        <w:keepNext/>
-        <w:keepLines/>
-        <w:widowControl/>
-        <w:spacing w:before="106"/>
-        <w:ind w:left="360"/>
-        <w:rPr>
-          <w:rFonts w:ascii="Aptos Display" w:hAnsi="Aptos Display"/>
-          <w:b/>
-          <w:bCs/>
-          <w:w w:val="105"/>
-          <w:sz w:val="32"/>
-          <w:szCs w:val="32"/>
-        </w:rPr>
-      </w:pPr>
-      <w:r>
-        <w:rPr>
-          <w:rFonts w:ascii="Aptos Display" w:hAnsi="Aptos Display"/>
-          <w:b/>
-          <w:bCs/>
-          <w:w w:val="105"/>
-          <w:sz w:val="32"/>
-          <w:szCs w:val="32"/>
-        </w:rPr>
-        <w:t>Technical Skills</w:t>
-      </w:r>
-    </w:p>
-    <w:p>
-      <w:pPr>
-        <w:spacing w:before="106"/>
-        <w:ind w:left="360"/>
-        <w:rPr>
-          <w:rFonts w:ascii="Aptos Display" w:hAnsi="Aptos Display"/>
-          <w:b/>
-          <w:w w:val="105"/>
-          <w:sz w:val="24"/>
-          <w:szCs w:val="24"/>
-        </w:rPr>
-      </w:pPr>
-      <w:r>
-        <w:rPr>
-          <w:rFonts w:ascii="Aptos Display" w:hAnsi="Aptos Display"/>
-          <w:b/>
-          <w:bCs/>
-          <w:w w:val="105"/>
-          <w:sz w:val="26"/>
-          <w:szCs w:val="26"/>
-        </w:rPr>
-        <w:t>Systems &amp; Infrastructure</w:t>
-      </w:r>
-      <w:r>
-        <w:rPr>
-          <w:rFonts w:ascii="Aptos Display" w:hAnsi="Aptos Display"/>
-          <w:b/>
-          <w:w w:val="105"/>
-          <w:sz w:val="24"/>
-          <w:szCs w:val="24"/>
-        </w:rPr>
-        <w:br/>
-      </w:r>
-      <w:r>
-        <w:rPr>
-          <w:rFonts w:ascii="Aptos Display" w:hAnsi="Aptos Display" w:cs="Times New Roman"/>
-          <w:bCs/>
-          <w:w w:val="105"/>
-          <w:sz w:val="24"/>
-          <w:szCs w:val="24"/>
-        </w:rPr>
-        <w:t>Windows/Linux environments, system configuration, environment setup</w:t>
-      </w:r>
-    </w:p>
-    <w:p>
-      <w:pPr>
-        <w:spacing w:before="106"/>
-        <w:ind w:left="360"/>
-        <w:rPr>
-          <w:rFonts w:ascii="Aptos Display" w:hAnsi="Aptos Display"/>
-          <w:b/>
-          <w:w w:val="105"/>
-          <w:sz w:val="24"/>
-          <w:szCs w:val="24"/>
-        </w:rPr>
-      </w:pPr>
-      <w:r>
-        <w:rPr>
-          <w:rFonts w:ascii="Aptos Display" w:hAnsi="Aptos Display"/>
-          <w:b/>
-          <w:bCs/>
-          <w:w w:val="105"/>
-          <w:sz w:val="26"/>
-          <w:szCs w:val="26"/>
-        </w:rPr>
-        <w:t>Networking</w:t>
-      </w:r>
-      <w:r>
-        <w:rPr>
-          <w:rFonts w:ascii="Aptos Display" w:hAnsi="Aptos Display"/>
-          <w:b/>
-          <w:w w:val="105"/>
-          <w:sz w:val="24"/>
-          <w:szCs w:val="24"/>
-        </w:rPr>
-        <w:br/>
-      </w:r>
-      <w:r>
-        <w:rPr>
-          <w:rFonts w:ascii="Aptos Display" w:hAnsi="Aptos Display" w:cs="Times New Roman"/>
-          <w:bCs/>
-          <w:w w:val="105"/>
-          <w:sz w:val="24"/>
-          <w:szCs w:val="24"/>
-        </w:rPr>
-        <w:t>LAN/WAN concepts, connectivity troubleshooting, distributed systems communication</w:t>
-      </w:r>
-    </w:p>
-    <w:p>
-      <w:pPr>
-        <w:spacing w:before="106"/>
-        <w:ind w:left="360"/>
-        <w:rPr>
-          <w:rFonts w:ascii="Aptos Display" w:hAnsi="Aptos Display"/>
-          <w:b/>
-          <w:w w:val="105"/>
-          <w:sz w:val="24"/>
-          <w:szCs w:val="24"/>
-        </w:rPr>
-      </w:pPr>
-      <w:r>
-        <w:rPr>
-          <w:rFonts w:ascii="Aptos Display" w:hAnsi="Aptos Display"/>
-          <w:b/>
-          <w:bCs/>
-          <w:w w:val="105"/>
-          <w:sz w:val="26"/>
-          <w:szCs w:val="26"/>
-        </w:rPr>
-        <w:t>Databases</w:t>
-      </w:r>
-      <w:r>
-        <w:rPr>
-          <w:rFonts w:ascii="Aptos Display" w:hAnsi="Aptos Display"/>
-          <w:b/>
-          <w:w w:val="105"/>
-          <w:sz w:val="24"/>
-          <w:szCs w:val="24"/>
-        </w:rPr>
-        <w:br/>
-      </w:r>
-      <w:r>
-        <w:rPr>
-          <w:rFonts w:ascii="Aptos Display" w:hAnsi="Aptos Display" w:cs="Times New Roman"/>
-          <w:bCs/>
-          <w:w w:val="105"/>
-          <w:sz w:val="24"/>
-          <w:szCs w:val="24"/>
-        </w:rPr>
-        <w:t>SQL Server, PostgreSQL, Azure SQL, database troubleshooting and performance</w:t>
-      </w:r>
-    </w:p>
-    <w:p>
-      <w:pPr>
-        <w:spacing w:before="106"/>
-        <w:ind w:left="360"/>
-        <w:rPr>
-          <w:rFonts w:ascii="Aptos Display" w:hAnsi="Aptos Display"/>
-          <w:b/>
-          <w:w w:val="105"/>
-          <w:sz w:val="24"/>
-          <w:szCs w:val="24"/>
-        </w:rPr>
-      </w:pPr>
-      <w:r>
-        <w:rPr>
-          <w:rFonts w:ascii="Aptos Display" w:hAnsi="Aptos Display"/>
-          <w:b/>
-          <w:bCs/>
-          <w:w w:val="105"/>
-          <w:sz w:val="26"/>
-          <w:szCs w:val="26"/>
-        </w:rPr>
-        <w:t>Cloud Platforms</w:t>
-      </w:r>
-      <w:r>
-        <w:rPr>
-          <w:rFonts w:ascii="Aptos Display" w:hAnsi="Aptos Display"/>
-          <w:b/>
-          <w:w w:val="105"/>
-          <w:sz w:val="24"/>
-          <w:szCs w:val="24"/>
-        </w:rPr>
-        <w:br/>
-      </w:r>
-      <w:r>
-        <w:rPr>
-          <w:rFonts w:ascii="Aptos Display" w:hAnsi="Aptos Display" w:cs="Times New Roman"/>
-          <w:bCs/>
-          <w:w w:val="105"/>
-          <w:sz w:val="24"/>
-          <w:szCs w:val="24"/>
-        </w:rPr>
-        <w:t>Azure, AWS, GCP</w:t>
-      </w:r>
-    </w:p>
-    <w:p>
-      <w:pPr>
-        <w:spacing w:before="106"/>
-        <w:ind w:left="360"/>
-        <w:rPr>
-          <w:rFonts w:ascii="Aptos Display" w:hAnsi="Aptos Display"/>
-          <w:b/>
-          <w:w w:val="105"/>
-          <w:sz w:val="24"/>
-          <w:szCs w:val="24"/>
-        </w:rPr>
-      </w:pPr>
-      <w:r>
-        <w:rPr>
-          <w:rFonts w:ascii="Aptos Display" w:hAnsi="Aptos Display"/>
-          <w:b/>
-          <w:bCs/>
-          <w:w w:val="105"/>
-          <w:sz w:val="26"/>
-          <w:szCs w:val="26"/>
-        </w:rPr>
-        <w:t>Tools &amp; Platforms</w:t>
-      </w:r>
-      <w:r>
-        <w:rPr>
-          <w:rFonts w:ascii="Aptos Display" w:hAnsi="Aptos Display"/>
-          <w:b/>
-          <w:w w:val="105"/>
-          <w:sz w:val="24"/>
-          <w:szCs w:val="24"/>
-        </w:rPr>
-        <w:br/>
-      </w:r>
-      <w:r>
-        <w:rPr>
-          <w:rFonts w:ascii="Aptos Display" w:hAnsi="Aptos Display" w:cs="Times New Roman"/>
-          <w:bCs/>
-          <w:w w:val="105"/>
-          <w:sz w:val="24"/>
-          <w:szCs w:val="24"/>
-        </w:rPr>
-        <w:t>Docker,</w:t>
-      </w:r>
-      <w:r>
-        <w:rPr>
-          <w:rFonts w:ascii="Aptos Display" w:hAnsi="Aptos Display" w:cs="Times New Roman"/>
-          <w:bCs/>
-          <w:w w:val="105"/>
-          <w:sz w:val="24"/>
-          <w:szCs w:val="24"/>
-        </w:rPr>
-        <w:t xml:space="preserve"> </w:t>
-      </w:r>
-      <w:proofErr w:type="spellStart"/>
-      <w:r>
-        <w:rPr>
-          <w:rFonts w:ascii="Aptos Display" w:hAnsi="Aptos Display" w:cs="Times New Roman"/>
-          <w:bCs/>
-          <w:w w:val="105"/>
-          <w:sz w:val="24"/>
-          <w:szCs w:val="24"/>
-        </w:rPr>
-        <w:t>Portainer</w:t>
-      </w:r>
-      <w:proofErr w:type="spellEnd"/>
-      <w:r>
-        <w:rPr>
-          <w:rFonts w:ascii="Aptos Display" w:hAnsi="Aptos Display" w:cs="Times New Roman"/>
-          <w:bCs/>
-          <w:w w:val="105"/>
-          <w:sz w:val="24"/>
-          <w:szCs w:val="24"/>
-        </w:rPr>
-        <w:t>,</w:t>
-      </w:r>
-      <w:r>
-        <w:rPr>
-          <w:rFonts w:ascii="Aptos Display" w:hAnsi="Aptos Display" w:cs="Times New Roman"/>
-          <w:bCs/>
-          <w:w w:val="105"/>
-          <w:sz w:val="24"/>
-          <w:szCs w:val="24"/>
-        </w:rPr>
-        <w:t xml:space="preserve"> CI/CD pipelines, system monitoring tools</w:t>
-      </w:r>
-    </w:p>
-    <w:p>
-      <w:pPr>
-        <w:spacing w:before="106"/>
-        <w:ind w:left="360"/>
-        <w:rPr>
-          <w:rFonts w:ascii="Aptos Display" w:hAnsi="Aptos Display"/>
-          <w:b/>
-          <w:w w:val="105"/>
-          <w:sz w:val="24"/>
-          <w:szCs w:val="24"/>
-        </w:rPr>
-      </w:pPr>
-      <w:r>
-        <w:rPr>
-          <w:rFonts w:ascii="Aptos Display" w:hAnsi="Aptos Display"/>
-          <w:b/>
-          <w:bCs/>
-          <w:w w:val="105"/>
-          <w:sz w:val="26"/>
-          <w:szCs w:val="26"/>
-        </w:rPr>
-        <w:t>Programming/Scripting (support-focused use)</w:t>
-      </w:r>
-      <w:r>
-        <w:rPr>
-          <w:rFonts w:ascii="Aptos Display" w:hAnsi="Aptos Display"/>
-          <w:b/>
-          <w:w w:val="105"/>
-          <w:sz w:val="24"/>
-          <w:szCs w:val="24"/>
-        </w:rPr>
-        <w:br/>
-      </w:r>
-      <w:r>
-        <w:rPr>
-          <w:rFonts w:ascii="Aptos Display" w:hAnsi="Aptos Display" w:cs="Times New Roman"/>
-          <w:bCs/>
-          <w:w w:val="105"/>
-          <w:sz w:val="24"/>
-          <w:szCs w:val="24"/>
-        </w:rPr>
-        <w:t>C#, Bash, PowerShell, SQL</w:t>
-      </w:r>
-    </w:p>
-    <w:p>
-      <w:pPr>
-        <w:widowControl/>
-        <w:tabs>
-          <w:tab w:val="right" w:pos="10080"/>
-        </w:tabs>
-        <w:autoSpaceDE/>
-        <w:autoSpaceDN/>
-        <w:ind w:left="330" w:right="680"/>
-        <w:rPr>
-          <w:rFonts w:ascii="Aptos Display" w:eastAsia="Times New Roman" w:hAnsi="Aptos Display" w:cs="Times New Roman"/>
-          <w:sz w:val="24"/>
-          <w:szCs w:val="24"/>
-        </w:rPr>
-      </w:pPr>
-      <w:r>
-        <w:rPr>
-          <w:rFonts w:ascii="Aptos Display" w:eastAsia="Times New Roman" w:hAnsi="Aptos Display" w:cs="Times New Roman"/>
-          <w:sz w:val="24"/>
-          <w:szCs w:val="24"/>
-          <w:u w:val="single"/>
-        </w:rPr>
-        <w:tab/>
-      </w:r>
-    </w:p>
-    <w:p>
-      <w:pPr>
-        <w:spacing w:before="106"/>
-        <w:ind w:left="360"/>
-        <w:rPr>
-          <w:rFonts w:ascii="Aptos Display" w:hAnsi="Aptos Display"/>
-          <w:b/>
-          <w:bCs/>
-          <w:w w:val="105"/>
-          <w:sz w:val="32"/>
-          <w:szCs w:val="32"/>
-        </w:rPr>
-      </w:pPr>
-      <w:r>
-        <w:rPr>
-          <w:rFonts w:ascii="Aptos Display" w:hAnsi="Aptos Display"/>
-          <w:b/>
-          <w:bCs/>
-          <w:w w:val="105"/>
-          <w:sz w:val="32"/>
-          <w:szCs w:val="32"/>
-        </w:rPr>
-        <w:t>Education</w:t>
-      </w:r>
-    </w:p>
-    <w:p>
-      <w:pPr>
-        <w:spacing w:before="106"/>
-        <w:ind w:left="360"/>
-        <w:rPr>
-          <w:rFonts w:ascii="Aptos Display" w:hAnsi="Aptos Display"/>
-          <w:b/>
-          <w:w w:val="105"/>
-          <w:sz w:val="24"/>
-          <w:szCs w:val="24"/>
-        </w:rPr>
-      </w:pPr>
-      <w:r>
-        <w:rPr>
-          <w:rFonts w:ascii="Aptos Display" w:hAnsi="Aptos Display"/>
-          <w:b/>
-          <w:w w:val="105"/>
-          <w:sz w:val="24"/>
-          <w:szCs w:val="24"/>
-        </w:rPr>
-        <w:t>Brigham Young University — Computer Science</w:t>
-      </w:r>
-      <w:r>
-        <w:rPr>
-          <w:rFonts w:ascii="Aptos Display" w:hAnsi="Aptos Display"/>
-          <w:b/>
-          <w:w w:val="105"/>
-          <w:sz w:val="24"/>
-          <w:szCs w:val="24"/>
-        </w:rPr>
-        <w:br/>
-        <w:t>1985 – 1986</w:t>
-      </w:r>
-    </w:p>
-    <w:p>
-      <w:pPr>
-        <w:spacing w:before="106"/>
-        <w:ind w:left="360"/>
-        <w:rPr>
-          <w:rFonts w:ascii="Aptos Display" w:hAnsi="Aptos Display"/>
-          <w:b/>
-          <w:w w:val="105"/>
-          <w:sz w:val="24"/>
-          <w:szCs w:val="24"/>
-        </w:rPr>
-      </w:pPr>
     </w:p>
     <w:sectPr>
       <w:footerReference w:type="default" r:id="rId9"/>
@@ -2594,6 +1606,119 @@
 <file path=word/numbering.xml><?xml version="1.0" encoding="utf-8"?>
 <w:numbering xmlns:wpc="http://schemas.microsoft.com/office/word/2010/wordprocessingCanvas" xmlns:cx="http://schemas.microsoft.com/office/drawing/2014/chartex" xmlns:cx1="http://schemas.microsoft.com/office/drawing/2015/9/8/chartex" xmlns:cx2="http://schemas.microsoft.com/office/drawing/2015/10/21/chartex" xmlns:cx3="http://schemas.microsoft.com/office/drawing/2016/5/9/chartex" xmlns:cx4="http://schemas.microsoft.com/office/drawing/2016/5/10/chartex" xmlns:cx5="http://schemas.microsoft.com/office/drawing/2016/5/11/chartex" xmlns:cx6="http://schemas.microsoft.com/office/drawing/2016/5/12/chartex" xmlns:cx7="http://schemas.microsoft.com/office/drawing/2016/5/13/chartex" xmlns:cx8="http://schemas.microsoft.com/office/drawing/2016/5/14/chartex" xmlns:mc="http://schemas.openxmlformats.org/markup-compatibility/2006" xmlns:aink="http://schemas.microsoft.com/office/drawing/2016/ink" xmlns:am3d="http://schemas.microsoft.com/office/drawing/2017/model3d" xmlns:o="urn:schemas-microsoft-com:office:office" xmlns:oel="http://schemas.microsoft.com/office/2019/extlst" xmlns:r="http://schemas.openxmlformats.org/officeDocument/2006/relationships" xmlns:m="http://schemas.openxmlformats.org/officeDocument/2006/math" xmlns:v="urn:schemas-microsoft-com:vml" xmlns:wp14="http://schemas.microsoft.com/office/word/2010/wordprocessingDrawing" xmlns:wp="http://schemas.openxmlformats.org/drawingml/2006/wordprocessingDrawing" xmlns:w10="urn:schemas-microsoft-com:office:word" xmlns:w="http://schemas.openxmlformats.org/wordprocessingml/2006/main" xmlns:w14="http://schemas.microsoft.com/office/word/2010/wordml" xmlns:w15="http://schemas.microsoft.com/office/word/2012/wordml" xmlns:w16cex="http://schemas.microsoft.com/office/word/2018/wordml/cex" xmlns:w16cid="http://schemas.microsoft.com/office/word/2016/wordml/cid" xmlns:w16="http://schemas.microsoft.com/office/word/2018/wordml" xmlns:w16du="http://schemas.microsoft.com/office/word/2023/wordml/word16du" xmlns:w16sdtdh="http://schemas.microsoft.com/office/word/2020/wordml/sdtdatahash" xmlns:w16sdtfl="http://schemas.microsoft.com/office/word/2024/wordml/sdtformatlock" xmlns:w16se="http://schemas.microsoft.com/office/word/2015/wordml/symex" xmlns:wpg="http://schemas.microsoft.com/office/word/2010/wordprocessingGroup" xmlns:wpi="http://schemas.microsoft.com/office/word/2010/wordprocessingInk" xmlns:wne="http://schemas.microsoft.com/office/word/2006/wordml" xmlns:wps="http://schemas.microsoft.com/office/word/2010/wordprocessingShape" mc:Ignorable="w14 w15 w16se w16cid w16 w16cex w16sdtdh w16sdtfl w16du wp14">
   <w:abstractNum w:abstractNumId="0" w15:restartNumberingAfterBreak="0">
+    <w:nsid w:val="01792C49"/>
+    <w:multiLevelType w:val="hybridMultilevel"/>
+    <w:tmpl w:val="37AAC918"/>
+    <w:lvl w:ilvl="0" w:tplc="04090001">
+      <w:start w:val="1"/>
+      <w:numFmt w:val="bullet"/>
+      <w:lvlText w:val=""/>
+      <w:lvlJc w:val="left"/>
+      <w:pPr>
+        <w:ind w:left="1080" w:hanging="360"/>
+      </w:pPr>
+      <w:rPr>
+        <w:rFonts w:ascii="Symbol" w:hAnsi="Symbol" w:hint="default"/>
+      </w:rPr>
+    </w:lvl>
+    <w:lvl w:ilvl="1" w:tplc="04090003" w:tentative="1">
+      <w:start w:val="1"/>
+      <w:numFmt w:val="bullet"/>
+      <w:lvlText w:val="o"/>
+      <w:lvlJc w:val="left"/>
+      <w:pPr>
+        <w:ind w:left="1800" w:hanging="360"/>
+      </w:pPr>
+      <w:rPr>
+        <w:rFonts w:ascii="Courier New" w:hAnsi="Courier New" w:cs="Courier New" w:hint="default"/>
+      </w:rPr>
+    </w:lvl>
+    <w:lvl w:ilvl="2" w:tplc="04090005" w:tentative="1">
+      <w:start w:val="1"/>
+      <w:numFmt w:val="bullet"/>
+      <w:lvlText w:val=""/>
+      <w:lvlJc w:val="left"/>
+      <w:pPr>
+        <w:ind w:left="2520" w:hanging="360"/>
+      </w:pPr>
+      <w:rPr>
+        <w:rFonts w:ascii="Wingdings" w:hAnsi="Wingdings" w:hint="default"/>
+      </w:rPr>
+    </w:lvl>
+    <w:lvl w:ilvl="3" w:tplc="04090001" w:tentative="1">
+      <w:start w:val="1"/>
+      <w:numFmt w:val="bullet"/>
+      <w:lvlText w:val=""/>
+      <w:lvlJc w:val="left"/>
+      <w:pPr>
+        <w:ind w:left="3240" w:hanging="360"/>
+      </w:pPr>
+      <w:rPr>
+        <w:rFonts w:ascii="Symbol" w:hAnsi="Symbol" w:hint="default"/>
+      </w:rPr>
+    </w:lvl>
+    <w:lvl w:ilvl="4" w:tplc="04090003" w:tentative="1">
+      <w:start w:val="1"/>
+      <w:numFmt w:val="bullet"/>
+      <w:lvlText w:val="o"/>
+      <w:lvlJc w:val="left"/>
+      <w:pPr>
+        <w:ind w:left="3960" w:hanging="360"/>
+      </w:pPr>
+      <w:rPr>
+        <w:rFonts w:ascii="Courier New" w:hAnsi="Courier New" w:cs="Courier New" w:hint="default"/>
+      </w:rPr>
+    </w:lvl>
+    <w:lvl w:ilvl="5" w:tplc="04090005" w:tentative="1">
+      <w:start w:val="1"/>
+      <w:numFmt w:val="bullet"/>
+      <w:lvlText w:val=""/>
+      <w:lvlJc w:val="left"/>
+      <w:pPr>
+        <w:ind w:left="4680" w:hanging="360"/>
+      </w:pPr>
+      <w:rPr>
+        <w:rFonts w:ascii="Wingdings" w:hAnsi="Wingdings" w:hint="default"/>
+      </w:rPr>
+    </w:lvl>
+    <w:lvl w:ilvl="6" w:tplc="04090001" w:tentative="1">
+      <w:start w:val="1"/>
+      <w:numFmt w:val="bullet"/>
+      <w:lvlText w:val=""/>
+      <w:lvlJc w:val="left"/>
+      <w:pPr>
+        <w:ind w:left="5400" w:hanging="360"/>
+      </w:pPr>
+      <w:rPr>
+        <w:rFonts w:ascii="Symbol" w:hAnsi="Symbol" w:hint="default"/>
+      </w:rPr>
+    </w:lvl>
+    <w:lvl w:ilvl="7" w:tplc="04090003" w:tentative="1">
+      <w:start w:val="1"/>
+      <w:numFmt w:val="bullet"/>
+      <w:lvlText w:val="o"/>
+      <w:lvlJc w:val="left"/>
+      <w:pPr>
+        <w:ind w:left="6120" w:hanging="360"/>
+      </w:pPr>
+      <w:rPr>
+        <w:rFonts w:ascii="Courier New" w:hAnsi="Courier New" w:cs="Courier New" w:hint="default"/>
+      </w:rPr>
+    </w:lvl>
+    <w:lvl w:ilvl="8" w:tplc="04090005" w:tentative="1">
+      <w:start w:val="1"/>
+      <w:numFmt w:val="bullet"/>
+      <w:lvlText w:val=""/>
+      <w:lvlJc w:val="left"/>
+      <w:pPr>
+        <w:ind w:left="6840" w:hanging="360"/>
+      </w:pPr>
+      <w:rPr>
+        <w:rFonts w:ascii="Wingdings" w:hAnsi="Wingdings" w:hint="default"/>
+      </w:rPr>
+    </w:lvl>
+  </w:abstractNum>
+  <w:abstractNum w:abstractNumId="1" w15:restartNumberingAfterBreak="0">
     <w:nsid w:val="059F41F9"/>
     <w:multiLevelType w:val="multilevel"/>
     <w:tmpl w:val="556EC0F6"/>
@@ -2742,7 +1867,7 @@
       </w:rPr>
     </w:lvl>
   </w:abstractNum>
-  <w:abstractNum w:abstractNumId="1" w15:restartNumberingAfterBreak="0">
+  <w:abstractNum w:abstractNumId="2" w15:restartNumberingAfterBreak="0">
     <w:nsid w:val="08333239"/>
     <w:multiLevelType w:val="multilevel"/>
     <w:tmpl w:val="F36C03A4"/>
@@ -2891,7 +2016,7 @@
       </w:rPr>
     </w:lvl>
   </w:abstractNum>
-  <w:abstractNum w:abstractNumId="2" w15:restartNumberingAfterBreak="0">
+  <w:abstractNum w:abstractNumId="3" w15:restartNumberingAfterBreak="0">
     <w:nsid w:val="19AB7CE8"/>
     <w:multiLevelType w:val="multilevel"/>
     <w:tmpl w:val="4214839C"/>
@@ -3040,7 +2165,7 @@
       </w:rPr>
     </w:lvl>
   </w:abstractNum>
-  <w:abstractNum w:abstractNumId="3" w15:restartNumberingAfterBreak="0">
+  <w:abstractNum w:abstractNumId="4" w15:restartNumberingAfterBreak="0">
     <w:nsid w:val="23B05E45"/>
     <w:multiLevelType w:val="hybridMultilevel"/>
     <w:tmpl w:val="7388BBCA"/>
@@ -3153,7 +2278,7 @@
       </w:rPr>
     </w:lvl>
   </w:abstractNum>
-  <w:abstractNum w:abstractNumId="4" w15:restartNumberingAfterBreak="0">
+  <w:abstractNum w:abstractNumId="5" w15:restartNumberingAfterBreak="0">
     <w:nsid w:val="27BF061D"/>
     <w:multiLevelType w:val="hybridMultilevel"/>
     <w:tmpl w:val="7FA8E4AE"/>
@@ -3266,7 +2391,7 @@
       </w:rPr>
     </w:lvl>
   </w:abstractNum>
-  <w:abstractNum w:abstractNumId="5" w15:restartNumberingAfterBreak="0">
+  <w:abstractNum w:abstractNumId="6" w15:restartNumberingAfterBreak="0">
     <w:nsid w:val="27EE1700"/>
     <w:multiLevelType w:val="multilevel"/>
     <w:tmpl w:val="4678FD84"/>
@@ -3415,7 +2540,7 @@
       </w:rPr>
     </w:lvl>
   </w:abstractNum>
-  <w:abstractNum w:abstractNumId="6" w15:restartNumberingAfterBreak="0">
+  <w:abstractNum w:abstractNumId="7" w15:restartNumberingAfterBreak="0">
     <w:nsid w:val="2A245504"/>
     <w:multiLevelType w:val="multilevel"/>
     <w:tmpl w:val="743C8A02"/>
@@ -3564,7 +2689,7 @@
       </w:rPr>
     </w:lvl>
   </w:abstractNum>
-  <w:abstractNum w:abstractNumId="7" w15:restartNumberingAfterBreak="0">
+  <w:abstractNum w:abstractNumId="8" w15:restartNumberingAfterBreak="0">
     <w:nsid w:val="2D027383"/>
     <w:multiLevelType w:val="multilevel"/>
     <w:tmpl w:val="5404AC80"/>
@@ -3713,7 +2838,7 @@
       </w:rPr>
     </w:lvl>
   </w:abstractNum>
-  <w:abstractNum w:abstractNumId="8" w15:restartNumberingAfterBreak="0">
+  <w:abstractNum w:abstractNumId="9" w15:restartNumberingAfterBreak="0">
     <w:nsid w:val="2D6401F1"/>
     <w:multiLevelType w:val="multilevel"/>
     <w:tmpl w:val="6EE4AE66"/>
@@ -3862,7 +2987,7 @@
       </w:rPr>
     </w:lvl>
   </w:abstractNum>
-  <w:abstractNum w:abstractNumId="9" w15:restartNumberingAfterBreak="0">
+  <w:abstractNum w:abstractNumId="10" w15:restartNumberingAfterBreak="0">
     <w:nsid w:val="2E2206B6"/>
     <w:multiLevelType w:val="multilevel"/>
     <w:tmpl w:val="4C3271E4"/>
@@ -4011,7 +3136,7 @@
       </w:rPr>
     </w:lvl>
   </w:abstractNum>
-  <w:abstractNum w:abstractNumId="10" w15:restartNumberingAfterBreak="0">
+  <w:abstractNum w:abstractNumId="11" w15:restartNumberingAfterBreak="0">
     <w:nsid w:val="31193C9C"/>
     <w:multiLevelType w:val="multilevel"/>
     <w:tmpl w:val="E33E6748"/>
@@ -4160,7 +3285,7 @@
       </w:rPr>
     </w:lvl>
   </w:abstractNum>
-  <w:abstractNum w:abstractNumId="11" w15:restartNumberingAfterBreak="0">
+  <w:abstractNum w:abstractNumId="12" w15:restartNumberingAfterBreak="0">
     <w:nsid w:val="366E65D0"/>
     <w:multiLevelType w:val="multilevel"/>
     <w:tmpl w:val="5546F12E"/>
@@ -4309,7 +3434,7 @@
       </w:rPr>
     </w:lvl>
   </w:abstractNum>
-  <w:abstractNum w:abstractNumId="12" w15:restartNumberingAfterBreak="0">
+  <w:abstractNum w:abstractNumId="13" w15:restartNumberingAfterBreak="0">
     <w:nsid w:val="37D63C85"/>
     <w:multiLevelType w:val="hybridMultilevel"/>
     <w:tmpl w:val="5E9C214C"/>
@@ -4423,7 +3548,7 @@
       </w:rPr>
     </w:lvl>
   </w:abstractNum>
-  <w:abstractNum w:abstractNumId="13" w15:restartNumberingAfterBreak="0">
+  <w:abstractNum w:abstractNumId="14" w15:restartNumberingAfterBreak="0">
     <w:nsid w:val="3D3E2F72"/>
     <w:multiLevelType w:val="multilevel"/>
     <w:tmpl w:val="BFF49950"/>
@@ -4572,7 +3697,7 @@
       </w:rPr>
     </w:lvl>
   </w:abstractNum>
-  <w:abstractNum w:abstractNumId="14" w15:restartNumberingAfterBreak="0">
+  <w:abstractNum w:abstractNumId="15" w15:restartNumberingAfterBreak="0">
     <w:nsid w:val="42E51E3E"/>
     <w:multiLevelType w:val="multilevel"/>
     <w:tmpl w:val="BB8C5D58"/>
@@ -4721,7 +3846,7 @@
       </w:rPr>
     </w:lvl>
   </w:abstractNum>
-  <w:abstractNum w:abstractNumId="15" w15:restartNumberingAfterBreak="0">
+  <w:abstractNum w:abstractNumId="16" w15:restartNumberingAfterBreak="0">
     <w:nsid w:val="4CEE1B0A"/>
     <w:multiLevelType w:val="multilevel"/>
     <w:tmpl w:val="F962CFA8"/>
@@ -4870,7 +3995,7 @@
       </w:rPr>
     </w:lvl>
   </w:abstractNum>
-  <w:abstractNum w:abstractNumId="16" w15:restartNumberingAfterBreak="0">
+  <w:abstractNum w:abstractNumId="17" w15:restartNumberingAfterBreak="0">
     <w:nsid w:val="4F9C6940"/>
     <w:multiLevelType w:val="multilevel"/>
     <w:tmpl w:val="3668B44A"/>
@@ -5019,7 +4144,7 @@
       </w:rPr>
     </w:lvl>
   </w:abstractNum>
-  <w:abstractNum w:abstractNumId="17" w15:restartNumberingAfterBreak="0">
+  <w:abstractNum w:abstractNumId="18" w15:restartNumberingAfterBreak="0">
     <w:nsid w:val="514F0C8F"/>
     <w:multiLevelType w:val="hybridMultilevel"/>
     <w:tmpl w:val="FB105BAC"/>
@@ -5132,7 +4257,7 @@
       </w:rPr>
     </w:lvl>
   </w:abstractNum>
-  <w:abstractNum w:abstractNumId="18" w15:restartNumberingAfterBreak="0">
+  <w:abstractNum w:abstractNumId="19" w15:restartNumberingAfterBreak="0">
     <w:nsid w:val="53C60CD9"/>
     <w:multiLevelType w:val="multilevel"/>
     <w:tmpl w:val="46884AA0"/>
@@ -5281,7 +4406,7 @@
       </w:rPr>
     </w:lvl>
   </w:abstractNum>
-  <w:abstractNum w:abstractNumId="19" w15:restartNumberingAfterBreak="0">
+  <w:abstractNum w:abstractNumId="20" w15:restartNumberingAfterBreak="0">
     <w:nsid w:val="5553126B"/>
     <w:multiLevelType w:val="multilevel"/>
     <w:tmpl w:val="A3C67F40"/>
@@ -5430,7 +4555,7 @@
       </w:rPr>
     </w:lvl>
   </w:abstractNum>
-  <w:abstractNum w:abstractNumId="20" w15:restartNumberingAfterBreak="0">
+  <w:abstractNum w:abstractNumId="21" w15:restartNumberingAfterBreak="0">
     <w:nsid w:val="5A3A2BAA"/>
     <w:multiLevelType w:val="multilevel"/>
     <w:tmpl w:val="847E689C"/>
@@ -5579,7 +4704,7 @@
       </w:rPr>
     </w:lvl>
   </w:abstractNum>
-  <w:abstractNum w:abstractNumId="21" w15:restartNumberingAfterBreak="0">
+  <w:abstractNum w:abstractNumId="22" w15:restartNumberingAfterBreak="0">
     <w:nsid w:val="5B5C1588"/>
     <w:multiLevelType w:val="multilevel"/>
     <w:tmpl w:val="8042EE70"/>
@@ -5728,7 +4853,7 @@
       </w:rPr>
     </w:lvl>
   </w:abstractNum>
-  <w:abstractNum w:abstractNumId="22" w15:restartNumberingAfterBreak="0">
+  <w:abstractNum w:abstractNumId="23" w15:restartNumberingAfterBreak="0">
     <w:nsid w:val="626F05BA"/>
     <w:multiLevelType w:val="hybridMultilevel"/>
     <w:tmpl w:val="A1EC643C"/>
@@ -5849,7 +4974,7 @@
       </w:rPr>
     </w:lvl>
   </w:abstractNum>
-  <w:abstractNum w:abstractNumId="23" w15:restartNumberingAfterBreak="0">
+  <w:abstractNum w:abstractNumId="24" w15:restartNumberingAfterBreak="0">
     <w:nsid w:val="661D2E1D"/>
     <w:multiLevelType w:val="multilevel"/>
     <w:tmpl w:val="B3822792"/>
@@ -5998,7 +5123,7 @@
       </w:rPr>
     </w:lvl>
   </w:abstractNum>
-  <w:abstractNum w:abstractNumId="24" w15:restartNumberingAfterBreak="0">
+  <w:abstractNum w:abstractNumId="25" w15:restartNumberingAfterBreak="0">
     <w:nsid w:val="66CC7414"/>
     <w:multiLevelType w:val="multilevel"/>
     <w:tmpl w:val="D4E63032"/>
@@ -6147,7 +5272,7 @@
       </w:rPr>
     </w:lvl>
   </w:abstractNum>
-  <w:abstractNum w:abstractNumId="25" w15:restartNumberingAfterBreak="0">
+  <w:abstractNum w:abstractNumId="26" w15:restartNumberingAfterBreak="0">
     <w:nsid w:val="6A81382C"/>
     <w:multiLevelType w:val="multilevel"/>
     <w:tmpl w:val="68D652E8"/>
@@ -6296,7 +5421,7 @@
       </w:rPr>
     </w:lvl>
   </w:abstractNum>
-  <w:abstractNum w:abstractNumId="26" w15:restartNumberingAfterBreak="0">
+  <w:abstractNum w:abstractNumId="27" w15:restartNumberingAfterBreak="0">
     <w:nsid w:val="6C8C7E48"/>
     <w:multiLevelType w:val="multilevel"/>
     <w:tmpl w:val="B5F864EA"/>
@@ -6445,7 +5570,7 @@
       </w:rPr>
     </w:lvl>
   </w:abstractNum>
-  <w:abstractNum w:abstractNumId="27" w15:restartNumberingAfterBreak="0">
+  <w:abstractNum w:abstractNumId="28" w15:restartNumberingAfterBreak="0">
     <w:nsid w:val="6D6874A5"/>
     <w:multiLevelType w:val="multilevel"/>
     <w:tmpl w:val="4ECA13FA"/>
@@ -6594,7 +5719,7 @@
       </w:rPr>
     </w:lvl>
   </w:abstractNum>
-  <w:abstractNum w:abstractNumId="28" w15:restartNumberingAfterBreak="0">
+  <w:abstractNum w:abstractNumId="29" w15:restartNumberingAfterBreak="0">
     <w:nsid w:val="713D7480"/>
     <w:multiLevelType w:val="multilevel"/>
     <w:tmpl w:val="3F062B62"/>
@@ -6743,7 +5868,7 @@
       </w:rPr>
     </w:lvl>
   </w:abstractNum>
-  <w:abstractNum w:abstractNumId="29" w15:restartNumberingAfterBreak="0">
+  <w:abstractNum w:abstractNumId="30" w15:restartNumberingAfterBreak="0">
     <w:nsid w:val="7E194B86"/>
     <w:multiLevelType w:val="multilevel"/>
     <w:tmpl w:val="2B06E294"/>
@@ -6893,94 +6018,97 @@
     </w:lvl>
   </w:abstractNum>
   <w:num w:numId="1" w16cid:durableId="1160777021">
+    <w:abstractNumId w:val="23"/>
+  </w:num>
+  <w:num w:numId="2" w16cid:durableId="85424684">
+    <w:abstractNumId w:val="26"/>
+  </w:num>
+  <w:num w:numId="3" w16cid:durableId="1494178667">
+    <w:abstractNumId w:val="10"/>
+  </w:num>
+  <w:num w:numId="4" w16cid:durableId="1735664940">
+    <w:abstractNumId w:val="28"/>
+  </w:num>
+  <w:num w:numId="5" w16cid:durableId="2020816725">
+    <w:abstractNumId w:val="12"/>
+  </w:num>
+  <w:num w:numId="6" w16cid:durableId="1847397407">
+    <w:abstractNumId w:val="29"/>
+  </w:num>
+  <w:num w:numId="7" w16cid:durableId="537552107">
+    <w:abstractNumId w:val="14"/>
+  </w:num>
+  <w:num w:numId="8" w16cid:durableId="948774616">
+    <w:abstractNumId w:val="24"/>
+  </w:num>
+  <w:num w:numId="9" w16cid:durableId="521818524">
+    <w:abstractNumId w:val="19"/>
+  </w:num>
+  <w:num w:numId="10" w16cid:durableId="274098232">
+    <w:abstractNumId w:val="2"/>
+  </w:num>
+  <w:num w:numId="11" w16cid:durableId="688291495">
+    <w:abstractNumId w:val="25"/>
+  </w:num>
+  <w:num w:numId="12" w16cid:durableId="387607357">
+    <w:abstractNumId w:val="8"/>
+  </w:num>
+  <w:num w:numId="13" w16cid:durableId="21708746">
+    <w:abstractNumId w:val="16"/>
+  </w:num>
+  <w:num w:numId="14" w16cid:durableId="1884250277">
     <w:abstractNumId w:val="22"/>
   </w:num>
-  <w:num w:numId="2" w16cid:durableId="85424684">
-    <w:abstractNumId w:val="25"/>
+  <w:num w:numId="15" w16cid:durableId="1437284112">
+    <w:abstractNumId w:val="21"/>
   </w:num>
-  <w:num w:numId="3" w16cid:durableId="1494178667">
+  <w:num w:numId="16" w16cid:durableId="1022711274">
+    <w:abstractNumId w:val="6"/>
+  </w:num>
+  <w:num w:numId="17" w16cid:durableId="809173065">
+    <w:abstractNumId w:val="5"/>
+  </w:num>
+  <w:num w:numId="18" w16cid:durableId="379940384">
+    <w:abstractNumId w:val="4"/>
+  </w:num>
+  <w:num w:numId="19" w16cid:durableId="358774017">
+    <w:abstractNumId w:val="17"/>
+  </w:num>
+  <w:num w:numId="20" w16cid:durableId="697438653">
+    <w:abstractNumId w:val="1"/>
+  </w:num>
+  <w:num w:numId="21" w16cid:durableId="1511289989">
+    <w:abstractNumId w:val="11"/>
+  </w:num>
+  <w:num w:numId="22" w16cid:durableId="801535077">
+    <w:abstractNumId w:val="20"/>
+  </w:num>
+  <w:num w:numId="23" w16cid:durableId="791823277">
+    <w:abstractNumId w:val="3"/>
+  </w:num>
+  <w:num w:numId="24" w16cid:durableId="2051565952">
+    <w:abstractNumId w:val="30"/>
+  </w:num>
+  <w:num w:numId="25" w16cid:durableId="1853375473">
+    <w:abstractNumId w:val="7"/>
+  </w:num>
+  <w:num w:numId="26" w16cid:durableId="2080596052">
     <w:abstractNumId w:val="9"/>
   </w:num>
-  <w:num w:numId="4" w16cid:durableId="1735664940">
+  <w:num w:numId="27" w16cid:durableId="922447932">
+    <w:abstractNumId w:val="15"/>
+  </w:num>
+  <w:num w:numId="28" w16cid:durableId="1906716946">
     <w:abstractNumId w:val="27"/>
   </w:num>
-  <w:num w:numId="5" w16cid:durableId="2020816725">
-    <w:abstractNumId w:val="11"/>
+  <w:num w:numId="29" w16cid:durableId="2119130903">
+    <w:abstractNumId w:val="18"/>
   </w:num>
-  <w:num w:numId="6" w16cid:durableId="1847397407">
-    <w:abstractNumId w:val="28"/>
-  </w:num>
-  <w:num w:numId="7" w16cid:durableId="537552107">
+  <w:num w:numId="30" w16cid:durableId="1239945157">
     <w:abstractNumId w:val="13"/>
   </w:num>
-  <w:num w:numId="8" w16cid:durableId="948774616">
-    <w:abstractNumId w:val="23"/>
-  </w:num>
-  <w:num w:numId="9" w16cid:durableId="521818524">
-    <w:abstractNumId w:val="18"/>
-  </w:num>
-  <w:num w:numId="10" w16cid:durableId="274098232">
-    <w:abstractNumId w:val="1"/>
-  </w:num>
-  <w:num w:numId="11" w16cid:durableId="688291495">
-    <w:abstractNumId w:val="24"/>
-  </w:num>
-  <w:num w:numId="12" w16cid:durableId="387607357">
-    <w:abstractNumId w:val="7"/>
-  </w:num>
-  <w:num w:numId="13" w16cid:durableId="21708746">
-    <w:abstractNumId w:val="15"/>
-  </w:num>
-  <w:num w:numId="14" w16cid:durableId="1884250277">
-    <w:abstractNumId w:val="21"/>
-  </w:num>
-  <w:num w:numId="15" w16cid:durableId="1437284112">
-    <w:abstractNumId w:val="20"/>
-  </w:num>
-  <w:num w:numId="16" w16cid:durableId="1022711274">
-    <w:abstractNumId w:val="5"/>
-  </w:num>
-  <w:num w:numId="17" w16cid:durableId="809173065">
-    <w:abstractNumId w:val="4"/>
-  </w:num>
-  <w:num w:numId="18" w16cid:durableId="379940384">
-    <w:abstractNumId w:val="3"/>
-  </w:num>
-  <w:num w:numId="19" w16cid:durableId="358774017">
-    <w:abstractNumId w:val="16"/>
-  </w:num>
-  <w:num w:numId="20" w16cid:durableId="697438653">
+  <w:num w:numId="31" w16cid:durableId="381095212">
     <w:abstractNumId w:val="0"/>
-  </w:num>
-  <w:num w:numId="21" w16cid:durableId="1511289989">
-    <w:abstractNumId w:val="10"/>
-  </w:num>
-  <w:num w:numId="22" w16cid:durableId="801535077">
-    <w:abstractNumId w:val="19"/>
-  </w:num>
-  <w:num w:numId="23" w16cid:durableId="791823277">
-    <w:abstractNumId w:val="2"/>
-  </w:num>
-  <w:num w:numId="24" w16cid:durableId="2051565952">
-    <w:abstractNumId w:val="29"/>
-  </w:num>
-  <w:num w:numId="25" w16cid:durableId="1853375473">
-    <w:abstractNumId w:val="6"/>
-  </w:num>
-  <w:num w:numId="26" w16cid:durableId="2080596052">
-    <w:abstractNumId w:val="8"/>
-  </w:num>
-  <w:num w:numId="27" w16cid:durableId="922447932">
-    <w:abstractNumId w:val="14"/>
-  </w:num>
-  <w:num w:numId="28" w16cid:durableId="1906716946">
-    <w:abstractNumId w:val="26"/>
-  </w:num>
-  <w:num w:numId="29" w16cid:durableId="2119130903">
-    <w:abstractNumId w:val="17"/>
-  </w:num>
-  <w:num w:numId="30" w16cid:durableId="1239945157">
-    <w:abstractNumId w:val="12"/>
   </w:num>
 </w:numbering>
 </file>

</xml_diff>